<commit_message>
Rename project to 'Станок'
- Update README.md: project name, executable name, CLI instructions
- Update GUI: window titles (main, project), QSettings org name
- Update CLI: description and entry point
- Fixed package imports by moving src/ to docxforge/
- Type ComboBox: fixed 140px width, left-aligned, stack expands on resize
- Table/Today field alignment: hidden labels for consistent input positioning
- Auto-select first column/row for first data source
- 'Continue from last row' checkbox left-aligned

Tests: 180/181 pass (1 pre-existing date-sensitive test failure)
</commit_message>
<xml_diff>
--- a/tests/documents/all_basic_fields/expected_0001.docx
+++ b/tests/documents/all_basic_fields/expected_0001.docx
@@ -1,65 +1,145 @@
 
 <file path=word/document.xml><?xml version="1.0" encoding="utf-8"?>
-<w:document xmlns:wpc="http://schemas.microsoft.com/office/word/2010/wordprocessingCanvas" xmlns:mo="http://schemas.microsoft.com/office/mac/office/2008/main" xmlns:mc="http://schemas.openxmlformats.org/markup-compatibility/2006" xmlns:mv="urn:schemas-microsoft-com:mac:vml" xmlns:o="urn:schemas-microsoft-com:office:office" xmlns:r="http://schemas.openxmlformats.org/officeDocument/2006/relationships" xmlns:m="http://schemas.openxmlformats.org/officeDocument/2006/math" xmlns:v="urn:schemas-microsoft-com:vml" xmlns:wp14="http://schemas.microsoft.com/office/word/2010/wordprocessingDrawing" xmlns:wp="http://schemas.openxmlformats.org/drawingml/2006/wordprocessingDrawing" xmlns:w10="urn:schemas-microsoft-com:office:word" xmlns:w="http://schemas.openxmlformats.org/wordprocessingml/2006/main" xmlns:w14="http://schemas.microsoft.com/office/word/2010/wordml" xmlns:wpg="http://schemas.microsoft.com/office/word/2010/wordprocessingGroup" xmlns:wpi="http://schemas.microsoft.com/office/word/2010/wordprocessingInk" xmlns:wne="http://schemas.microsoft.com/office/word/2006/wordml" xmlns:wps="http://schemas.microsoft.com/office/word/2010/wordprocessingShape" mc:Ignorable="w14 wp14">
+<w:document xmlns:wpc="http://schemas.microsoft.com/office/word/2010/wordprocessingCanvas" xmlns:mc="http://schemas.openxmlformats.org/markup-compatibility/2006" xmlns:o="urn:schemas-microsoft-com:office:office" xmlns:r="http://schemas.openxmlformats.org/officeDocument/2006/relationships" xmlns:m="http://schemas.openxmlformats.org/officeDocument/2006/math" xmlns:v="urn:schemas-microsoft-com:vml" xmlns:wp14="http://schemas.microsoft.com/office/word/2010/wordprocessingDrawing" xmlns:wp="http://schemas.openxmlformats.org/drawingml/2006/wordprocessingDrawing" xmlns:w10="urn:schemas-microsoft-com:office:word" xmlns:w="http://schemas.openxmlformats.org/wordprocessingml/2006/main" xmlns:w14="http://schemas.microsoft.com/office/word/2010/wordml" xmlns:wpg="http://schemas.microsoft.com/office/word/2010/wordprocessingGroup" xmlns:wpi="http://schemas.microsoft.com/office/word/2010/wordprocessingInk" xmlns:wne="http://schemas.microsoft.com/office/word/2006/wordml" xmlns:wps="http://schemas.microsoft.com/office/word/2010/wordprocessingShape" mc:Ignorable="w14 wp14">
   <w:body>
     <w:p>
+      <w:pPr>
+        <w:rPr>
+          <w:lang w:val="ru-RU"/>
+        </w:rPr>
+      </w:pPr>
       <w:r>
-        <w:t xml:space="preserve">Документ: </w:t>
-      </w:r>
-      <w:r>
-        <w:t xml:space="preserve">Договор поставки</w:t>
+        <w:rPr>
+          <w:lang w:val="ru-RU"/>
+        </w:rPr>
+        <w:t>Документ: Договор поставки</w:t>
       </w:r>
     </w:p>
     <w:p>
+      <w:pPr>
+        <w:rPr>
+          <w:lang w:val="ru-RU"/>
+        </w:rPr>
+      </w:pPr>
       <w:r>
-        <w:t xml:space="preserve">Номер: </w:t>
-      </w:r>
-      <w:r>
-        <w:t xml:space="preserve">0001</w:t>
+        <w:rPr>
+          <w:lang w:val="ru-RU"/>
+        </w:rPr>
+        <w:t>Номер: 0001</w:t>
       </w:r>
     </w:p>
     <w:p>
+      <w:pPr>
+        <w:rPr>
+          <w:lang w:val="ru-RU"/>
+        </w:rPr>
+      </w:pPr>
       <w:r>
-        <w:t xml:space="preserve">Дата: </w:t>
-      </w:r>
-      <w:r>
-        <w:t xml:space="preserve">09.09.2026</w:t>
+        <w:rPr>
+          <w:lang w:val="ru-RU"/>
+        </w:rPr>
+        <w:t>Дата: 09.09.2026</w:t>
       </w:r>
     </w:p>
     <w:p>
+      <w:pPr>
+        <w:rPr>
+          <w:lang w:val="ru-RU"/>
+        </w:rPr>
+      </w:pPr>
       <w:r>
-        <w:t xml:space="preserve">Клиент: </w:t>
-      </w:r>
-      <w:r>
-        <w:t xml:space="preserve">Клиент 1</w:t>
+        <w:rPr>
+          <w:lang w:val="ru-RU"/>
+        </w:rPr>
+        <w:t>Клиент: Клиент 1</w:t>
       </w:r>
     </w:p>
     <w:p>
+      <w:pPr>
+        <w:rPr>
+          <w:lang w:val="ru-RU"/>
+        </w:rPr>
+      </w:pPr>
       <w:r>
-        <w:t xml:space="preserve">Менеджер: </w:t>
-      </w:r>
-      <w:r>
-        <w:t xml:space="preserve">Менеджер 1</w:t>
+        <w:rPr>
+          <w:lang w:val="ru-RU"/>
+        </w:rPr>
+        <w:t>Менеджер: Менеджер 1</w:t>
       </w:r>
     </w:p>
     <w:p>
+      <w:pPr>
+        <w:jc w:val="both"/>
+        <w:rPr>
+          <w:rFonts w:ascii="Cambria" w:eastAsia="MS Mincho" w:hAnsi="Cambria" w:cs="Times New Roman"/>
+          <w:lang w:val="ru-RU"/>
+        </w:rPr>
+      </w:pPr>
+      <w:bookmarkStart w:id="0" w:name="_GoBack"/>
       <w:r>
-        <w:t xml:space="preserve">Сумма: </w:t>
+        <w:rPr>
+          <w:rFonts w:ascii="Cambria" w:eastAsia="MS Mincho" w:hAnsi="Cambria" w:cs="Times New Roman"/>
+          <w:lang w:val="ru-RU"/>
+        </w:rPr>
+        <w:t>Сумма:</w:t>
       </w:r>
       <w:r>
-        <w:t xml:space="preserve">10000</w:t>
+        <w:rPr>
+          <w:rFonts w:ascii="Cambria" w:eastAsia="MS Mincho" w:hAnsi="Cambria" w:cs="Times New Roman"/>
+          <w:lang w:val="ru-RU"/>
+        </w:rPr>
+        <w:t> </w:t>
       </w:r>
       <w:r>
-        <w:t xml:space="preserve"> руб.</w:t>
-      </w:r>
-    </w:p>
-    <w:p>
-      <w:r>
-        <w:t xml:space="preserve">Статус: </w:t>
+        <w:rPr>
+          <w:rFonts w:ascii="Cambria" w:eastAsia="MS Mincho" w:hAnsi="Cambria" w:cs="Times New Roman"/>
+          <w:lang w:val="ru-RU"/>
+        </w:rPr>
+        <w:t>10000</w:t>
       </w:r>
       <w:r>
-        <w:t xml:space="preserve">Новый</w:t>
+        <w:rPr>
+          <w:rFonts w:ascii="Cambria" w:eastAsia="MS Mincho" w:hAnsi="Cambria" w:cs="Times New Roman"/>
+          <w:lang w:val="ru-RU"/>
+        </w:rPr>
+        <w:t xml:space="preserve"> </w:t>
       </w:r>
+      <w:r>
+        <w:rPr>
+          <w:rFonts w:ascii="Cambria" w:eastAsia="MS Mincho" w:hAnsi="Cambria" w:cs="Times New Roman"/>
+          <w:lang w:val="ru-RU"/>
+        </w:rPr>
+        <w:t>руб.</w:t>
+      </w:r>
+      <w:r>
+        <w:rPr>
+          <w:rFonts w:ascii="Cambria" w:eastAsia="MS Mincho" w:hAnsi="Cambria" w:cs="Times New Roman"/>
+          <w:lang w:val="ru-RU"/>
+        </w:rPr>
+        <w:t xml:space="preserve"> </w:t>
+      </w:r>
+      <w:r>
+        <w:rPr>
+          <w:rFonts w:ascii="Cambria" w:eastAsia="MS Mincho" w:hAnsi="Cambria" w:cs="Times New Roman"/>
+          <w:lang w:val="ru-RU"/>
+        </w:rPr>
+        <w:t>Новый</w:t>
+      </w:r>
+      <w:r>
+        <w:rPr>
+          <w:rFonts w:ascii="Cambria" w:eastAsia="MS Mincho" w:hAnsi="Cambria" w:cs="Times New Roman"/>
+          <w:lang w:val="ru-RU"/>
+        </w:rPr>
+        <w:br/>
+      </w:r>
+      <w:r>
+        <w:rPr>
+          <w:rFonts w:ascii="Cambria" w:eastAsia="MS Mincho" w:hAnsi="Cambria" w:cs="Times New Roman"/>
+          <w:lang w:val="ru-RU"/>
+        </w:rPr>
+        <w:t xml:space="preserve"> </w:t>
+      </w:r>
+      <w:bookmarkEnd w:id="0"/>
     </w:p>
     <w:sectPr>
       <w:pgSz w:w="12240" w:h="15840"/>
@@ -72,7 +152,7 @@
 </file>
 
 <file path=word/numbering.xml><?xml version="1.0" encoding="utf-8"?>
-<w:numbering xmlns:wpc="http://schemas.microsoft.com/office/word/2010/wordprocessingCanvas" xmlns:mo="http://schemas.microsoft.com/office/mac/office/2008/main" xmlns:mc="http://schemas.openxmlformats.org/markup-compatibility/2006" xmlns:mv="urn:schemas-microsoft-com:mac:vml" xmlns:o="urn:schemas-microsoft-com:office:office" xmlns:r="http://schemas.openxmlformats.org/officeDocument/2006/relationships" xmlns:m="http://schemas.openxmlformats.org/officeDocument/2006/math" xmlns:v="urn:schemas-microsoft-com:vml" xmlns:wp14="http://schemas.microsoft.com/office/word/2010/wordprocessingDrawing" xmlns:wp="http://schemas.openxmlformats.org/drawingml/2006/wordprocessingDrawing" xmlns:w10="urn:schemas-microsoft-com:office:word" xmlns:w="http://schemas.openxmlformats.org/wordprocessingml/2006/main" xmlns:w14="http://schemas.microsoft.com/office/word/2010/wordml" xmlns:wpg="http://schemas.microsoft.com/office/word/2010/wordprocessingGroup" xmlns:wpi="http://schemas.microsoft.com/office/word/2010/wordprocessingInk" xmlns:wne="http://schemas.microsoft.com/office/word/2006/wordml" xmlns:wps="http://schemas.microsoft.com/office/word/2010/wordprocessingShape" mc:Ignorable="w14 wp14">
+<w:numbering xmlns:wpc="http://schemas.microsoft.com/office/word/2010/wordprocessingCanvas" xmlns:mc="http://schemas.openxmlformats.org/markup-compatibility/2006" xmlns:o="urn:schemas-microsoft-com:office:office" xmlns:r="http://schemas.openxmlformats.org/officeDocument/2006/relationships" xmlns:m="http://schemas.openxmlformats.org/officeDocument/2006/math" xmlns:v="urn:schemas-microsoft-com:vml" xmlns:wp14="http://schemas.microsoft.com/office/word/2010/wordprocessingDrawing" xmlns:wp="http://schemas.openxmlformats.org/drawingml/2006/wordprocessingDrawing" xmlns:w10="urn:schemas-microsoft-com:office:word" xmlns:w="http://schemas.openxmlformats.org/wordprocessingml/2006/main" xmlns:w14="http://schemas.microsoft.com/office/word/2010/wordml" xmlns:wpg="http://schemas.microsoft.com/office/word/2010/wordprocessingGroup" xmlns:wpi="http://schemas.microsoft.com/office/word/2010/wordprocessingInk" xmlns:wne="http://schemas.microsoft.com/office/word/2006/wordml" xmlns:wps="http://schemas.microsoft.com/office/word/2010/wordprocessingShape" mc:Ignorable="w14 wp14">
   <w:abstractNum w:abstractNumId="0">
     <w:nsid w:val="FFFFFF7C"/>
     <w:multiLevelType w:val="singleLevel"/>
@@ -114,7 +194,7 @@
     <w:lvl w:ilvl="0">
       <w:start w:val="1"/>
       <w:numFmt w:val="decimal"/>
-      <w:pStyle w:val="ListNumber3"/>
+      <w:pStyle w:val="3"/>
       <w:lvlText w:val="%1."/>
       <w:lvlJc w:val="left"/>
       <w:pPr>
@@ -132,7 +212,7 @@
     <w:lvl w:ilvl="0">
       <w:start w:val="1"/>
       <w:numFmt w:val="decimal"/>
-      <w:pStyle w:val="ListNumber2"/>
+      <w:pStyle w:val="2"/>
       <w:lvlText w:val="%1."/>
       <w:lvlJc w:val="left"/>
       <w:pPr>
@@ -170,7 +250,7 @@
     <w:lvl w:ilvl="0">
       <w:start w:val="1"/>
       <w:numFmt w:val="bullet"/>
-      <w:pStyle w:val="ListBullet3"/>
+      <w:pStyle w:val="30"/>
       <w:lvlText w:val=""/>
       <w:lvlJc w:val="left"/>
       <w:pPr>
@@ -191,7 +271,7 @@
     <w:lvl w:ilvl="0">
       <w:start w:val="1"/>
       <w:numFmt w:val="bullet"/>
-      <w:pStyle w:val="ListBullet2"/>
+      <w:pStyle w:val="20"/>
       <w:lvlText w:val=""/>
       <w:lvlJc w:val="left"/>
       <w:pPr>
@@ -212,7 +292,7 @@
     <w:lvl w:ilvl="0">
       <w:start w:val="1"/>
       <w:numFmt w:val="decimal"/>
-      <w:pStyle w:val="ListNumber"/>
+      <w:pStyle w:val="a"/>
       <w:lvlText w:val="%1."/>
       <w:lvlJc w:val="left"/>
       <w:pPr>
@@ -230,7 +310,7 @@
     <w:lvl w:ilvl="0">
       <w:start w:val="1"/>
       <w:numFmt w:val="bullet"/>
-      <w:pStyle w:val="ListBullet"/>
+      <w:pStyle w:val="a0"/>
       <w:lvlText w:val=""/>
       <w:lvlJc w:val="left"/>
       <w:pPr>
@@ -291,7 +371,7 @@
       </w:pPr>
     </w:pPrDefault>
   </w:docDefaults>
-  <w:latentStyles w:defLockedState="0" w:defUIPriority="99" w:defSemiHidden="1" w:defUnhideWhenUsed="1" w:defQFormat="0" w:count="276">
+  <w:latentStyles w:defLockedState="0" w:defUIPriority="99" w:defSemiHidden="1" w:defUnhideWhenUsed="1" w:defQFormat="0" w:count="267">
     <w:lsdException w:name="Normal" w:semiHidden="0" w:uiPriority="0" w:unhideWhenUsed="0" w:qFormat="1"/>
     <w:lsdException w:name="heading 1" w:semiHidden="0" w:uiPriority="9" w:unhideWhenUsed="0" w:qFormat="1"/>
     <w:lsdException w:name="heading 2" w:uiPriority="9" w:qFormat="1"/>
@@ -430,60 +510,16 @@
     <w:lsdException w:name="Bibliography" w:uiPriority="37"/>
     <w:lsdException w:name="TOC Heading" w:uiPriority="39" w:qFormat="1"/>
   </w:latentStyles>
-  <w:style w:type="paragraph" w:default="1" w:styleId="Normal">
+  <w:style w:type="paragraph" w:default="1" w:styleId="a1">
     <w:name w:val="Normal"/>
     <w:qFormat/>
     <w:rsid w:val="00FC693F"/>
   </w:style>
-  <w:style w:type="paragraph" w:styleId="Header">
-    <w:name w:val="header"/>
-    <w:basedOn w:val="Normal"/>
-    <w:link w:val="HeaderChar"/>
-    <w:uiPriority w:val="99"/>
-    <w:unhideWhenUsed/>
-    <w:rsid w:val="00E618BF"/>
-    <w:pPr>
-      <w:tabs>
-        <w:tab w:val="center" w:pos="4680"/>
-        <w:tab w:val="right" w:pos="9360"/>
-      </w:tabs>
-      <w:spacing w:after="0" w:line="240" w:lineRule="auto"/>
-    </w:pPr>
-  </w:style>
-  <w:style w:type="character" w:customStyle="1" w:styleId="HeaderChar">
-    <w:name w:val="Header Char"/>
-    <w:basedOn w:val="DefaultParagraphFont"/>
-    <w:link w:val="Header"/>
-    <w:uiPriority w:val="99"/>
-    <w:rsid w:val="00E618BF"/>
-  </w:style>
-  <w:style w:type="paragraph" w:styleId="Footer">
-    <w:name w:val="footer"/>
-    <w:basedOn w:val="Normal"/>
-    <w:link w:val="FooterChar"/>
-    <w:uiPriority w:val="99"/>
-    <w:unhideWhenUsed/>
-    <w:rsid w:val="00E618BF"/>
-    <w:pPr>
-      <w:tabs>
-        <w:tab w:val="center" w:pos="4680"/>
-        <w:tab w:val="right" w:pos="9360"/>
-      </w:tabs>
-      <w:spacing w:after="0" w:line="240" w:lineRule="auto"/>
-    </w:pPr>
-  </w:style>
-  <w:style w:type="character" w:customStyle="1" w:styleId="FooterChar">
-    <w:name w:val="Footer Char"/>
-    <w:basedOn w:val="DefaultParagraphFont"/>
-    <w:link w:val="Footer"/>
-    <w:uiPriority w:val="99"/>
-    <w:rsid w:val="00E618BF"/>
-  </w:style>
-  <w:style w:type="paragraph" w:styleId="Heading1">
+  <w:style w:type="paragraph" w:styleId="1">
     <w:name w:val="heading 1"/>
-    <w:basedOn w:val="Normal"/>
-    <w:next w:val="Normal"/>
-    <w:link w:val="Heading1Char"/>
+    <w:basedOn w:val="a1"/>
+    <w:next w:val="a1"/>
+    <w:link w:val="10"/>
     <w:uiPriority w:val="9"/>
     <w:qFormat/>
     <w:rsid w:val="00FC693F"/>
@@ -502,11 +538,11 @@
       <w:szCs w:val="28"/>
     </w:rPr>
   </w:style>
-  <w:style w:type="paragraph" w:styleId="Heading2">
+  <w:style w:type="paragraph" w:styleId="21">
     <w:name w:val="heading 2"/>
-    <w:basedOn w:val="Normal"/>
-    <w:next w:val="Normal"/>
-    <w:link w:val="Heading2Char"/>
+    <w:basedOn w:val="a1"/>
+    <w:next w:val="a1"/>
+    <w:link w:val="22"/>
     <w:uiPriority w:val="9"/>
     <w:unhideWhenUsed/>
     <w:qFormat/>
@@ -526,11 +562,11 @@
       <w:szCs w:val="26"/>
     </w:rPr>
   </w:style>
-  <w:style w:type="paragraph" w:styleId="Heading3">
+  <w:style w:type="paragraph" w:styleId="31">
     <w:name w:val="heading 3"/>
-    <w:basedOn w:val="Normal"/>
-    <w:next w:val="Normal"/>
-    <w:link w:val="Heading3Char"/>
+    <w:basedOn w:val="a1"/>
+    <w:next w:val="a1"/>
+    <w:link w:val="32"/>
     <w:uiPriority w:val="9"/>
     <w:unhideWhenUsed/>
     <w:qFormat/>
@@ -548,11 +584,11 @@
       <w:color w:val="4F81BD" w:themeColor="accent1"/>
     </w:rPr>
   </w:style>
-  <w:style w:type="paragraph" w:styleId="Heading4">
+  <w:style w:type="paragraph" w:styleId="4">
     <w:name w:val="heading 4"/>
-    <w:basedOn w:val="Normal"/>
-    <w:next w:val="Normal"/>
-    <w:link w:val="Heading4Char"/>
+    <w:basedOn w:val="a1"/>
+    <w:next w:val="a1"/>
+    <w:link w:val="40"/>
     <w:uiPriority w:val="9"/>
     <w:semiHidden/>
     <w:unhideWhenUsed/>
@@ -573,11 +609,11 @@
       <w:color w:val="4F81BD" w:themeColor="accent1"/>
     </w:rPr>
   </w:style>
-  <w:style w:type="paragraph" w:styleId="Heading5">
+  <w:style w:type="paragraph" w:styleId="5">
     <w:name w:val="heading 5"/>
-    <w:basedOn w:val="Normal"/>
-    <w:next w:val="Normal"/>
-    <w:link w:val="Heading5Char"/>
+    <w:basedOn w:val="a1"/>
+    <w:next w:val="a1"/>
+    <w:link w:val="50"/>
     <w:uiPriority w:val="9"/>
     <w:semiHidden/>
     <w:unhideWhenUsed/>
@@ -594,11 +630,11 @@
       <w:color w:val="243F60" w:themeColor="accent1" w:themeShade="7F"/>
     </w:rPr>
   </w:style>
-  <w:style w:type="paragraph" w:styleId="Heading6">
+  <w:style w:type="paragraph" w:styleId="6">
     <w:name w:val="heading 6"/>
-    <w:basedOn w:val="Normal"/>
-    <w:next w:val="Normal"/>
-    <w:link w:val="Heading6Char"/>
+    <w:basedOn w:val="a1"/>
+    <w:next w:val="a1"/>
+    <w:link w:val="60"/>
     <w:uiPriority w:val="9"/>
     <w:semiHidden/>
     <w:unhideWhenUsed/>
@@ -617,11 +653,11 @@
       <w:color w:val="243F60" w:themeColor="accent1" w:themeShade="7F"/>
     </w:rPr>
   </w:style>
-  <w:style w:type="paragraph" w:styleId="Heading7">
+  <w:style w:type="paragraph" w:styleId="7">
     <w:name w:val="heading 7"/>
-    <w:basedOn w:val="Normal"/>
-    <w:next w:val="Normal"/>
-    <w:link w:val="Heading7Char"/>
+    <w:basedOn w:val="a1"/>
+    <w:next w:val="a1"/>
+    <w:link w:val="70"/>
     <w:uiPriority w:val="9"/>
     <w:semiHidden/>
     <w:unhideWhenUsed/>
@@ -640,11 +676,11 @@
       <w:color w:val="404040" w:themeColor="text1" w:themeTint="BF"/>
     </w:rPr>
   </w:style>
-  <w:style w:type="paragraph" w:styleId="Heading8">
+  <w:style w:type="paragraph" w:styleId="8">
     <w:name w:val="heading 8"/>
-    <w:basedOn w:val="Normal"/>
-    <w:next w:val="Normal"/>
-    <w:link w:val="Heading8Char"/>
+    <w:basedOn w:val="a1"/>
+    <w:next w:val="a1"/>
+    <w:link w:val="80"/>
     <w:uiPriority w:val="9"/>
     <w:semiHidden/>
     <w:unhideWhenUsed/>
@@ -663,11 +699,11 @@
       <w:szCs w:val="20"/>
     </w:rPr>
   </w:style>
-  <w:style w:type="paragraph" w:styleId="Heading9">
+  <w:style w:type="paragraph" w:styleId="9">
     <w:name w:val="heading 9"/>
-    <w:basedOn w:val="Normal"/>
-    <w:next w:val="Normal"/>
-    <w:link w:val="Heading9Char"/>
+    <w:basedOn w:val="a1"/>
+    <w:next w:val="a1"/>
+    <w:link w:val="90"/>
     <w:uiPriority w:val="9"/>
     <w:semiHidden/>
     <w:unhideWhenUsed/>
@@ -688,13 +724,13 @@
       <w:szCs w:val="20"/>
     </w:rPr>
   </w:style>
-  <w:style w:type="character" w:default="1" w:styleId="DefaultParagraphFont">
+  <w:style w:type="character" w:default="1" w:styleId="a2">
     <w:name w:val="Default Paragraph Font"/>
     <w:uiPriority w:val="1"/>
     <w:semiHidden/>
     <w:unhideWhenUsed/>
   </w:style>
-  <w:style w:type="table" w:default="1" w:styleId="TableNormal">
+  <w:style w:type="table" w:default="1" w:styleId="a3">
     <w:name w:val="Normal Table"/>
     <w:uiPriority w:val="99"/>
     <w:semiHidden/>
@@ -709,13 +745,57 @@
       </w:tblCellMar>
     </w:tblPr>
   </w:style>
-  <w:style w:type="numbering" w:default="1" w:styleId="NoList">
+  <w:style w:type="numbering" w:default="1" w:styleId="a4">
     <w:name w:val="No List"/>
     <w:uiPriority w:val="99"/>
     <w:semiHidden/>
     <w:unhideWhenUsed/>
   </w:style>
-  <w:style w:type="paragraph" w:styleId="NoSpacing">
+  <w:style w:type="paragraph" w:styleId="a5">
+    <w:name w:val="header"/>
+    <w:basedOn w:val="a1"/>
+    <w:link w:val="a6"/>
+    <w:uiPriority w:val="99"/>
+    <w:unhideWhenUsed/>
+    <w:rsid w:val="00E618BF"/>
+    <w:pPr>
+      <w:tabs>
+        <w:tab w:val="center" w:pos="4680"/>
+        <w:tab w:val="right" w:pos="9360"/>
+      </w:tabs>
+      <w:spacing w:after="0" w:line="240" w:lineRule="auto"/>
+    </w:pPr>
+  </w:style>
+  <w:style w:type="character" w:customStyle="1" w:styleId="a6">
+    <w:name w:val="Верхний колонтитул Знак"/>
+    <w:basedOn w:val="a2"/>
+    <w:link w:val="a5"/>
+    <w:uiPriority w:val="99"/>
+    <w:rsid w:val="00E618BF"/>
+  </w:style>
+  <w:style w:type="paragraph" w:styleId="a7">
+    <w:name w:val="footer"/>
+    <w:basedOn w:val="a1"/>
+    <w:link w:val="a8"/>
+    <w:uiPriority w:val="99"/>
+    <w:unhideWhenUsed/>
+    <w:rsid w:val="00E618BF"/>
+    <w:pPr>
+      <w:tabs>
+        <w:tab w:val="center" w:pos="4680"/>
+        <w:tab w:val="right" w:pos="9360"/>
+      </w:tabs>
+      <w:spacing w:after="0" w:line="240" w:lineRule="auto"/>
+    </w:pPr>
+  </w:style>
+  <w:style w:type="character" w:customStyle="1" w:styleId="a8">
+    <w:name w:val="Нижний колонтитул Знак"/>
+    <w:basedOn w:val="a2"/>
+    <w:link w:val="a7"/>
+    <w:uiPriority w:val="99"/>
+    <w:rsid w:val="00E618BF"/>
+  </w:style>
+  <w:style w:type="paragraph" w:styleId="a9">
     <w:name w:val="No Spacing"/>
     <w:uiPriority w:val="1"/>
     <w:qFormat/>
@@ -724,10 +804,10 @@
       <w:spacing w:after="0" w:line="240" w:lineRule="auto"/>
     </w:pPr>
   </w:style>
-  <w:style w:type="character" w:customStyle="1" w:styleId="Heading1Char">
-    <w:name w:val="Heading 1 Char"/>
-    <w:basedOn w:val="DefaultParagraphFont"/>
-    <w:link w:val="Heading1"/>
+  <w:style w:type="character" w:customStyle="1" w:styleId="10">
+    <w:name w:val="Заголовок 1 Знак"/>
+    <w:basedOn w:val="a2"/>
+    <w:link w:val="1"/>
     <w:uiPriority w:val="9"/>
     <w:rsid w:val="00FC693F"/>
     <w:rPr>
@@ -739,10 +819,10 @@
       <w:szCs w:val="28"/>
     </w:rPr>
   </w:style>
-  <w:style w:type="character" w:customStyle="1" w:styleId="Heading2Char">
-    <w:name w:val="Heading 2 Char"/>
-    <w:basedOn w:val="DefaultParagraphFont"/>
-    <w:link w:val="Heading2"/>
+  <w:style w:type="character" w:customStyle="1" w:styleId="22">
+    <w:name w:val="Заголовок 2 Знак"/>
+    <w:basedOn w:val="a2"/>
+    <w:link w:val="21"/>
     <w:uiPriority w:val="9"/>
     <w:rsid w:val="00FC693F"/>
     <w:rPr>
@@ -754,10 +834,10 @@
       <w:szCs w:val="26"/>
     </w:rPr>
   </w:style>
-  <w:style w:type="character" w:customStyle="1" w:styleId="Heading3Char">
-    <w:name w:val="Heading 3 Char"/>
-    <w:basedOn w:val="DefaultParagraphFont"/>
-    <w:link w:val="Heading3"/>
+  <w:style w:type="character" w:customStyle="1" w:styleId="32">
+    <w:name w:val="Заголовок 3 Знак"/>
+    <w:basedOn w:val="a2"/>
+    <w:link w:val="31"/>
     <w:uiPriority w:val="9"/>
     <w:rsid w:val="00FC693F"/>
     <w:rPr>
@@ -767,11 +847,11 @@
       <w:color w:val="4F81BD" w:themeColor="accent1"/>
     </w:rPr>
   </w:style>
-  <w:style w:type="paragraph" w:styleId="Title">
+  <w:style w:type="paragraph" w:styleId="aa">
     <w:name w:val="Title"/>
-    <w:basedOn w:val="Normal"/>
-    <w:next w:val="Normal"/>
-    <w:link w:val="TitleChar"/>
+    <w:basedOn w:val="a1"/>
+    <w:next w:val="a1"/>
+    <w:link w:val="ab"/>
     <w:uiPriority w:val="10"/>
     <w:qFormat/>
     <w:rsid w:val="00FC693F"/>
@@ -791,10 +871,10 @@
       <w:szCs w:val="52"/>
     </w:rPr>
   </w:style>
-  <w:style w:type="character" w:customStyle="1" w:styleId="TitleChar">
-    <w:name w:val="Title Char"/>
-    <w:basedOn w:val="DefaultParagraphFont"/>
-    <w:link w:val="Title"/>
+  <w:style w:type="character" w:customStyle="1" w:styleId="ab">
+    <w:name w:val="Название Знак"/>
+    <w:basedOn w:val="a2"/>
+    <w:link w:val="aa"/>
     <w:uiPriority w:val="10"/>
     <w:rsid w:val="00FC693F"/>
     <w:rPr>
@@ -806,11 +886,11 @@
       <w:szCs w:val="52"/>
     </w:rPr>
   </w:style>
-  <w:style w:type="paragraph" w:styleId="Subtitle">
+  <w:style w:type="paragraph" w:styleId="ac">
     <w:name w:val="Subtitle"/>
-    <w:basedOn w:val="Normal"/>
-    <w:next w:val="Normal"/>
-    <w:link w:val="SubtitleChar"/>
+    <w:basedOn w:val="a1"/>
+    <w:next w:val="a1"/>
+    <w:link w:val="ad"/>
     <w:uiPriority w:val="11"/>
     <w:qFormat/>
     <w:rsid w:val="00FC693F"/>
@@ -829,10 +909,10 @@
       <w:szCs w:val="24"/>
     </w:rPr>
   </w:style>
-  <w:style w:type="character" w:customStyle="1" w:styleId="SubtitleChar">
-    <w:name w:val="Subtitle Char"/>
-    <w:basedOn w:val="DefaultParagraphFont"/>
-    <w:link w:val="Subtitle"/>
+  <w:style w:type="character" w:customStyle="1" w:styleId="ad">
+    <w:name w:val="Подзаголовок Знак"/>
+    <w:basedOn w:val="a2"/>
+    <w:link w:val="ac"/>
     <w:uiPriority w:val="11"/>
     <w:rsid w:val="00FC693F"/>
     <w:rPr>
@@ -845,9 +925,9 @@
       <w:szCs w:val="24"/>
     </w:rPr>
   </w:style>
-  <w:style w:type="paragraph" w:styleId="ListParagraph">
+  <w:style w:type="paragraph" w:styleId="ae">
     <w:name w:val="List Paragraph"/>
-    <w:basedOn w:val="Normal"/>
+    <w:basedOn w:val="a1"/>
     <w:uiPriority w:val="34"/>
     <w:qFormat/>
     <w:rsid w:val="00FC693F"/>
@@ -856,10 +936,10 @@
       <w:contextualSpacing/>
     </w:pPr>
   </w:style>
-  <w:style w:type="paragraph" w:styleId="BodyText">
+  <w:style w:type="paragraph" w:styleId="af">
     <w:name w:val="Body Text"/>
-    <w:basedOn w:val="Normal"/>
-    <w:link w:val="BodyTextChar"/>
+    <w:basedOn w:val="a1"/>
+    <w:link w:val="af0"/>
     <w:uiPriority w:val="99"/>
     <w:unhideWhenUsed/>
     <w:rsid w:val="00AA1D8D"/>
@@ -867,17 +947,17 @@
       <w:spacing w:after="120"/>
     </w:pPr>
   </w:style>
-  <w:style w:type="character" w:customStyle="1" w:styleId="BodyTextChar">
-    <w:name w:val="Body Text Char"/>
-    <w:basedOn w:val="DefaultParagraphFont"/>
-    <w:link w:val="BodyText"/>
+  <w:style w:type="character" w:customStyle="1" w:styleId="af0">
+    <w:name w:val="Основной текст Знак"/>
+    <w:basedOn w:val="a2"/>
+    <w:link w:val="af"/>
     <w:uiPriority w:val="99"/>
     <w:rsid w:val="00AA1D8D"/>
   </w:style>
-  <w:style w:type="paragraph" w:styleId="BodyText2">
+  <w:style w:type="paragraph" w:styleId="23">
     <w:name w:val="Body Text 2"/>
-    <w:basedOn w:val="Normal"/>
-    <w:link w:val="BodyText2Char"/>
+    <w:basedOn w:val="a1"/>
+    <w:link w:val="24"/>
     <w:uiPriority w:val="99"/>
     <w:unhideWhenUsed/>
     <w:rsid w:val="00AA1D8D"/>
@@ -885,17 +965,17 @@
       <w:spacing w:after="120" w:line="480" w:lineRule="auto"/>
     </w:pPr>
   </w:style>
-  <w:style w:type="character" w:customStyle="1" w:styleId="BodyText2Char">
-    <w:name w:val="Body Text 2 Char"/>
-    <w:basedOn w:val="DefaultParagraphFont"/>
-    <w:link w:val="BodyText2"/>
+  <w:style w:type="character" w:customStyle="1" w:styleId="24">
+    <w:name w:val="Основной текст 2 Знак"/>
+    <w:basedOn w:val="a2"/>
+    <w:link w:val="23"/>
     <w:uiPriority w:val="99"/>
     <w:rsid w:val="00AA1D8D"/>
   </w:style>
-  <w:style w:type="paragraph" w:styleId="BodyText3">
+  <w:style w:type="paragraph" w:styleId="33">
     <w:name w:val="Body Text 3"/>
-    <w:basedOn w:val="Normal"/>
-    <w:link w:val="BodyText3Char"/>
+    <w:basedOn w:val="a1"/>
+    <w:link w:val="34"/>
     <w:uiPriority w:val="99"/>
     <w:unhideWhenUsed/>
     <w:rsid w:val="00AA1D8D"/>
@@ -907,10 +987,10 @@
       <w:szCs w:val="16"/>
     </w:rPr>
   </w:style>
-  <w:style w:type="character" w:customStyle="1" w:styleId="BodyText3Char">
-    <w:name w:val="Body Text 3 Char"/>
-    <w:basedOn w:val="DefaultParagraphFont"/>
-    <w:link w:val="BodyText3"/>
+  <w:style w:type="character" w:customStyle="1" w:styleId="34">
+    <w:name w:val="Основной текст 3 Знак"/>
+    <w:basedOn w:val="a2"/>
+    <w:link w:val="33"/>
     <w:uiPriority w:val="99"/>
     <w:rsid w:val="00AA1D8D"/>
     <w:rPr>
@@ -918,9 +998,9 @@
       <w:szCs w:val="16"/>
     </w:rPr>
   </w:style>
-  <w:style w:type="paragraph" w:styleId="List">
+  <w:style w:type="paragraph" w:styleId="af1">
     <w:name w:val="List"/>
-    <w:basedOn w:val="Normal"/>
+    <w:basedOn w:val="a1"/>
     <w:uiPriority w:val="99"/>
     <w:unhideWhenUsed/>
     <w:rsid w:val="00AA1D8D"/>
@@ -929,9 +1009,9 @@
       <w:contextualSpacing/>
     </w:pPr>
   </w:style>
-  <w:style w:type="paragraph" w:styleId="List2">
+  <w:style w:type="paragraph" w:styleId="25">
     <w:name w:val="List 2"/>
-    <w:basedOn w:val="Normal"/>
+    <w:basedOn w:val="a1"/>
     <w:uiPriority w:val="99"/>
     <w:unhideWhenUsed/>
     <w:rsid w:val="00326F90"/>
@@ -940,9 +1020,9 @@
       <w:contextualSpacing/>
     </w:pPr>
   </w:style>
-  <w:style w:type="paragraph" w:styleId="List3">
+  <w:style w:type="paragraph" w:styleId="35">
     <w:name w:val="List 3"/>
-    <w:basedOn w:val="Normal"/>
+    <w:basedOn w:val="a1"/>
     <w:uiPriority w:val="99"/>
     <w:unhideWhenUsed/>
     <w:rsid w:val="00326F90"/>
@@ -951,9 +1031,9 @@
       <w:contextualSpacing/>
     </w:pPr>
   </w:style>
-  <w:style w:type="paragraph" w:styleId="ListBullet">
+  <w:style w:type="paragraph" w:styleId="a0">
     <w:name w:val="List Bullet"/>
-    <w:basedOn w:val="Normal"/>
+    <w:basedOn w:val="a1"/>
     <w:uiPriority w:val="99"/>
     <w:unhideWhenUsed/>
     <w:rsid w:val="00326F90"/>
@@ -964,9 +1044,9 @@
       <w:contextualSpacing/>
     </w:pPr>
   </w:style>
-  <w:style w:type="paragraph" w:styleId="ListBullet2">
+  <w:style w:type="paragraph" w:styleId="20">
     <w:name w:val="List Bullet 2"/>
-    <w:basedOn w:val="Normal"/>
+    <w:basedOn w:val="a1"/>
     <w:uiPriority w:val="99"/>
     <w:unhideWhenUsed/>
     <w:rsid w:val="00326F90"/>
@@ -977,9 +1057,9 @@
       <w:contextualSpacing/>
     </w:pPr>
   </w:style>
-  <w:style w:type="paragraph" w:styleId="ListBullet3">
+  <w:style w:type="paragraph" w:styleId="30">
     <w:name w:val="List Bullet 3"/>
-    <w:basedOn w:val="Normal"/>
+    <w:basedOn w:val="a1"/>
     <w:uiPriority w:val="99"/>
     <w:unhideWhenUsed/>
     <w:rsid w:val="00326F90"/>
@@ -990,9 +1070,9 @@
       <w:contextualSpacing/>
     </w:pPr>
   </w:style>
-  <w:style w:type="paragraph" w:styleId="ListNumber">
+  <w:style w:type="paragraph" w:styleId="a">
     <w:name w:val="List Number"/>
-    <w:basedOn w:val="Normal"/>
+    <w:basedOn w:val="a1"/>
     <w:uiPriority w:val="99"/>
     <w:unhideWhenUsed/>
     <w:rsid w:val="00326F90"/>
@@ -1003,9 +1083,9 @@
       <w:contextualSpacing/>
     </w:pPr>
   </w:style>
-  <w:style w:type="paragraph" w:styleId="ListNumber2">
+  <w:style w:type="paragraph" w:styleId="2">
     <w:name w:val="List Number 2"/>
-    <w:basedOn w:val="Normal"/>
+    <w:basedOn w:val="a1"/>
     <w:uiPriority w:val="99"/>
     <w:unhideWhenUsed/>
     <w:rsid w:val="0029639D"/>
@@ -1016,9 +1096,9 @@
       <w:contextualSpacing/>
     </w:pPr>
   </w:style>
-  <w:style w:type="paragraph" w:styleId="ListNumber3">
+  <w:style w:type="paragraph" w:styleId="3">
     <w:name w:val="List Number 3"/>
-    <w:basedOn w:val="Normal"/>
+    <w:basedOn w:val="a1"/>
     <w:uiPriority w:val="99"/>
     <w:unhideWhenUsed/>
     <w:rsid w:val="0029639D"/>
@@ -1029,9 +1109,9 @@
       <w:contextualSpacing/>
     </w:pPr>
   </w:style>
-  <w:style w:type="paragraph" w:styleId="ListContinue">
+  <w:style w:type="paragraph" w:styleId="af2">
     <w:name w:val="List Continue"/>
-    <w:basedOn w:val="Normal"/>
+    <w:basedOn w:val="a1"/>
     <w:uiPriority w:val="99"/>
     <w:unhideWhenUsed/>
     <w:rsid w:val="0029639D"/>
@@ -1041,9 +1121,9 @@
       <w:contextualSpacing/>
     </w:pPr>
   </w:style>
-  <w:style w:type="paragraph" w:styleId="ListContinue2">
+  <w:style w:type="paragraph" w:styleId="26">
     <w:name w:val="List Continue 2"/>
-    <w:basedOn w:val="Normal"/>
+    <w:basedOn w:val="a1"/>
     <w:uiPriority w:val="99"/>
     <w:unhideWhenUsed/>
     <w:rsid w:val="0029639D"/>
@@ -1053,9 +1133,9 @@
       <w:contextualSpacing/>
     </w:pPr>
   </w:style>
-  <w:style w:type="paragraph" w:styleId="ListContinue3">
+  <w:style w:type="paragraph" w:styleId="36">
     <w:name w:val="List Continue 3"/>
-    <w:basedOn w:val="Normal"/>
+    <w:basedOn w:val="a1"/>
     <w:uiPriority w:val="99"/>
     <w:unhideWhenUsed/>
     <w:rsid w:val="0029639D"/>
@@ -1065,9 +1145,9 @@
       <w:contextualSpacing/>
     </w:pPr>
   </w:style>
-  <w:style w:type="paragraph" w:styleId="MacroText">
+  <w:style w:type="paragraph" w:styleId="af3">
     <w:name w:val="macro"/>
-    <w:link w:val="MacroTextChar"/>
+    <w:link w:val="af4"/>
     <w:uiPriority w:val="99"/>
     <w:unhideWhenUsed/>
     <w:rsid w:val="0029639D"/>
@@ -1088,10 +1168,10 @@
       <w:szCs w:val="20"/>
     </w:rPr>
   </w:style>
-  <w:style w:type="character" w:customStyle="1" w:styleId="MacroTextChar">
-    <w:name w:val="Macro Text Char"/>
-    <w:basedOn w:val="DefaultParagraphFont"/>
-    <w:link w:val="MacroText"/>
+  <w:style w:type="character" w:customStyle="1" w:styleId="af4">
+    <w:name w:val="Текст макроса Знак"/>
+    <w:basedOn w:val="a2"/>
+    <w:link w:val="af3"/>
     <w:uiPriority w:val="99"/>
     <w:rsid w:val="0029639D"/>
     <w:rPr>
@@ -1100,11 +1180,11 @@
       <w:szCs w:val="20"/>
     </w:rPr>
   </w:style>
-  <w:style w:type="paragraph" w:styleId="Quote">
+  <w:style w:type="paragraph" w:styleId="27">
     <w:name w:val="Quote"/>
-    <w:basedOn w:val="Normal"/>
-    <w:next w:val="Normal"/>
-    <w:link w:val="QuoteChar"/>
+    <w:basedOn w:val="a1"/>
+    <w:next w:val="a1"/>
+    <w:link w:val="28"/>
     <w:uiPriority w:val="29"/>
     <w:qFormat/>
     <w:rsid w:val="00FC693F"/>
@@ -1114,10 +1194,10 @@
       <w:color w:val="000000" w:themeColor="text1"/>
     </w:rPr>
   </w:style>
-  <w:style w:type="character" w:customStyle="1" w:styleId="QuoteChar">
-    <w:name w:val="Quote Char"/>
-    <w:basedOn w:val="DefaultParagraphFont"/>
-    <w:link w:val="Quote"/>
+  <w:style w:type="character" w:customStyle="1" w:styleId="28">
+    <w:name w:val="Цитата 2 Знак"/>
+    <w:basedOn w:val="a2"/>
+    <w:link w:val="27"/>
     <w:uiPriority w:val="29"/>
     <w:rsid w:val="00FC693F"/>
     <w:rPr>
@@ -1126,10 +1206,10 @@
       <w:color w:val="000000" w:themeColor="text1"/>
     </w:rPr>
   </w:style>
-  <w:style w:type="character" w:customStyle="1" w:styleId="Heading4Char">
-    <w:name w:val="Heading 4 Char"/>
-    <w:basedOn w:val="DefaultParagraphFont"/>
-    <w:link w:val="Heading4"/>
+  <w:style w:type="character" w:customStyle="1" w:styleId="40">
+    <w:name w:val="Заголовок 4 Знак"/>
+    <w:basedOn w:val="a2"/>
+    <w:link w:val="4"/>
     <w:uiPriority w:val="9"/>
     <w:semiHidden/>
     <w:rsid w:val="00FC693F"/>
@@ -1142,10 +1222,10 @@
       <w:color w:val="4F81BD" w:themeColor="accent1"/>
     </w:rPr>
   </w:style>
-  <w:style w:type="character" w:customStyle="1" w:styleId="Heading5Char">
-    <w:name w:val="Heading 5 Char"/>
-    <w:basedOn w:val="DefaultParagraphFont"/>
-    <w:link w:val="Heading5"/>
+  <w:style w:type="character" w:customStyle="1" w:styleId="50">
+    <w:name w:val="Заголовок 5 Знак"/>
+    <w:basedOn w:val="a2"/>
+    <w:link w:val="5"/>
     <w:uiPriority w:val="9"/>
     <w:semiHidden/>
     <w:rsid w:val="00FC693F"/>
@@ -1154,10 +1234,10 @@
       <w:color w:val="243F60" w:themeColor="accent1" w:themeShade="7F"/>
     </w:rPr>
   </w:style>
-  <w:style w:type="character" w:customStyle="1" w:styleId="Heading6Char">
-    <w:name w:val="Heading 6 Char"/>
-    <w:basedOn w:val="DefaultParagraphFont"/>
-    <w:link w:val="Heading6"/>
+  <w:style w:type="character" w:customStyle="1" w:styleId="60">
+    <w:name w:val="Заголовок 6 Знак"/>
+    <w:basedOn w:val="a2"/>
+    <w:link w:val="6"/>
     <w:uiPriority w:val="9"/>
     <w:semiHidden/>
     <w:rsid w:val="00FC693F"/>
@@ -1168,10 +1248,10 @@
       <w:color w:val="243F60" w:themeColor="accent1" w:themeShade="7F"/>
     </w:rPr>
   </w:style>
-  <w:style w:type="character" w:customStyle="1" w:styleId="Heading7Char">
-    <w:name w:val="Heading 7 Char"/>
-    <w:basedOn w:val="DefaultParagraphFont"/>
-    <w:link w:val="Heading7"/>
+  <w:style w:type="character" w:customStyle="1" w:styleId="70">
+    <w:name w:val="Заголовок 7 Знак"/>
+    <w:basedOn w:val="a2"/>
+    <w:link w:val="7"/>
     <w:uiPriority w:val="9"/>
     <w:semiHidden/>
     <w:rsid w:val="00FC693F"/>
@@ -1182,10 +1262,10 @@
       <w:color w:val="404040" w:themeColor="text1" w:themeTint="BF"/>
     </w:rPr>
   </w:style>
-  <w:style w:type="character" w:customStyle="1" w:styleId="Heading8Char">
-    <w:name w:val="Heading 8 Char"/>
-    <w:basedOn w:val="DefaultParagraphFont"/>
-    <w:link w:val="Heading8"/>
+  <w:style w:type="character" w:customStyle="1" w:styleId="80">
+    <w:name w:val="Заголовок 8 Знак"/>
+    <w:basedOn w:val="a2"/>
+    <w:link w:val="8"/>
     <w:uiPriority w:val="9"/>
     <w:semiHidden/>
     <w:rsid w:val="00FC693F"/>
@@ -1196,10 +1276,10 @@
       <w:szCs w:val="20"/>
     </w:rPr>
   </w:style>
-  <w:style w:type="character" w:customStyle="1" w:styleId="Heading9Char">
-    <w:name w:val="Heading 9 Char"/>
-    <w:basedOn w:val="DefaultParagraphFont"/>
-    <w:link w:val="Heading9"/>
+  <w:style w:type="character" w:customStyle="1" w:styleId="90">
+    <w:name w:val="Заголовок 9 Знак"/>
+    <w:basedOn w:val="a2"/>
+    <w:link w:val="9"/>
     <w:uiPriority w:val="9"/>
     <w:semiHidden/>
     <w:rsid w:val="00FC693F"/>
@@ -1212,10 +1292,10 @@
       <w:szCs w:val="20"/>
     </w:rPr>
   </w:style>
-  <w:style w:type="paragraph" w:styleId="Caption">
+  <w:style w:type="paragraph" w:styleId="af5">
     <w:name w:val="caption"/>
-    <w:basedOn w:val="Normal"/>
-    <w:next w:val="Normal"/>
+    <w:basedOn w:val="a1"/>
+    <w:next w:val="a1"/>
     <w:uiPriority w:val="35"/>
     <w:semiHidden/>
     <w:unhideWhenUsed/>
@@ -1232,9 +1312,9 @@
       <w:szCs w:val="18"/>
     </w:rPr>
   </w:style>
-  <w:style w:type="character" w:styleId="Strong">
+  <w:style w:type="character" w:styleId="af6">
     <w:name w:val="Strong"/>
-    <w:basedOn w:val="DefaultParagraphFont"/>
+    <w:basedOn w:val="a2"/>
     <w:uiPriority w:val="22"/>
     <w:qFormat/>
     <w:rsid w:val="00FC693F"/>
@@ -1243,9 +1323,9 @@
       <w:bCs/>
     </w:rPr>
   </w:style>
-  <w:style w:type="character" w:styleId="Emphasis">
+  <w:style w:type="character" w:styleId="af7">
     <w:name w:val="Emphasis"/>
-    <w:basedOn w:val="DefaultParagraphFont"/>
+    <w:basedOn w:val="a2"/>
     <w:uiPriority w:val="20"/>
     <w:qFormat/>
     <w:rsid w:val="00FC693F"/>
@@ -1254,11 +1334,11 @@
       <w:iCs/>
     </w:rPr>
   </w:style>
-  <w:style w:type="paragraph" w:styleId="IntenseQuote">
+  <w:style w:type="paragraph" w:styleId="af8">
     <w:name w:val="Intense Quote"/>
-    <w:basedOn w:val="Normal"/>
-    <w:next w:val="Normal"/>
-    <w:link w:val="IntenseQuoteChar"/>
+    <w:basedOn w:val="a1"/>
+    <w:next w:val="a1"/>
+    <w:link w:val="af9"/>
     <w:uiPriority w:val="30"/>
     <w:qFormat/>
     <w:rsid w:val="00FC693F"/>
@@ -1277,10 +1357,10 @@
       <w:color w:val="4F81BD" w:themeColor="accent1"/>
     </w:rPr>
   </w:style>
-  <w:style w:type="character" w:customStyle="1" w:styleId="IntenseQuoteChar">
-    <w:name w:val="Intense Quote Char"/>
-    <w:basedOn w:val="DefaultParagraphFont"/>
-    <w:link w:val="IntenseQuote"/>
+  <w:style w:type="character" w:customStyle="1" w:styleId="af9">
+    <w:name w:val="Выделенная цитата Знак"/>
+    <w:basedOn w:val="a2"/>
+    <w:link w:val="af8"/>
     <w:uiPriority w:val="30"/>
     <w:rsid w:val="00FC693F"/>
     <w:rPr>
@@ -1291,9 +1371,9 @@
       <w:color w:val="4F81BD" w:themeColor="accent1"/>
     </w:rPr>
   </w:style>
-  <w:style w:type="character" w:styleId="SubtleEmphasis">
+  <w:style w:type="character" w:styleId="afa">
     <w:name w:val="Subtle Emphasis"/>
-    <w:basedOn w:val="DefaultParagraphFont"/>
+    <w:basedOn w:val="a2"/>
     <w:uiPriority w:val="19"/>
     <w:qFormat/>
     <w:rsid w:val="00FC693F"/>
@@ -1303,9 +1383,9 @@
       <w:color w:val="808080" w:themeColor="text1" w:themeTint="7F"/>
     </w:rPr>
   </w:style>
-  <w:style w:type="character" w:styleId="IntenseEmphasis">
+  <w:style w:type="character" w:styleId="afb">
     <w:name w:val="Intense Emphasis"/>
-    <w:basedOn w:val="DefaultParagraphFont"/>
+    <w:basedOn w:val="a2"/>
     <w:uiPriority w:val="21"/>
     <w:qFormat/>
     <w:rsid w:val="00FC693F"/>
@@ -1317,9 +1397,9 @@
       <w:color w:val="4F81BD" w:themeColor="accent1"/>
     </w:rPr>
   </w:style>
-  <w:style w:type="character" w:styleId="SubtleReference">
+  <w:style w:type="character" w:styleId="afc">
     <w:name w:val="Subtle Reference"/>
-    <w:basedOn w:val="DefaultParagraphFont"/>
+    <w:basedOn w:val="a2"/>
     <w:uiPriority w:val="31"/>
     <w:qFormat/>
     <w:rsid w:val="00FC693F"/>
@@ -1329,9 +1409,9 @@
       <w:u w:val="single"/>
     </w:rPr>
   </w:style>
-  <w:style w:type="character" w:styleId="IntenseReference">
+  <w:style w:type="character" w:styleId="afd">
     <w:name w:val="Intense Reference"/>
-    <w:basedOn w:val="DefaultParagraphFont"/>
+    <w:basedOn w:val="a2"/>
     <w:uiPriority w:val="32"/>
     <w:qFormat/>
     <w:rsid w:val="00FC693F"/>
@@ -1344,9 +1424,9 @@
       <w:u w:val="single"/>
     </w:rPr>
   </w:style>
-  <w:style w:type="character" w:styleId="BookTitle">
+  <w:style w:type="character" w:styleId="afe">
     <w:name w:val="Book Title"/>
-    <w:basedOn w:val="DefaultParagraphFont"/>
+    <w:basedOn w:val="a2"/>
     <w:uiPriority w:val="33"/>
     <w:qFormat/>
     <w:rsid w:val="00FC693F"/>
@@ -1357,10 +1437,10 @@
       <w:spacing w:val="5"/>
     </w:rPr>
   </w:style>
-  <w:style w:type="paragraph" w:styleId="TOCHeading">
+  <w:style w:type="paragraph" w:styleId="aff">
     <w:name w:val="TOC Heading"/>
-    <w:basedOn w:val="Heading1"/>
-    <w:next w:val="Normal"/>
+    <w:basedOn w:val="1"/>
+    <w:next w:val="a1"/>
     <w:uiPriority w:val="39"/>
     <w:semiHidden/>
     <w:unhideWhenUsed/>
@@ -1370,9 +1450,9 @@
       <w:outlineLvl w:val="9"/>
     </w:pPr>
   </w:style>
-  <w:style w:type="table" w:styleId="TableGrid">
+  <w:style w:type="table" w:styleId="aff0">
     <w:name w:val="Table Grid"/>
-    <w:basedOn w:val="TableNormal"/>
+    <w:basedOn w:val="a3"/>
     <w:uiPriority w:val="59"/>
     <w:rsid w:val="00FC693F"/>
     <w:pPr>
@@ -1396,9 +1476,9 @@
       </w:tblCellMar>
     </w:tblPr>
   </w:style>
-  <w:style w:type="table" w:styleId="LightShading">
+  <w:style w:type="table" w:styleId="aff1">
     <w:name w:val="Light Shading"/>
-    <w:basedOn w:val="TableNormal"/>
+    <w:basedOn w:val="a3"/>
     <w:uiPriority w:val="60"/>
     <w:rsid w:val="00FC693F"/>
     <w:pPr>
@@ -1499,9 +1579,9 @@
       </w:tcPr>
     </w:tblStylePr>
   </w:style>
-  <w:style w:type="table" w:styleId="LightShading-Accent1">
+  <w:style w:type="table" w:styleId="-1">
     <w:name w:val="Light Shading Accent 1"/>
-    <w:basedOn w:val="TableNormal"/>
+    <w:basedOn w:val="a3"/>
     <w:uiPriority w:val="60"/>
     <w:rsid w:val="00FC693F"/>
     <w:pPr>
@@ -1602,9 +1682,9 @@
       </w:tcPr>
     </w:tblStylePr>
   </w:style>
-  <w:style w:type="table" w:styleId="LightShading-Accent2">
+  <w:style w:type="table" w:styleId="-2">
     <w:name w:val="Light Shading Accent 2"/>
-    <w:basedOn w:val="TableNormal"/>
+    <w:basedOn w:val="a3"/>
     <w:uiPriority w:val="60"/>
     <w:rsid w:val="00FC693F"/>
     <w:pPr>
@@ -1705,9 +1785,9 @@
       </w:tcPr>
     </w:tblStylePr>
   </w:style>
-  <w:style w:type="table" w:styleId="LightShading-Accent3">
+  <w:style w:type="table" w:styleId="-3">
     <w:name w:val="Light Shading Accent 3"/>
-    <w:basedOn w:val="TableNormal"/>
+    <w:basedOn w:val="a3"/>
     <w:uiPriority w:val="60"/>
     <w:rsid w:val="00FC693F"/>
     <w:pPr>
@@ -1808,9 +1888,9 @@
       </w:tcPr>
     </w:tblStylePr>
   </w:style>
-  <w:style w:type="table" w:styleId="LightShading-Accent4">
+  <w:style w:type="table" w:styleId="-4">
     <w:name w:val="Light Shading Accent 4"/>
-    <w:basedOn w:val="TableNormal"/>
+    <w:basedOn w:val="a3"/>
     <w:uiPriority w:val="60"/>
     <w:rsid w:val="00FC693F"/>
     <w:pPr>
@@ -1911,9 +1991,9 @@
       </w:tcPr>
     </w:tblStylePr>
   </w:style>
-  <w:style w:type="table" w:styleId="LightShading-Accent5">
+  <w:style w:type="table" w:styleId="-5">
     <w:name w:val="Light Shading Accent 5"/>
-    <w:basedOn w:val="TableNormal"/>
+    <w:basedOn w:val="a3"/>
     <w:uiPriority w:val="60"/>
     <w:rsid w:val="00FC693F"/>
     <w:pPr>
@@ -2014,9 +2094,9 @@
       </w:tcPr>
     </w:tblStylePr>
   </w:style>
-  <w:style w:type="table" w:styleId="LightShading-Accent6">
+  <w:style w:type="table" w:styleId="-6">
     <w:name w:val="Light Shading Accent 6"/>
-    <w:basedOn w:val="TableNormal"/>
+    <w:basedOn w:val="a3"/>
     <w:uiPriority w:val="60"/>
     <w:rsid w:val="00FC693F"/>
     <w:pPr>
@@ -2117,9 +2197,9 @@
       </w:tcPr>
     </w:tblStylePr>
   </w:style>
-  <w:style w:type="table" w:styleId="LightList">
+  <w:style w:type="table" w:styleId="aff2">
     <w:name w:val="Light List"/>
-    <w:basedOn w:val="TableNormal"/>
+    <w:basedOn w:val="a3"/>
     <w:uiPriority w:val="61"/>
     <w:rsid w:val="00FC693F"/>
     <w:pPr>
@@ -2209,9 +2289,9 @@
       </w:tcPr>
     </w:tblStylePr>
   </w:style>
-  <w:style w:type="table" w:styleId="LightList-Accent1">
+  <w:style w:type="table" w:styleId="-10">
     <w:name w:val="Light List Accent 1"/>
-    <w:basedOn w:val="TableNormal"/>
+    <w:basedOn w:val="a3"/>
     <w:uiPriority w:val="61"/>
     <w:rsid w:val="00FC693F"/>
     <w:pPr>
@@ -2301,9 +2381,9 @@
       </w:tcPr>
     </w:tblStylePr>
   </w:style>
-  <w:style w:type="table" w:styleId="LightList-Accent2">
+  <w:style w:type="table" w:styleId="-20">
     <w:name w:val="Light List Accent 2"/>
-    <w:basedOn w:val="TableNormal"/>
+    <w:basedOn w:val="a3"/>
     <w:uiPriority w:val="61"/>
     <w:rsid w:val="00CB0664"/>
     <w:pPr>
@@ -2393,9 +2473,9 @@
       </w:tcPr>
     </w:tblStylePr>
   </w:style>
-  <w:style w:type="table" w:styleId="LightList-Accent3">
+  <w:style w:type="table" w:styleId="-30">
     <w:name w:val="Light List Accent 3"/>
-    <w:basedOn w:val="TableNormal"/>
+    <w:basedOn w:val="a3"/>
     <w:uiPriority w:val="61"/>
     <w:rsid w:val="00CB0664"/>
     <w:pPr>
@@ -2485,9 +2565,9 @@
       </w:tcPr>
     </w:tblStylePr>
   </w:style>
-  <w:style w:type="table" w:styleId="LightList-Accent4">
+  <w:style w:type="table" w:styleId="-40">
     <w:name w:val="Light List Accent 4"/>
-    <w:basedOn w:val="TableNormal"/>
+    <w:basedOn w:val="a3"/>
     <w:uiPriority w:val="61"/>
     <w:rsid w:val="00CB0664"/>
     <w:pPr>
@@ -2577,9 +2657,9 @@
       </w:tcPr>
     </w:tblStylePr>
   </w:style>
-  <w:style w:type="table" w:styleId="LightList-Accent5">
+  <w:style w:type="table" w:styleId="-50">
     <w:name w:val="Light List Accent 5"/>
-    <w:basedOn w:val="TableNormal"/>
+    <w:basedOn w:val="a3"/>
     <w:uiPriority w:val="61"/>
     <w:rsid w:val="00CB0664"/>
     <w:pPr>
@@ -2669,9 +2749,9 @@
       </w:tcPr>
     </w:tblStylePr>
   </w:style>
-  <w:style w:type="table" w:styleId="LightList-Accent6">
+  <w:style w:type="table" w:styleId="-60">
     <w:name w:val="Light List Accent 6"/>
-    <w:basedOn w:val="TableNormal"/>
+    <w:basedOn w:val="a3"/>
     <w:uiPriority w:val="61"/>
     <w:rsid w:val="00CB0664"/>
     <w:pPr>
@@ -2761,9 +2841,9 @@
       </w:tcPr>
     </w:tblStylePr>
   </w:style>
-  <w:style w:type="table" w:styleId="LightGrid">
+  <w:style w:type="table" w:styleId="aff3">
     <w:name w:val="Light Grid"/>
-    <w:basedOn w:val="TableNormal"/>
+    <w:basedOn w:val="a3"/>
     <w:uiPriority w:val="62"/>
     <w:rsid w:val="00CB0664"/>
     <w:pPr>
@@ -2891,9 +2971,9 @@
       </w:tcPr>
     </w:tblStylePr>
   </w:style>
-  <w:style w:type="table" w:styleId="LightGrid-Accent1">
+  <w:style w:type="table" w:styleId="-11">
     <w:name w:val="Light Grid Accent 1"/>
-    <w:basedOn w:val="TableNormal"/>
+    <w:basedOn w:val="a3"/>
     <w:uiPriority w:val="62"/>
     <w:rsid w:val="00CB0664"/>
     <w:pPr>
@@ -3021,9 +3101,9 @@
       </w:tcPr>
     </w:tblStylePr>
   </w:style>
-  <w:style w:type="table" w:styleId="LightGrid-Accent2">
+  <w:style w:type="table" w:styleId="-21">
     <w:name w:val="Light Grid Accent 2"/>
-    <w:basedOn w:val="TableNormal"/>
+    <w:basedOn w:val="a3"/>
     <w:uiPriority w:val="62"/>
     <w:rsid w:val="00CB0664"/>
     <w:pPr>
@@ -3151,9 +3231,9 @@
       </w:tcPr>
     </w:tblStylePr>
   </w:style>
-  <w:style w:type="table" w:styleId="LightGrid-Accent3">
+  <w:style w:type="table" w:styleId="-31">
     <w:name w:val="Light Grid Accent 3"/>
-    <w:basedOn w:val="TableNormal"/>
+    <w:basedOn w:val="a3"/>
     <w:uiPriority w:val="62"/>
     <w:rsid w:val="00CB0664"/>
     <w:pPr>
@@ -3281,9 +3361,9 @@
       </w:tcPr>
     </w:tblStylePr>
   </w:style>
-  <w:style w:type="table" w:styleId="LightGrid-Accent4">
+  <w:style w:type="table" w:styleId="-41">
     <w:name w:val="Light Grid Accent 4"/>
-    <w:basedOn w:val="TableNormal"/>
+    <w:basedOn w:val="a3"/>
     <w:uiPriority w:val="62"/>
     <w:rsid w:val="00CB0664"/>
     <w:pPr>
@@ -3411,9 +3491,9 @@
       </w:tcPr>
     </w:tblStylePr>
   </w:style>
-  <w:style w:type="table" w:styleId="LightGrid-Accent5">
+  <w:style w:type="table" w:styleId="-51">
     <w:name w:val="Light Grid Accent 5"/>
-    <w:basedOn w:val="TableNormal"/>
+    <w:basedOn w:val="a3"/>
     <w:uiPriority w:val="62"/>
     <w:rsid w:val="00CB0664"/>
     <w:pPr>
@@ -3541,9 +3621,9 @@
       </w:tcPr>
     </w:tblStylePr>
   </w:style>
-  <w:style w:type="table" w:styleId="LightGrid-Accent6">
+  <w:style w:type="table" w:styleId="-61">
     <w:name w:val="Light Grid Accent 6"/>
-    <w:basedOn w:val="TableNormal"/>
+    <w:basedOn w:val="a3"/>
     <w:uiPriority w:val="62"/>
     <w:rsid w:val="00CB0664"/>
     <w:pPr>
@@ -3671,9 +3751,9 @@
       </w:tcPr>
     </w:tblStylePr>
   </w:style>
-  <w:style w:type="table" w:styleId="MediumShading1">
+  <w:style w:type="table" w:styleId="11">
     <w:name w:val="Medium Shading 1"/>
-    <w:basedOn w:val="TableNormal"/>
+    <w:basedOn w:val="a3"/>
     <w:uiPriority w:val="63"/>
     <w:rsid w:val="00CB0664"/>
     <w:pPr>
@@ -3777,9 +3857,9 @@
       </w:tcPr>
     </w:tblStylePr>
   </w:style>
-  <w:style w:type="table" w:styleId="MediumShading1-Accent1">
+  <w:style w:type="table" w:styleId="1-1">
     <w:name w:val="Medium Shading 1 Accent 1"/>
-    <w:basedOn w:val="TableNormal"/>
+    <w:basedOn w:val="a3"/>
     <w:uiPriority w:val="63"/>
     <w:rsid w:val="00CB0664"/>
     <w:pPr>
@@ -3883,9 +3963,9 @@
       </w:tcPr>
     </w:tblStylePr>
   </w:style>
-  <w:style w:type="table" w:styleId="MediumShading1-Accent2">
+  <w:style w:type="table" w:styleId="1-2">
     <w:name w:val="Medium Shading 1 Accent 2"/>
-    <w:basedOn w:val="TableNormal"/>
+    <w:basedOn w:val="a3"/>
     <w:uiPriority w:val="63"/>
     <w:rsid w:val="00CB0664"/>
     <w:pPr>
@@ -3989,9 +4069,9 @@
       </w:tcPr>
     </w:tblStylePr>
   </w:style>
-  <w:style w:type="table" w:styleId="MediumShading1-Accent3">
+  <w:style w:type="table" w:styleId="1-3">
     <w:name w:val="Medium Shading 1 Accent 3"/>
-    <w:basedOn w:val="TableNormal"/>
+    <w:basedOn w:val="a3"/>
     <w:uiPriority w:val="63"/>
     <w:rsid w:val="00CB0664"/>
     <w:pPr>
@@ -4095,9 +4175,9 @@
       </w:tcPr>
     </w:tblStylePr>
   </w:style>
-  <w:style w:type="table" w:styleId="MediumShading1-Accent4">
+  <w:style w:type="table" w:styleId="1-4">
     <w:name w:val="Medium Shading 1 Accent 4"/>
-    <w:basedOn w:val="TableNormal"/>
+    <w:basedOn w:val="a3"/>
     <w:uiPriority w:val="63"/>
     <w:rsid w:val="00CB0664"/>
     <w:pPr>
@@ -4201,9 +4281,9 @@
       </w:tcPr>
     </w:tblStylePr>
   </w:style>
-  <w:style w:type="table" w:styleId="MediumShading1-Accent5">
+  <w:style w:type="table" w:styleId="1-5">
     <w:name w:val="Medium Shading 1 Accent 5"/>
-    <w:basedOn w:val="TableNormal"/>
+    <w:basedOn w:val="a3"/>
     <w:uiPriority w:val="63"/>
     <w:rsid w:val="00CB0664"/>
     <w:pPr>
@@ -4307,9 +4387,9 @@
       </w:tcPr>
     </w:tblStylePr>
   </w:style>
-  <w:style w:type="table" w:styleId="MediumShading1-Accent6">
+  <w:style w:type="table" w:styleId="1-6">
     <w:name w:val="Medium Shading 1 Accent 6"/>
-    <w:basedOn w:val="TableNormal"/>
+    <w:basedOn w:val="a3"/>
     <w:uiPriority w:val="63"/>
     <w:rsid w:val="00CB0664"/>
     <w:pPr>
@@ -4413,9 +4493,9 @@
       </w:tcPr>
     </w:tblStylePr>
   </w:style>
-  <w:style w:type="table" w:styleId="MediumShading2">
+  <w:style w:type="table" w:styleId="29">
     <w:name w:val="Medium Shading 2"/>
-    <w:basedOn w:val="TableNormal"/>
+    <w:basedOn w:val="a3"/>
     <w:uiPriority w:val="64"/>
     <w:rsid w:val="00CB0664"/>
     <w:pPr>
@@ -4562,9 +4642,9 @@
       </w:tcPr>
     </w:tblStylePr>
   </w:style>
-  <w:style w:type="table" w:styleId="MediumShading2-Accent1">
+  <w:style w:type="table" w:styleId="2-1">
     <w:name w:val="Medium Shading 2 Accent 1"/>
-    <w:basedOn w:val="TableNormal"/>
+    <w:basedOn w:val="a3"/>
     <w:uiPriority w:val="64"/>
     <w:rsid w:val="00CB0664"/>
     <w:pPr>
@@ -4711,9 +4791,9 @@
       </w:tcPr>
     </w:tblStylePr>
   </w:style>
-  <w:style w:type="table" w:styleId="MediumShading2-Accent2">
+  <w:style w:type="table" w:styleId="2-2">
     <w:name w:val="Medium Shading 2 Accent 2"/>
-    <w:basedOn w:val="TableNormal"/>
+    <w:basedOn w:val="a3"/>
     <w:uiPriority w:val="64"/>
     <w:rsid w:val="00CB0664"/>
     <w:pPr>
@@ -4860,9 +4940,9 @@
       </w:tcPr>
     </w:tblStylePr>
   </w:style>
-  <w:style w:type="table" w:styleId="MediumShading2-Accent3">
+  <w:style w:type="table" w:styleId="2-3">
     <w:name w:val="Medium Shading 2 Accent 3"/>
-    <w:basedOn w:val="TableNormal"/>
+    <w:basedOn w:val="a3"/>
     <w:uiPriority w:val="64"/>
     <w:rsid w:val="00CB0664"/>
     <w:pPr>
@@ -5009,9 +5089,9 @@
       </w:tcPr>
     </w:tblStylePr>
   </w:style>
-  <w:style w:type="table" w:styleId="MediumShading2-Accent4">
+  <w:style w:type="table" w:styleId="2-4">
     <w:name w:val="Medium Shading 2 Accent 4"/>
-    <w:basedOn w:val="TableNormal"/>
+    <w:basedOn w:val="a3"/>
     <w:uiPriority w:val="64"/>
     <w:rsid w:val="00CB0664"/>
     <w:pPr>
@@ -5158,9 +5238,9 @@
       </w:tcPr>
     </w:tblStylePr>
   </w:style>
-  <w:style w:type="table" w:styleId="MediumShading2-Accent5">
+  <w:style w:type="table" w:styleId="2-5">
     <w:name w:val="Medium Shading 2 Accent 5"/>
-    <w:basedOn w:val="TableNormal"/>
+    <w:basedOn w:val="a3"/>
     <w:uiPriority w:val="64"/>
     <w:rsid w:val="00CB0664"/>
     <w:pPr>
@@ -5307,9 +5387,9 @@
       </w:tcPr>
     </w:tblStylePr>
   </w:style>
-  <w:style w:type="table" w:styleId="MediumShading2-Accent6">
+  <w:style w:type="table" w:styleId="2-6">
     <w:name w:val="Medium Shading 2 Accent 6"/>
-    <w:basedOn w:val="TableNormal"/>
+    <w:basedOn w:val="a3"/>
     <w:uiPriority w:val="64"/>
     <w:rsid w:val="00CB0664"/>
     <w:pPr>
@@ -5456,9 +5536,9 @@
       </w:tcPr>
     </w:tblStylePr>
   </w:style>
-  <w:style w:type="table" w:styleId="MediumList1">
+  <w:style w:type="table" w:styleId="12">
     <w:name w:val="Medium List 1"/>
-    <w:basedOn w:val="TableNormal"/>
+    <w:basedOn w:val="a3"/>
     <w:uiPriority w:val="65"/>
     <w:rsid w:val="00CB0664"/>
     <w:pPr>
@@ -5540,9 +5620,9 @@
       </w:tcPr>
     </w:tblStylePr>
   </w:style>
-  <w:style w:type="table" w:styleId="MediumList1-Accent1">
+  <w:style w:type="table" w:styleId="1-10">
     <w:name w:val="Medium List 1 Accent 1"/>
-    <w:basedOn w:val="TableNormal"/>
+    <w:basedOn w:val="a3"/>
     <w:uiPriority w:val="65"/>
     <w:rsid w:val="00CB0664"/>
     <w:pPr>
@@ -5624,9 +5704,9 @@
       </w:tcPr>
     </w:tblStylePr>
   </w:style>
-  <w:style w:type="table" w:styleId="MediumList1-Accent2">
+  <w:style w:type="table" w:styleId="1-20">
     <w:name w:val="Medium List 1 Accent 2"/>
-    <w:basedOn w:val="TableNormal"/>
+    <w:basedOn w:val="a3"/>
     <w:uiPriority w:val="65"/>
     <w:rsid w:val="00CB0664"/>
     <w:pPr>
@@ -5708,9 +5788,9 @@
       </w:tcPr>
     </w:tblStylePr>
   </w:style>
-  <w:style w:type="table" w:styleId="MediumList1-Accent3">
+  <w:style w:type="table" w:styleId="1-30">
     <w:name w:val="Medium List 1 Accent 3"/>
-    <w:basedOn w:val="TableNormal"/>
+    <w:basedOn w:val="a3"/>
     <w:uiPriority w:val="65"/>
     <w:rsid w:val="00CB0664"/>
     <w:pPr>
@@ -5792,9 +5872,9 @@
       </w:tcPr>
     </w:tblStylePr>
   </w:style>
-  <w:style w:type="table" w:styleId="MediumList1-Accent4">
+  <w:style w:type="table" w:styleId="1-40">
     <w:name w:val="Medium List 1 Accent 4"/>
-    <w:basedOn w:val="TableNormal"/>
+    <w:basedOn w:val="a3"/>
     <w:uiPriority w:val="65"/>
     <w:rsid w:val="00CB0664"/>
     <w:pPr>
@@ -5876,9 +5956,9 @@
       </w:tcPr>
     </w:tblStylePr>
   </w:style>
-  <w:style w:type="table" w:styleId="MediumList1-Accent5">
+  <w:style w:type="table" w:styleId="1-50">
     <w:name w:val="Medium List 1 Accent 5"/>
-    <w:basedOn w:val="TableNormal"/>
+    <w:basedOn w:val="a3"/>
     <w:uiPriority w:val="65"/>
     <w:rsid w:val="00CB0664"/>
     <w:pPr>
@@ -5960,9 +6040,9 @@
       </w:tcPr>
     </w:tblStylePr>
   </w:style>
-  <w:style w:type="table" w:styleId="MediumList1-Accent6">
+  <w:style w:type="table" w:styleId="1-60">
     <w:name w:val="Medium List 1 Accent 6"/>
-    <w:basedOn w:val="TableNormal"/>
+    <w:basedOn w:val="a3"/>
     <w:uiPriority w:val="65"/>
     <w:rsid w:val="00CB0664"/>
     <w:pPr>
@@ -6044,9 +6124,9 @@
       </w:tcPr>
     </w:tblStylePr>
   </w:style>
-  <w:style w:type="table" w:styleId="MediumList2">
+  <w:style w:type="table" w:styleId="2a">
     <w:name w:val="Medium List 2"/>
-    <w:basedOn w:val="TableNormal"/>
+    <w:basedOn w:val="a3"/>
     <w:uiPriority w:val="66"/>
     <w:rsid w:val="00CB0664"/>
     <w:pPr>
@@ -6172,9 +6252,9 @@
       </w:tcPr>
     </w:tblStylePr>
   </w:style>
-  <w:style w:type="table" w:styleId="MediumList2-Accent1">
+  <w:style w:type="table" w:styleId="2-10">
     <w:name w:val="Medium List 2 Accent 1"/>
-    <w:basedOn w:val="TableNormal"/>
+    <w:basedOn w:val="a3"/>
     <w:uiPriority w:val="66"/>
     <w:rsid w:val="00CB0664"/>
     <w:pPr>
@@ -6300,9 +6380,9 @@
       </w:tcPr>
     </w:tblStylePr>
   </w:style>
-  <w:style w:type="table" w:styleId="MediumList2-Accent2">
+  <w:style w:type="table" w:styleId="2-20">
     <w:name w:val="Medium List 2 Accent 2"/>
-    <w:basedOn w:val="TableNormal"/>
+    <w:basedOn w:val="a3"/>
     <w:uiPriority w:val="66"/>
     <w:rsid w:val="00CB0664"/>
     <w:pPr>
@@ -6428,9 +6508,9 @@
       </w:tcPr>
     </w:tblStylePr>
   </w:style>
-  <w:style w:type="table" w:styleId="MediumList2-Accent3">
+  <w:style w:type="table" w:styleId="2-30">
     <w:name w:val="Medium List 2 Accent 3"/>
-    <w:basedOn w:val="TableNormal"/>
+    <w:basedOn w:val="a3"/>
     <w:uiPriority w:val="66"/>
     <w:rsid w:val="00CB0664"/>
     <w:pPr>
@@ -6556,9 +6636,9 @@
       </w:tcPr>
     </w:tblStylePr>
   </w:style>
-  <w:style w:type="table" w:styleId="MediumList2-Accent4">
+  <w:style w:type="table" w:styleId="2-40">
     <w:name w:val="Medium List 2 Accent 4"/>
-    <w:basedOn w:val="TableNormal"/>
+    <w:basedOn w:val="a3"/>
     <w:uiPriority w:val="66"/>
     <w:rsid w:val="00CB0664"/>
     <w:pPr>
@@ -6684,9 +6764,9 @@
       </w:tcPr>
     </w:tblStylePr>
   </w:style>
-  <w:style w:type="table" w:styleId="MediumList2-Accent5">
+  <w:style w:type="table" w:styleId="2-50">
     <w:name w:val="Medium List 2 Accent 5"/>
-    <w:basedOn w:val="TableNormal"/>
+    <w:basedOn w:val="a3"/>
     <w:uiPriority w:val="66"/>
     <w:rsid w:val="00CB0664"/>
     <w:pPr>
@@ -6812,9 +6892,9 @@
       </w:tcPr>
     </w:tblStylePr>
   </w:style>
-  <w:style w:type="table" w:styleId="MediumList2-Accent6">
+  <w:style w:type="table" w:styleId="2-60">
     <w:name w:val="Medium List 2 Accent 6"/>
-    <w:basedOn w:val="TableNormal"/>
+    <w:basedOn w:val="a3"/>
     <w:uiPriority w:val="66"/>
     <w:rsid w:val="00CB0664"/>
     <w:pPr>
@@ -6940,9 +7020,9 @@
       </w:tcPr>
     </w:tblStylePr>
   </w:style>
-  <w:style w:type="table" w:styleId="MediumGrid1">
+  <w:style w:type="table" w:styleId="13">
     <w:name w:val="Medium Grid 1"/>
-    <w:basedOn w:val="TableNormal"/>
+    <w:basedOn w:val="a3"/>
     <w:uiPriority w:val="67"/>
     <w:rsid w:val="00CB0664"/>
     <w:pPr>
@@ -7013,9 +7093,9 @@
       </w:tcPr>
     </w:tblStylePr>
   </w:style>
-  <w:style w:type="table" w:styleId="MediumGrid1-Accent1">
+  <w:style w:type="table" w:styleId="1-11">
     <w:name w:val="Medium Grid 1 Accent 1"/>
-    <w:basedOn w:val="TableNormal"/>
+    <w:basedOn w:val="a3"/>
     <w:uiPriority w:val="67"/>
     <w:rsid w:val="00CB0664"/>
     <w:pPr>
@@ -7086,9 +7166,9 @@
       </w:tcPr>
     </w:tblStylePr>
   </w:style>
-  <w:style w:type="table" w:styleId="MediumGrid1-Accent2">
+  <w:style w:type="table" w:styleId="1-21">
     <w:name w:val="Medium Grid 1 Accent 2"/>
-    <w:basedOn w:val="TableNormal"/>
+    <w:basedOn w:val="a3"/>
     <w:uiPriority w:val="67"/>
     <w:rsid w:val="00CB0664"/>
     <w:pPr>
@@ -7159,9 +7239,9 @@
       </w:tcPr>
     </w:tblStylePr>
   </w:style>
-  <w:style w:type="table" w:styleId="MediumGrid1-Accent3">
+  <w:style w:type="table" w:styleId="1-31">
     <w:name w:val="Medium Grid 1 Accent 3"/>
-    <w:basedOn w:val="TableNormal"/>
+    <w:basedOn w:val="a3"/>
     <w:uiPriority w:val="67"/>
     <w:rsid w:val="00CB0664"/>
     <w:pPr>
@@ -7232,9 +7312,9 @@
       </w:tcPr>
     </w:tblStylePr>
   </w:style>
-  <w:style w:type="table" w:styleId="MediumGrid1-Accent4">
+  <w:style w:type="table" w:styleId="1-41">
     <w:name w:val="Medium Grid 1 Accent 4"/>
-    <w:basedOn w:val="TableNormal"/>
+    <w:basedOn w:val="a3"/>
     <w:uiPriority w:val="67"/>
     <w:rsid w:val="00CB0664"/>
     <w:pPr>
@@ -7305,9 +7385,9 @@
       </w:tcPr>
     </w:tblStylePr>
   </w:style>
-  <w:style w:type="table" w:styleId="MediumGrid1-Accent5">
+  <w:style w:type="table" w:styleId="1-51">
     <w:name w:val="Medium Grid 1 Accent 5"/>
-    <w:basedOn w:val="TableNormal"/>
+    <w:basedOn w:val="a3"/>
     <w:uiPriority w:val="67"/>
     <w:rsid w:val="00CB0664"/>
     <w:pPr>
@@ -7378,9 +7458,9 @@
       </w:tcPr>
     </w:tblStylePr>
   </w:style>
-  <w:style w:type="table" w:styleId="MediumGrid1-Accent6">
+  <w:style w:type="table" w:styleId="1-61">
     <w:name w:val="Medium Grid 1 Accent 6"/>
-    <w:basedOn w:val="TableNormal"/>
+    <w:basedOn w:val="a3"/>
     <w:uiPriority w:val="67"/>
     <w:rsid w:val="00CB0664"/>
     <w:pPr>
@@ -7451,9 +7531,9 @@
       </w:tcPr>
     </w:tblStylePr>
   </w:style>
-  <w:style w:type="table" w:styleId="MediumGrid2">
+  <w:style w:type="table" w:styleId="2b">
     <w:name w:val="Medium Grid 2"/>
-    <w:basedOn w:val="TableNormal"/>
+    <w:basedOn w:val="a3"/>
     <w:uiPriority w:val="68"/>
     <w:rsid w:val="00CB0664"/>
     <w:pPr>
@@ -7576,9 +7656,9 @@
       </w:tcPr>
     </w:tblStylePr>
   </w:style>
-  <w:style w:type="table" w:styleId="MediumGrid2-Accent1">
+  <w:style w:type="table" w:styleId="2-11">
     <w:name w:val="Medium Grid 2 Accent 1"/>
-    <w:basedOn w:val="TableNormal"/>
+    <w:basedOn w:val="a3"/>
     <w:uiPriority w:val="68"/>
     <w:rsid w:val="00CB0664"/>
     <w:pPr>
@@ -7701,9 +7781,9 @@
       </w:tcPr>
     </w:tblStylePr>
   </w:style>
-  <w:style w:type="table" w:styleId="MediumGrid2-Accent2">
+  <w:style w:type="table" w:styleId="2-21">
     <w:name w:val="Medium Grid 2 Accent 2"/>
-    <w:basedOn w:val="TableNormal"/>
+    <w:basedOn w:val="a3"/>
     <w:uiPriority w:val="68"/>
     <w:rsid w:val="00CB0664"/>
     <w:pPr>
@@ -7826,9 +7906,9 @@
       </w:tcPr>
     </w:tblStylePr>
   </w:style>
-  <w:style w:type="table" w:styleId="MediumGrid2-Accent3">
+  <w:style w:type="table" w:styleId="2-31">
     <w:name w:val="Medium Grid 2 Accent 3"/>
-    <w:basedOn w:val="TableNormal"/>
+    <w:basedOn w:val="a3"/>
     <w:uiPriority w:val="68"/>
     <w:rsid w:val="00CB0664"/>
     <w:pPr>
@@ -7951,9 +8031,9 @@
       </w:tcPr>
     </w:tblStylePr>
   </w:style>
-  <w:style w:type="table" w:styleId="MediumGrid2-Accent4">
+  <w:style w:type="table" w:styleId="2-41">
     <w:name w:val="Medium Grid 2 Accent 4"/>
-    <w:basedOn w:val="TableNormal"/>
+    <w:basedOn w:val="a3"/>
     <w:uiPriority w:val="68"/>
     <w:rsid w:val="00CB0664"/>
     <w:pPr>
@@ -8076,9 +8156,9 @@
       </w:tcPr>
     </w:tblStylePr>
   </w:style>
-  <w:style w:type="table" w:styleId="MediumGrid2-Accent5">
+  <w:style w:type="table" w:styleId="2-51">
     <w:name w:val="Medium Grid 2 Accent 5"/>
-    <w:basedOn w:val="TableNormal"/>
+    <w:basedOn w:val="a3"/>
     <w:uiPriority w:val="68"/>
     <w:rsid w:val="00CB0664"/>
     <w:pPr>
@@ -8201,9 +8281,9 @@
       </w:tcPr>
     </w:tblStylePr>
   </w:style>
-  <w:style w:type="table" w:styleId="MediumGrid2-Accent6">
+  <w:style w:type="table" w:styleId="2-61">
     <w:name w:val="Medium Grid 2 Accent 6"/>
-    <w:basedOn w:val="TableNormal"/>
+    <w:basedOn w:val="a3"/>
     <w:uiPriority w:val="68"/>
     <w:rsid w:val="00CB0664"/>
     <w:pPr>
@@ -8326,9 +8406,9 @@
       </w:tcPr>
     </w:tblStylePr>
   </w:style>
-  <w:style w:type="table" w:styleId="MediumGrid3">
+  <w:style w:type="table" w:styleId="37">
     <w:name w:val="Medium Grid 3"/>
-    <w:basedOn w:val="TableNormal"/>
+    <w:basedOn w:val="a3"/>
     <w:uiPriority w:val="69"/>
     <w:rsid w:val="00CB0664"/>
     <w:pPr>
@@ -8467,9 +8547,9 @@
       </w:tcPr>
     </w:tblStylePr>
   </w:style>
-  <w:style w:type="table" w:styleId="MediumGrid3-Accent1">
+  <w:style w:type="table" w:styleId="3-1">
     <w:name w:val="Medium Grid 3 Accent 1"/>
-    <w:basedOn w:val="TableNormal"/>
+    <w:basedOn w:val="a3"/>
     <w:uiPriority w:val="69"/>
     <w:rsid w:val="00CB0664"/>
     <w:pPr>
@@ -8608,9 +8688,9 @@
       </w:tcPr>
     </w:tblStylePr>
   </w:style>
-  <w:style w:type="table" w:styleId="MediumGrid3-Accent2">
+  <w:style w:type="table" w:styleId="3-2">
     <w:name w:val="Medium Grid 3 Accent 2"/>
-    <w:basedOn w:val="TableNormal"/>
+    <w:basedOn w:val="a3"/>
     <w:uiPriority w:val="69"/>
     <w:rsid w:val="00CB0664"/>
     <w:pPr>
@@ -8749,9 +8829,9 @@
       </w:tcPr>
     </w:tblStylePr>
   </w:style>
-  <w:style w:type="table" w:styleId="MediumGrid3-Accent3">
+  <w:style w:type="table" w:styleId="3-3">
     <w:name w:val="Medium Grid 3 Accent 3"/>
-    <w:basedOn w:val="TableNormal"/>
+    <w:basedOn w:val="a3"/>
     <w:uiPriority w:val="69"/>
     <w:rsid w:val="00CB0664"/>
     <w:pPr>
@@ -8890,9 +8970,9 @@
       </w:tcPr>
     </w:tblStylePr>
   </w:style>
-  <w:style w:type="table" w:styleId="MediumGrid3-Accent4">
+  <w:style w:type="table" w:styleId="3-4">
     <w:name w:val="Medium Grid 3 Accent 4"/>
-    <w:basedOn w:val="TableNormal"/>
+    <w:basedOn w:val="a3"/>
     <w:uiPriority w:val="69"/>
     <w:rsid w:val="00CB0664"/>
     <w:pPr>
@@ -9031,9 +9111,9 @@
       </w:tcPr>
     </w:tblStylePr>
   </w:style>
-  <w:style w:type="table" w:styleId="MediumGrid3-Accent5">
+  <w:style w:type="table" w:styleId="3-5">
     <w:name w:val="Medium Grid 3 Accent 5"/>
-    <w:basedOn w:val="TableNormal"/>
+    <w:basedOn w:val="a3"/>
     <w:uiPriority w:val="69"/>
     <w:rsid w:val="00CB0664"/>
     <w:pPr>
@@ -9172,9 +9252,9 @@
       </w:tcPr>
     </w:tblStylePr>
   </w:style>
-  <w:style w:type="table" w:styleId="MediumGrid3-Accent6">
+  <w:style w:type="table" w:styleId="3-6">
     <w:name w:val="Medium Grid 3 Accent 6"/>
-    <w:basedOn w:val="TableNormal"/>
+    <w:basedOn w:val="a3"/>
     <w:uiPriority w:val="69"/>
     <w:rsid w:val="00CB0664"/>
     <w:pPr>
@@ -9313,9 +9393,9 @@
       </w:tcPr>
     </w:tblStylePr>
   </w:style>
-  <w:style w:type="table" w:styleId="DarkList">
+  <w:style w:type="table" w:styleId="aff4">
     <w:name w:val="Dark List"/>
-    <w:basedOn w:val="TableNormal"/>
+    <w:basedOn w:val="a3"/>
     <w:uiPriority w:val="70"/>
     <w:rsid w:val="00CB0664"/>
     <w:pPr>
@@ -9427,9 +9507,9 @@
       </w:tcPr>
     </w:tblStylePr>
   </w:style>
-  <w:style w:type="table" w:styleId="DarkList-Accent1">
+  <w:style w:type="table" w:styleId="-12">
     <w:name w:val="Dark List Accent 1"/>
-    <w:basedOn w:val="TableNormal"/>
+    <w:basedOn w:val="a3"/>
     <w:uiPriority w:val="70"/>
     <w:rsid w:val="00CB0664"/>
     <w:pPr>
@@ -9541,9 +9621,9 @@
       </w:tcPr>
     </w:tblStylePr>
   </w:style>
-  <w:style w:type="table" w:styleId="DarkList-Accent2">
+  <w:style w:type="table" w:styleId="-22">
     <w:name w:val="Dark List Accent 2"/>
-    <w:basedOn w:val="TableNormal"/>
+    <w:basedOn w:val="a3"/>
     <w:uiPriority w:val="70"/>
     <w:rsid w:val="00CB0664"/>
     <w:pPr>
@@ -9655,9 +9735,9 @@
       </w:tcPr>
     </w:tblStylePr>
   </w:style>
-  <w:style w:type="table" w:styleId="DarkList-Accent3">
+  <w:style w:type="table" w:styleId="-32">
     <w:name w:val="Dark List Accent 3"/>
-    <w:basedOn w:val="TableNormal"/>
+    <w:basedOn w:val="a3"/>
     <w:uiPriority w:val="70"/>
     <w:rsid w:val="00CB0664"/>
     <w:pPr>
@@ -9769,9 +9849,9 @@
       </w:tcPr>
     </w:tblStylePr>
   </w:style>
-  <w:style w:type="table" w:styleId="DarkList-Accent4">
+  <w:style w:type="table" w:styleId="-42">
     <w:name w:val="Dark List Accent 4"/>
-    <w:basedOn w:val="TableNormal"/>
+    <w:basedOn w:val="a3"/>
     <w:uiPriority w:val="70"/>
     <w:rsid w:val="00CB0664"/>
     <w:pPr>
@@ -9883,9 +9963,9 @@
       </w:tcPr>
     </w:tblStylePr>
   </w:style>
-  <w:style w:type="table" w:styleId="DarkList-Accent5">
+  <w:style w:type="table" w:styleId="-52">
     <w:name w:val="Dark List Accent 5"/>
-    <w:basedOn w:val="TableNormal"/>
+    <w:basedOn w:val="a3"/>
     <w:uiPriority w:val="70"/>
     <w:rsid w:val="00CB0664"/>
     <w:pPr>
@@ -9997,9 +10077,9 @@
       </w:tcPr>
     </w:tblStylePr>
   </w:style>
-  <w:style w:type="table" w:styleId="DarkList-Accent6">
+  <w:style w:type="table" w:styleId="-62">
     <w:name w:val="Dark List Accent 6"/>
-    <w:basedOn w:val="TableNormal"/>
+    <w:basedOn w:val="a3"/>
     <w:uiPriority w:val="70"/>
     <w:rsid w:val="00CB0664"/>
     <w:pPr>
@@ -10111,9 +10191,9 @@
       </w:tcPr>
     </w:tblStylePr>
   </w:style>
-  <w:style w:type="table" w:styleId="ColorfulShading">
+  <w:style w:type="table" w:styleId="aff5">
     <w:name w:val="Colorful Shading"/>
-    <w:basedOn w:val="TableNormal"/>
+    <w:basedOn w:val="a3"/>
     <w:uiPriority w:val="71"/>
     <w:rsid w:val="00CB0664"/>
     <w:pPr>
@@ -10233,9 +10313,9 @@
       </w:rPr>
     </w:tblStylePr>
   </w:style>
-  <w:style w:type="table" w:styleId="ColorfulShading-Accent1">
+  <w:style w:type="table" w:styleId="-13">
     <w:name w:val="Colorful Shading Accent 1"/>
-    <w:basedOn w:val="TableNormal"/>
+    <w:basedOn w:val="a3"/>
     <w:uiPriority w:val="71"/>
     <w:rsid w:val="00CB0664"/>
     <w:pPr>
@@ -10355,9 +10435,9 @@
       </w:rPr>
     </w:tblStylePr>
   </w:style>
-  <w:style w:type="table" w:styleId="ColorfulShading-Accent2">
+  <w:style w:type="table" w:styleId="-23">
     <w:name w:val="Colorful Shading Accent 2"/>
-    <w:basedOn w:val="TableNormal"/>
+    <w:basedOn w:val="a3"/>
     <w:uiPriority w:val="71"/>
     <w:rsid w:val="00CB0664"/>
     <w:pPr>
@@ -10477,9 +10557,9 @@
       </w:rPr>
     </w:tblStylePr>
   </w:style>
-  <w:style w:type="table" w:styleId="ColorfulShading-Accent3">
+  <w:style w:type="table" w:styleId="-33">
     <w:name w:val="Colorful Shading Accent 3"/>
-    <w:basedOn w:val="TableNormal"/>
+    <w:basedOn w:val="a3"/>
     <w:uiPriority w:val="71"/>
     <w:rsid w:val="00CB0664"/>
     <w:pPr>
@@ -10589,9 +10669,9 @@
       </w:tcPr>
     </w:tblStylePr>
   </w:style>
-  <w:style w:type="table" w:styleId="ColorfulShading-Accent4">
+  <w:style w:type="table" w:styleId="-43">
     <w:name w:val="Colorful Shading Accent 4"/>
-    <w:basedOn w:val="TableNormal"/>
+    <w:basedOn w:val="a3"/>
     <w:uiPriority w:val="71"/>
     <w:rsid w:val="00CB0664"/>
     <w:pPr>
@@ -10711,9 +10791,9 @@
       </w:rPr>
     </w:tblStylePr>
   </w:style>
-  <w:style w:type="table" w:styleId="ColorfulShading-Accent5">
+  <w:style w:type="table" w:styleId="-53">
     <w:name w:val="Colorful Shading Accent 5"/>
-    <w:basedOn w:val="TableNormal"/>
+    <w:basedOn w:val="a3"/>
     <w:uiPriority w:val="71"/>
     <w:rsid w:val="00CB0664"/>
     <w:pPr>
@@ -10833,9 +10913,9 @@
       </w:rPr>
     </w:tblStylePr>
   </w:style>
-  <w:style w:type="table" w:styleId="ColorfulShading-Accent6">
+  <w:style w:type="table" w:styleId="-63">
     <w:name w:val="Colorful Shading Accent 6"/>
-    <w:basedOn w:val="TableNormal"/>
+    <w:basedOn w:val="a3"/>
     <w:uiPriority w:val="71"/>
     <w:rsid w:val="00CB0664"/>
     <w:pPr>
@@ -10955,9 +11035,9 @@
       </w:rPr>
     </w:tblStylePr>
   </w:style>
-  <w:style w:type="table" w:styleId="ColorfulList">
+  <w:style w:type="table" w:styleId="aff6">
     <w:name w:val="Colorful List"/>
-    <w:basedOn w:val="TableNormal"/>
+    <w:basedOn w:val="a3"/>
     <w:uiPriority w:val="72"/>
     <w:rsid w:val="00CB0664"/>
     <w:pPr>
@@ -11041,9 +11121,9 @@
       </w:tcPr>
     </w:tblStylePr>
   </w:style>
-  <w:style w:type="table" w:styleId="ColorfulList-Accent1">
+  <w:style w:type="table" w:styleId="-14">
     <w:name w:val="Colorful List Accent 1"/>
-    <w:basedOn w:val="TableNormal"/>
+    <w:basedOn w:val="a3"/>
     <w:uiPriority w:val="72"/>
     <w:rsid w:val="00CB0664"/>
     <w:pPr>
@@ -11127,9 +11207,9 @@
       </w:tcPr>
     </w:tblStylePr>
   </w:style>
-  <w:style w:type="table" w:styleId="ColorfulList-Accent2">
+  <w:style w:type="table" w:styleId="-24">
     <w:name w:val="Colorful List Accent 2"/>
-    <w:basedOn w:val="TableNormal"/>
+    <w:basedOn w:val="a3"/>
     <w:uiPriority w:val="72"/>
     <w:rsid w:val="00CB0664"/>
     <w:pPr>
@@ -11213,9 +11293,9 @@
       </w:tcPr>
     </w:tblStylePr>
   </w:style>
-  <w:style w:type="table" w:styleId="ColorfulList-Accent3">
+  <w:style w:type="table" w:styleId="-34">
     <w:name w:val="Colorful List Accent 3"/>
-    <w:basedOn w:val="TableNormal"/>
+    <w:basedOn w:val="a3"/>
     <w:uiPriority w:val="72"/>
     <w:rsid w:val="00CB0664"/>
     <w:pPr>
@@ -11299,9 +11379,9 @@
       </w:tcPr>
     </w:tblStylePr>
   </w:style>
-  <w:style w:type="table" w:styleId="ColorfulList-Accent4">
+  <w:style w:type="table" w:styleId="-44">
     <w:name w:val="Colorful List Accent 4"/>
-    <w:basedOn w:val="TableNormal"/>
+    <w:basedOn w:val="a3"/>
     <w:uiPriority w:val="72"/>
     <w:rsid w:val="00CB0664"/>
     <w:pPr>
@@ -11385,9 +11465,9 @@
       </w:tcPr>
     </w:tblStylePr>
   </w:style>
-  <w:style w:type="table" w:styleId="ColorfulList-Accent5">
+  <w:style w:type="table" w:styleId="-54">
     <w:name w:val="Colorful List Accent 5"/>
-    <w:basedOn w:val="TableNormal"/>
+    <w:basedOn w:val="a3"/>
     <w:uiPriority w:val="72"/>
     <w:rsid w:val="00CB0664"/>
     <w:pPr>
@@ -11471,9 +11551,9 @@
       </w:tcPr>
     </w:tblStylePr>
   </w:style>
-  <w:style w:type="table" w:styleId="ColorfulList-Accent6">
+  <w:style w:type="table" w:styleId="-64">
     <w:name w:val="Colorful List Accent 6"/>
-    <w:basedOn w:val="TableNormal"/>
+    <w:basedOn w:val="a3"/>
     <w:uiPriority w:val="72"/>
     <w:rsid w:val="00CB0664"/>
     <w:pPr>
@@ -11557,9 +11637,9 @@
       </w:tcPr>
     </w:tblStylePr>
   </w:style>
-  <w:style w:type="table" w:styleId="ColorfulGrid">
+  <w:style w:type="table" w:styleId="aff7">
     <w:name w:val="Colorful Grid"/>
-    <w:basedOn w:val="TableNormal"/>
+    <w:basedOn w:val="a3"/>
     <w:uiPriority w:val="73"/>
     <w:rsid w:val="00CB0664"/>
     <w:pPr>
@@ -11637,9 +11717,9 @@
       </w:tcPr>
     </w:tblStylePr>
   </w:style>
-  <w:style w:type="table" w:styleId="ColorfulGrid-Accent1">
+  <w:style w:type="table" w:styleId="-15">
     <w:name w:val="Colorful Grid Accent 1"/>
-    <w:basedOn w:val="TableNormal"/>
+    <w:basedOn w:val="a3"/>
     <w:uiPriority w:val="73"/>
     <w:rsid w:val="00CB0664"/>
     <w:pPr>
@@ -11717,9 +11797,9 @@
       </w:tcPr>
     </w:tblStylePr>
   </w:style>
-  <w:style w:type="table" w:styleId="ColorfulGrid-Accent2">
+  <w:style w:type="table" w:styleId="-25">
     <w:name w:val="Colorful Grid Accent 2"/>
-    <w:basedOn w:val="TableNormal"/>
+    <w:basedOn w:val="a3"/>
     <w:uiPriority w:val="73"/>
     <w:rsid w:val="00CB0664"/>
     <w:pPr>
@@ -11797,9 +11877,9 @@
       </w:tcPr>
     </w:tblStylePr>
   </w:style>
-  <w:style w:type="table" w:styleId="ColorfulGrid-Accent3">
+  <w:style w:type="table" w:styleId="-35">
     <w:name w:val="Colorful Grid Accent 3"/>
-    <w:basedOn w:val="TableNormal"/>
+    <w:basedOn w:val="a3"/>
     <w:uiPriority w:val="73"/>
     <w:rsid w:val="00CB0664"/>
     <w:pPr>
@@ -11877,9 +11957,9 @@
       </w:tcPr>
     </w:tblStylePr>
   </w:style>
-  <w:style w:type="table" w:styleId="ColorfulGrid-Accent4">
+  <w:style w:type="table" w:styleId="-45">
     <w:name w:val="Colorful Grid Accent 4"/>
-    <w:basedOn w:val="TableNormal"/>
+    <w:basedOn w:val="a3"/>
     <w:uiPriority w:val="73"/>
     <w:rsid w:val="00CB0664"/>
     <w:pPr>
@@ -11957,9 +12037,9 @@
       </w:tcPr>
     </w:tblStylePr>
   </w:style>
-  <w:style w:type="table" w:styleId="ColorfulGrid-Accent5">
+  <w:style w:type="table" w:styleId="-55">
     <w:name w:val="Colorful Grid Accent 5"/>
-    <w:basedOn w:val="TableNormal"/>
+    <w:basedOn w:val="a3"/>
     <w:uiPriority w:val="73"/>
     <w:rsid w:val="00CB0664"/>
     <w:pPr>
@@ -12037,9 +12117,9 @@
       </w:tcPr>
     </w:tblStylePr>
   </w:style>
-  <w:style w:type="table" w:styleId="ColorfulGrid-Accent6">
+  <w:style w:type="table" w:styleId="-65">
     <w:name w:val="Colorful Grid Accent 6"/>
-    <w:basedOn w:val="TableNormal"/>
+    <w:basedOn w:val="a3"/>
     <w:uiPriority w:val="73"/>
     <w:rsid w:val="00CB0664"/>
     <w:pPr>
@@ -12121,7 +12201,7 @@
 </file>
 
 <file path=word/stylesWithEffects.xml><?xml version="1.0" encoding="utf-8"?>
-<w:styles xmlns:wpc="http://schemas.microsoft.com/office/word/2010/wordprocessingCanvas" xmlns:mo="http://schemas.microsoft.com/office/mac/office/2008/main" xmlns:mc="http://schemas.openxmlformats.org/markup-compatibility/2006" xmlns:mv="urn:schemas-microsoft-com:mac:vml" xmlns:o="urn:schemas-microsoft-com:office:office" xmlns:r="http://schemas.openxmlformats.org/officeDocument/2006/relationships" xmlns:m="http://schemas.openxmlformats.org/officeDocument/2006/math" xmlns:v="urn:schemas-microsoft-com:vml" xmlns:wp14="http://schemas.microsoft.com/office/word/2010/wordprocessingDrawing" xmlns:wp="http://schemas.openxmlformats.org/drawingml/2006/wordprocessingDrawing" xmlns:w10="urn:schemas-microsoft-com:office:word" xmlns:w="http://schemas.openxmlformats.org/wordprocessingml/2006/main" xmlns:w14="http://schemas.microsoft.com/office/word/2010/wordml" xmlns:wpg="http://schemas.microsoft.com/office/word/2010/wordprocessingGroup" xmlns:wpi="http://schemas.microsoft.com/office/word/2010/wordprocessingInk" xmlns:wne="http://schemas.microsoft.com/office/word/2006/wordml" xmlns:wps="http://schemas.microsoft.com/office/word/2010/wordprocessingShape" mc:Ignorable="w14 wp14">
+<w:styles xmlns:wpc="http://schemas.microsoft.com/office/word/2010/wordprocessingCanvas" xmlns:mc="http://schemas.openxmlformats.org/markup-compatibility/2006" xmlns:o="urn:schemas-microsoft-com:office:office" xmlns:r="http://schemas.openxmlformats.org/officeDocument/2006/relationships" xmlns:m="http://schemas.openxmlformats.org/officeDocument/2006/math" xmlns:v="urn:schemas-microsoft-com:vml" xmlns:wp14="http://schemas.microsoft.com/office/word/2010/wordprocessingDrawing" xmlns:wp="http://schemas.openxmlformats.org/drawingml/2006/wordprocessingDrawing" xmlns:w10="urn:schemas-microsoft-com:office:word" xmlns:w="http://schemas.openxmlformats.org/wordprocessingml/2006/main" xmlns:w14="http://schemas.microsoft.com/office/word/2010/wordml" xmlns:wpg="http://schemas.microsoft.com/office/word/2010/wordprocessingGroup" xmlns:wpi="http://schemas.microsoft.com/office/word/2010/wordprocessingInk" xmlns:wne="http://schemas.microsoft.com/office/word/2006/wordml" xmlns:wps="http://schemas.microsoft.com/office/word/2010/wordprocessingShape" mc:Ignorable="w14 wp14">
   <w:docDefaults>
     <w:rPrDefault>
       <w:rPr>
@@ -12137,7 +12217,7 @@
       </w:pPr>
     </w:pPrDefault>
   </w:docDefaults>
-  <w:latentStyles w:defLockedState="0" w:defUIPriority="99" w:defSemiHidden="1" w:defUnhideWhenUsed="1" w:defQFormat="0" w:count="276">
+  <w:latentStyles w:defLockedState="0" w:defUIPriority="99" w:defSemiHidden="1" w:defUnhideWhenUsed="1" w:defQFormat="0" w:count="267">
     <w:lsdException w:name="Normal" w:semiHidden="0" w:uiPriority="0" w:unhideWhenUsed="0" w:qFormat="1"/>
     <w:lsdException w:name="heading 1" w:semiHidden="0" w:uiPriority="9" w:unhideWhenUsed="0" w:qFormat="1"/>
     <w:lsdException w:name="heading 2" w:uiPriority="9" w:qFormat="1"/>
@@ -12276,16 +12356,16 @@
     <w:lsdException w:name="Bibliography" w:uiPriority="37"/>
     <w:lsdException w:name="TOC Heading" w:uiPriority="39" w:qFormat="1"/>
   </w:latentStyles>
-  <w:style w:type="paragraph" w:default="1" w:styleId="Normal">
+  <w:style w:type="paragraph" w:default="1" w:styleId="a1">
     <w:name w:val="Normal"/>
     <w:qFormat/>
     <w:rsid w:val="00FC693F"/>
   </w:style>
-  <w:style w:type="paragraph" w:styleId="Heading1">
+  <w:style w:type="paragraph" w:styleId="1">
     <w:name w:val="heading 1"/>
-    <w:basedOn w:val="Normal"/>
-    <w:next w:val="Normal"/>
-    <w:link w:val="Heading1Char"/>
+    <w:basedOn w:val="a1"/>
+    <w:next w:val="a1"/>
+    <w:link w:val="10"/>
     <w:uiPriority w:val="9"/>
     <w:qFormat/>
     <w:rsid w:val="00FC693F"/>
@@ -12304,11 +12384,11 @@
       <w:szCs w:val="28"/>
     </w:rPr>
   </w:style>
-  <w:style w:type="paragraph" w:styleId="Heading2">
+  <w:style w:type="paragraph" w:styleId="21">
     <w:name w:val="heading 2"/>
-    <w:basedOn w:val="Normal"/>
-    <w:next w:val="Normal"/>
-    <w:link w:val="Heading2Char"/>
+    <w:basedOn w:val="a1"/>
+    <w:next w:val="a1"/>
+    <w:link w:val="22"/>
     <w:uiPriority w:val="9"/>
     <w:unhideWhenUsed/>
     <w:qFormat/>
@@ -12328,11 +12408,11 @@
       <w:szCs w:val="26"/>
     </w:rPr>
   </w:style>
-  <w:style w:type="paragraph" w:styleId="Heading3">
+  <w:style w:type="paragraph" w:styleId="31">
     <w:name w:val="heading 3"/>
-    <w:basedOn w:val="Normal"/>
-    <w:next w:val="Normal"/>
-    <w:link w:val="Heading3Char"/>
+    <w:basedOn w:val="a1"/>
+    <w:next w:val="a1"/>
+    <w:link w:val="32"/>
     <w:uiPriority w:val="9"/>
     <w:unhideWhenUsed/>
     <w:qFormat/>
@@ -12350,11 +12430,11 @@
       <w:color w:val="4F81BD" w:themeColor="accent1"/>
     </w:rPr>
   </w:style>
-  <w:style w:type="paragraph" w:styleId="Heading4">
+  <w:style w:type="paragraph" w:styleId="4">
     <w:name w:val="heading 4"/>
-    <w:basedOn w:val="Normal"/>
-    <w:next w:val="Normal"/>
-    <w:link w:val="Heading4Char"/>
+    <w:basedOn w:val="a1"/>
+    <w:next w:val="a1"/>
+    <w:link w:val="40"/>
     <w:uiPriority w:val="9"/>
     <w:semiHidden/>
     <w:unhideWhenUsed/>
@@ -12375,11 +12455,11 @@
       <w:color w:val="4F81BD" w:themeColor="accent1"/>
     </w:rPr>
   </w:style>
-  <w:style w:type="paragraph" w:styleId="Heading5">
+  <w:style w:type="paragraph" w:styleId="5">
     <w:name w:val="heading 5"/>
-    <w:basedOn w:val="Normal"/>
-    <w:next w:val="Normal"/>
-    <w:link w:val="Heading5Char"/>
+    <w:basedOn w:val="a1"/>
+    <w:next w:val="a1"/>
+    <w:link w:val="50"/>
     <w:uiPriority w:val="9"/>
     <w:semiHidden/>
     <w:unhideWhenUsed/>
@@ -12396,11 +12476,11 @@
       <w:color w:val="243F60" w:themeColor="accent1" w:themeShade="7F"/>
     </w:rPr>
   </w:style>
-  <w:style w:type="paragraph" w:styleId="Heading6">
+  <w:style w:type="paragraph" w:styleId="6">
     <w:name w:val="heading 6"/>
-    <w:basedOn w:val="Normal"/>
-    <w:next w:val="Normal"/>
-    <w:link w:val="Heading6Char"/>
+    <w:basedOn w:val="a1"/>
+    <w:next w:val="a1"/>
+    <w:link w:val="60"/>
     <w:uiPriority w:val="9"/>
     <w:semiHidden/>
     <w:unhideWhenUsed/>
@@ -12419,11 +12499,11 @@
       <w:color w:val="243F60" w:themeColor="accent1" w:themeShade="7F"/>
     </w:rPr>
   </w:style>
-  <w:style w:type="paragraph" w:styleId="Heading7">
+  <w:style w:type="paragraph" w:styleId="7">
     <w:name w:val="heading 7"/>
-    <w:basedOn w:val="Normal"/>
-    <w:next w:val="Normal"/>
-    <w:link w:val="Heading7Char"/>
+    <w:basedOn w:val="a1"/>
+    <w:next w:val="a1"/>
+    <w:link w:val="70"/>
     <w:uiPriority w:val="9"/>
     <w:semiHidden/>
     <w:unhideWhenUsed/>
@@ -12442,11 +12522,11 @@
       <w:color w:val="404040" w:themeColor="text1" w:themeTint="BF"/>
     </w:rPr>
   </w:style>
-  <w:style w:type="paragraph" w:styleId="Heading8">
+  <w:style w:type="paragraph" w:styleId="8">
     <w:name w:val="heading 8"/>
-    <w:basedOn w:val="Normal"/>
-    <w:next w:val="Normal"/>
-    <w:link w:val="Heading8Char"/>
+    <w:basedOn w:val="a1"/>
+    <w:next w:val="a1"/>
+    <w:link w:val="80"/>
     <w:uiPriority w:val="9"/>
     <w:semiHidden/>
     <w:unhideWhenUsed/>
@@ -12465,11 +12545,11 @@
       <w:szCs w:val="20"/>
     </w:rPr>
   </w:style>
-  <w:style w:type="paragraph" w:styleId="Heading9">
+  <w:style w:type="paragraph" w:styleId="9">
     <w:name w:val="heading 9"/>
-    <w:basedOn w:val="Normal"/>
-    <w:next w:val="Normal"/>
-    <w:link w:val="Heading9Char"/>
+    <w:basedOn w:val="a1"/>
+    <w:next w:val="a1"/>
+    <w:link w:val="90"/>
     <w:uiPriority w:val="9"/>
     <w:semiHidden/>
     <w:unhideWhenUsed/>
@@ -12490,13 +12570,13 @@
       <w:szCs w:val="20"/>
     </w:rPr>
   </w:style>
-  <w:style w:type="character" w:default="1" w:styleId="DefaultParagraphFont">
+  <w:style w:type="character" w:default="1" w:styleId="a2">
     <w:name w:val="Default Paragraph Font"/>
     <w:uiPriority w:val="1"/>
     <w:semiHidden/>
     <w:unhideWhenUsed/>
   </w:style>
-  <w:style w:type="table" w:default="1" w:styleId="TableNormal">
+  <w:style w:type="table" w:default="1" w:styleId="a3">
     <w:name w:val="Normal Table"/>
     <w:uiPriority w:val="99"/>
     <w:semiHidden/>
@@ -12511,13 +12591,57 @@
       </w:tblCellMar>
     </w:tblPr>
   </w:style>
-  <w:style w:type="numbering" w:default="1" w:styleId="NoList">
+  <w:style w:type="numbering" w:default="1" w:styleId="a4">
     <w:name w:val="No List"/>
     <w:uiPriority w:val="99"/>
     <w:semiHidden/>
     <w:unhideWhenUsed/>
   </w:style>
-  <w:style w:type="paragraph" w:styleId="NoSpacing">
+  <w:style w:type="paragraph" w:styleId="a5">
+    <w:name w:val="header"/>
+    <w:basedOn w:val="a1"/>
+    <w:link w:val="a6"/>
+    <w:uiPriority w:val="99"/>
+    <w:unhideWhenUsed/>
+    <w:rsid w:val="00E618BF"/>
+    <w:pPr>
+      <w:tabs>
+        <w:tab w:val="center" w:pos="4680"/>
+        <w:tab w:val="right" w:pos="9360"/>
+      </w:tabs>
+      <w:spacing w:after="0" w:line="240" w:lineRule="auto"/>
+    </w:pPr>
+  </w:style>
+  <w:style w:type="character" w:customStyle="1" w:styleId="a6">
+    <w:name w:val="Верхний колонтитул Знак"/>
+    <w:basedOn w:val="a2"/>
+    <w:link w:val="a5"/>
+    <w:uiPriority w:val="99"/>
+    <w:rsid w:val="00E618BF"/>
+  </w:style>
+  <w:style w:type="paragraph" w:styleId="a7">
+    <w:name w:val="footer"/>
+    <w:basedOn w:val="a1"/>
+    <w:link w:val="a8"/>
+    <w:uiPriority w:val="99"/>
+    <w:unhideWhenUsed/>
+    <w:rsid w:val="00E618BF"/>
+    <w:pPr>
+      <w:tabs>
+        <w:tab w:val="center" w:pos="4680"/>
+        <w:tab w:val="right" w:pos="9360"/>
+      </w:tabs>
+      <w:spacing w:after="0" w:line="240" w:lineRule="auto"/>
+    </w:pPr>
+  </w:style>
+  <w:style w:type="character" w:customStyle="1" w:styleId="a8">
+    <w:name w:val="Нижний колонтитул Знак"/>
+    <w:basedOn w:val="a2"/>
+    <w:link w:val="a7"/>
+    <w:uiPriority w:val="99"/>
+    <w:rsid w:val="00E618BF"/>
+  </w:style>
+  <w:style w:type="paragraph" w:styleId="a9">
     <w:name w:val="No Spacing"/>
     <w:uiPriority w:val="1"/>
     <w:qFormat/>
@@ -12526,10 +12650,10 @@
       <w:spacing w:after="0" w:line="240" w:lineRule="auto"/>
     </w:pPr>
   </w:style>
-  <w:style w:type="character" w:customStyle="1" w:styleId="Heading1Char">
-    <w:name w:val="Heading 1 Char"/>
-    <w:basedOn w:val="DefaultParagraphFont"/>
-    <w:link w:val="Heading1"/>
+  <w:style w:type="character" w:customStyle="1" w:styleId="10">
+    <w:name w:val="Заголовок 1 Знак"/>
+    <w:basedOn w:val="a2"/>
+    <w:link w:val="1"/>
     <w:uiPriority w:val="9"/>
     <w:rsid w:val="00FC693F"/>
     <w:rPr>
@@ -12541,10 +12665,10 @@
       <w:szCs w:val="28"/>
     </w:rPr>
   </w:style>
-  <w:style w:type="character" w:customStyle="1" w:styleId="Heading2Char">
-    <w:name w:val="Heading 2 Char"/>
-    <w:basedOn w:val="DefaultParagraphFont"/>
-    <w:link w:val="Heading2"/>
+  <w:style w:type="character" w:customStyle="1" w:styleId="22">
+    <w:name w:val="Заголовок 2 Знак"/>
+    <w:basedOn w:val="a2"/>
+    <w:link w:val="21"/>
     <w:uiPriority w:val="9"/>
     <w:rsid w:val="00FC693F"/>
     <w:rPr>
@@ -12556,10 +12680,10 @@
       <w:szCs w:val="26"/>
     </w:rPr>
   </w:style>
-  <w:style w:type="character" w:customStyle="1" w:styleId="Heading3Char">
-    <w:name w:val="Heading 3 Char"/>
-    <w:basedOn w:val="DefaultParagraphFont"/>
-    <w:link w:val="Heading3"/>
+  <w:style w:type="character" w:customStyle="1" w:styleId="32">
+    <w:name w:val="Заголовок 3 Знак"/>
+    <w:basedOn w:val="a2"/>
+    <w:link w:val="31"/>
     <w:uiPriority w:val="9"/>
     <w:rsid w:val="00FC693F"/>
     <w:rPr>
@@ -12569,11 +12693,11 @@
       <w:color w:val="4F81BD" w:themeColor="accent1"/>
     </w:rPr>
   </w:style>
-  <w:style w:type="paragraph" w:styleId="Title">
+  <w:style w:type="paragraph" w:styleId="aa">
     <w:name w:val="Title"/>
-    <w:basedOn w:val="Normal"/>
-    <w:next w:val="Normal"/>
-    <w:link w:val="TitleChar"/>
+    <w:basedOn w:val="a1"/>
+    <w:next w:val="a1"/>
+    <w:link w:val="ab"/>
     <w:uiPriority w:val="10"/>
     <w:qFormat/>
     <w:rsid w:val="00FC693F"/>
@@ -12593,10 +12717,10 @@
       <w:szCs w:val="52"/>
     </w:rPr>
   </w:style>
-  <w:style w:type="character" w:customStyle="1" w:styleId="TitleChar">
-    <w:name w:val="Title Char"/>
-    <w:basedOn w:val="DefaultParagraphFont"/>
-    <w:link w:val="Title"/>
+  <w:style w:type="character" w:customStyle="1" w:styleId="ab">
+    <w:name w:val="Название Знак"/>
+    <w:basedOn w:val="a2"/>
+    <w:link w:val="aa"/>
     <w:uiPriority w:val="10"/>
     <w:rsid w:val="00FC693F"/>
     <w:rPr>
@@ -12608,11 +12732,11 @@
       <w:szCs w:val="52"/>
     </w:rPr>
   </w:style>
-  <w:style w:type="paragraph" w:styleId="Subtitle">
+  <w:style w:type="paragraph" w:styleId="ac">
     <w:name w:val="Subtitle"/>
-    <w:basedOn w:val="Normal"/>
-    <w:next w:val="Normal"/>
-    <w:link w:val="SubtitleChar"/>
+    <w:basedOn w:val="a1"/>
+    <w:next w:val="a1"/>
+    <w:link w:val="ad"/>
     <w:uiPriority w:val="11"/>
     <w:qFormat/>
     <w:rsid w:val="00FC693F"/>
@@ -12631,10 +12755,10 @@
       <w:szCs w:val="24"/>
     </w:rPr>
   </w:style>
-  <w:style w:type="character" w:customStyle="1" w:styleId="SubtitleChar">
-    <w:name w:val="Subtitle Char"/>
-    <w:basedOn w:val="DefaultParagraphFont"/>
-    <w:link w:val="Subtitle"/>
+  <w:style w:type="character" w:customStyle="1" w:styleId="ad">
+    <w:name w:val="Подзаголовок Знак"/>
+    <w:basedOn w:val="a2"/>
+    <w:link w:val="ac"/>
     <w:uiPriority w:val="11"/>
     <w:rsid w:val="00FC693F"/>
     <w:rPr>
@@ -12647,9 +12771,9 @@
       <w:szCs w:val="24"/>
     </w:rPr>
   </w:style>
-  <w:style w:type="paragraph" w:styleId="ListParagraph">
+  <w:style w:type="paragraph" w:styleId="ae">
     <w:name w:val="List Paragraph"/>
-    <w:basedOn w:val="Normal"/>
+    <w:basedOn w:val="a1"/>
     <w:uiPriority w:val="34"/>
     <w:qFormat/>
     <w:rsid w:val="00FC693F"/>
@@ -12658,10 +12782,10 @@
       <w:contextualSpacing/>
     </w:pPr>
   </w:style>
-  <w:style w:type="paragraph" w:styleId="BodyText">
+  <w:style w:type="paragraph" w:styleId="af">
     <w:name w:val="Body Text"/>
-    <w:basedOn w:val="Normal"/>
-    <w:link w:val="BodyTextChar"/>
+    <w:basedOn w:val="a1"/>
+    <w:link w:val="af0"/>
     <w:uiPriority w:val="99"/>
     <w:unhideWhenUsed/>
     <w:rsid w:val="00AA1D8D"/>
@@ -12669,17 +12793,17 @@
       <w:spacing w:after="120"/>
     </w:pPr>
   </w:style>
-  <w:style w:type="character" w:customStyle="1" w:styleId="BodyTextChar">
-    <w:name w:val="Body Text Char"/>
-    <w:basedOn w:val="DefaultParagraphFont"/>
-    <w:link w:val="BodyText"/>
+  <w:style w:type="character" w:customStyle="1" w:styleId="af0">
+    <w:name w:val="Основной текст Знак"/>
+    <w:basedOn w:val="a2"/>
+    <w:link w:val="af"/>
     <w:uiPriority w:val="99"/>
     <w:rsid w:val="00AA1D8D"/>
   </w:style>
-  <w:style w:type="paragraph" w:styleId="BodyText2">
+  <w:style w:type="paragraph" w:styleId="23">
     <w:name w:val="Body Text 2"/>
-    <w:basedOn w:val="Normal"/>
-    <w:link w:val="BodyText2Char"/>
+    <w:basedOn w:val="a1"/>
+    <w:link w:val="24"/>
     <w:uiPriority w:val="99"/>
     <w:unhideWhenUsed/>
     <w:rsid w:val="00AA1D8D"/>
@@ -12687,17 +12811,17 @@
       <w:spacing w:after="120" w:line="480" w:lineRule="auto"/>
     </w:pPr>
   </w:style>
-  <w:style w:type="character" w:customStyle="1" w:styleId="BodyText2Char">
-    <w:name w:val="Body Text 2 Char"/>
-    <w:basedOn w:val="DefaultParagraphFont"/>
-    <w:link w:val="BodyText2"/>
+  <w:style w:type="character" w:customStyle="1" w:styleId="24">
+    <w:name w:val="Основной текст 2 Знак"/>
+    <w:basedOn w:val="a2"/>
+    <w:link w:val="23"/>
     <w:uiPriority w:val="99"/>
     <w:rsid w:val="00AA1D8D"/>
   </w:style>
-  <w:style w:type="paragraph" w:styleId="BodyText3">
+  <w:style w:type="paragraph" w:styleId="33">
     <w:name w:val="Body Text 3"/>
-    <w:basedOn w:val="Normal"/>
-    <w:link w:val="BodyText3Char"/>
+    <w:basedOn w:val="a1"/>
+    <w:link w:val="34"/>
     <w:uiPriority w:val="99"/>
     <w:unhideWhenUsed/>
     <w:rsid w:val="00AA1D8D"/>
@@ -12709,10 +12833,10 @@
       <w:szCs w:val="16"/>
     </w:rPr>
   </w:style>
-  <w:style w:type="character" w:customStyle="1" w:styleId="BodyText3Char">
-    <w:name w:val="Body Text 3 Char"/>
-    <w:basedOn w:val="DefaultParagraphFont"/>
-    <w:link w:val="BodyText3"/>
+  <w:style w:type="character" w:customStyle="1" w:styleId="34">
+    <w:name w:val="Основной текст 3 Знак"/>
+    <w:basedOn w:val="a2"/>
+    <w:link w:val="33"/>
     <w:uiPriority w:val="99"/>
     <w:rsid w:val="00AA1D8D"/>
     <w:rPr>
@@ -12720,9 +12844,9 @@
       <w:szCs w:val="16"/>
     </w:rPr>
   </w:style>
-  <w:style w:type="paragraph" w:styleId="List">
+  <w:style w:type="paragraph" w:styleId="af1">
     <w:name w:val="List"/>
-    <w:basedOn w:val="Normal"/>
+    <w:basedOn w:val="a1"/>
     <w:uiPriority w:val="99"/>
     <w:unhideWhenUsed/>
     <w:rsid w:val="00AA1D8D"/>
@@ -12731,9 +12855,9 @@
       <w:contextualSpacing/>
     </w:pPr>
   </w:style>
-  <w:style w:type="paragraph" w:styleId="List2">
+  <w:style w:type="paragraph" w:styleId="25">
     <w:name w:val="List 2"/>
-    <w:basedOn w:val="Normal"/>
+    <w:basedOn w:val="a1"/>
     <w:uiPriority w:val="99"/>
     <w:unhideWhenUsed/>
     <w:rsid w:val="00326F90"/>
@@ -12742,9 +12866,9 @@
       <w:contextualSpacing/>
     </w:pPr>
   </w:style>
-  <w:style w:type="paragraph" w:styleId="List3">
+  <w:style w:type="paragraph" w:styleId="35">
     <w:name w:val="List 3"/>
-    <w:basedOn w:val="Normal"/>
+    <w:basedOn w:val="a1"/>
     <w:uiPriority w:val="99"/>
     <w:unhideWhenUsed/>
     <w:rsid w:val="00326F90"/>
@@ -12753,9 +12877,9 @@
       <w:contextualSpacing/>
     </w:pPr>
   </w:style>
-  <w:style w:type="paragraph" w:styleId="ListBullet">
+  <w:style w:type="paragraph" w:styleId="a0">
     <w:name w:val="List Bullet"/>
-    <w:basedOn w:val="Normal"/>
+    <w:basedOn w:val="a1"/>
     <w:uiPriority w:val="99"/>
     <w:unhideWhenUsed/>
     <w:rsid w:val="00326F90"/>
@@ -12766,9 +12890,9 @@
       <w:contextualSpacing/>
     </w:pPr>
   </w:style>
-  <w:style w:type="paragraph" w:styleId="ListBullet2">
+  <w:style w:type="paragraph" w:styleId="20">
     <w:name w:val="List Bullet 2"/>
-    <w:basedOn w:val="Normal"/>
+    <w:basedOn w:val="a1"/>
     <w:uiPriority w:val="99"/>
     <w:unhideWhenUsed/>
     <w:rsid w:val="00326F90"/>
@@ -12779,9 +12903,9 @@
       <w:contextualSpacing/>
     </w:pPr>
   </w:style>
-  <w:style w:type="paragraph" w:styleId="ListBullet3">
+  <w:style w:type="paragraph" w:styleId="30">
     <w:name w:val="List Bullet 3"/>
-    <w:basedOn w:val="Normal"/>
+    <w:basedOn w:val="a1"/>
     <w:uiPriority w:val="99"/>
     <w:unhideWhenUsed/>
     <w:rsid w:val="00326F90"/>
@@ -12792,9 +12916,9 @@
       <w:contextualSpacing/>
     </w:pPr>
   </w:style>
-  <w:style w:type="paragraph" w:styleId="ListNumber">
+  <w:style w:type="paragraph" w:styleId="a">
     <w:name w:val="List Number"/>
-    <w:basedOn w:val="Normal"/>
+    <w:basedOn w:val="a1"/>
     <w:uiPriority w:val="99"/>
     <w:unhideWhenUsed/>
     <w:rsid w:val="00326F90"/>
@@ -12805,9 +12929,9 @@
       <w:contextualSpacing/>
     </w:pPr>
   </w:style>
-  <w:style w:type="paragraph" w:styleId="ListNumber2">
+  <w:style w:type="paragraph" w:styleId="2">
     <w:name w:val="List Number 2"/>
-    <w:basedOn w:val="Normal"/>
+    <w:basedOn w:val="a1"/>
     <w:uiPriority w:val="99"/>
     <w:unhideWhenUsed/>
     <w:rsid w:val="0029639D"/>
@@ -12818,9 +12942,9 @@
       <w:contextualSpacing/>
     </w:pPr>
   </w:style>
-  <w:style w:type="paragraph" w:styleId="ListNumber3">
+  <w:style w:type="paragraph" w:styleId="3">
     <w:name w:val="List Number 3"/>
-    <w:basedOn w:val="Normal"/>
+    <w:basedOn w:val="a1"/>
     <w:uiPriority w:val="99"/>
     <w:unhideWhenUsed/>
     <w:rsid w:val="0029639D"/>
@@ -12831,9 +12955,9 @@
       <w:contextualSpacing/>
     </w:pPr>
   </w:style>
-  <w:style w:type="paragraph" w:styleId="ListContinue">
+  <w:style w:type="paragraph" w:styleId="af2">
     <w:name w:val="List Continue"/>
-    <w:basedOn w:val="Normal"/>
+    <w:basedOn w:val="a1"/>
     <w:uiPriority w:val="99"/>
     <w:unhideWhenUsed/>
     <w:rsid w:val="0029639D"/>
@@ -12843,9 +12967,9 @@
       <w:contextualSpacing/>
     </w:pPr>
   </w:style>
-  <w:style w:type="paragraph" w:styleId="ListContinue2">
+  <w:style w:type="paragraph" w:styleId="26">
     <w:name w:val="List Continue 2"/>
-    <w:basedOn w:val="Normal"/>
+    <w:basedOn w:val="a1"/>
     <w:uiPriority w:val="99"/>
     <w:unhideWhenUsed/>
     <w:rsid w:val="0029639D"/>
@@ -12855,9 +12979,9 @@
       <w:contextualSpacing/>
     </w:pPr>
   </w:style>
-  <w:style w:type="paragraph" w:styleId="ListContinue3">
+  <w:style w:type="paragraph" w:styleId="36">
     <w:name w:val="List Continue 3"/>
-    <w:basedOn w:val="Normal"/>
+    <w:basedOn w:val="a1"/>
     <w:uiPriority w:val="99"/>
     <w:unhideWhenUsed/>
     <w:rsid w:val="0029639D"/>
@@ -12867,9 +12991,9 @@
       <w:contextualSpacing/>
     </w:pPr>
   </w:style>
-  <w:style w:type="paragraph" w:styleId="MacroText">
+  <w:style w:type="paragraph" w:styleId="af3">
     <w:name w:val="macro"/>
-    <w:link w:val="MacroTextChar"/>
+    <w:link w:val="af4"/>
     <w:uiPriority w:val="99"/>
     <w:unhideWhenUsed/>
     <w:rsid w:val="0029639D"/>
@@ -12890,10 +13014,10 @@
       <w:szCs w:val="20"/>
     </w:rPr>
   </w:style>
-  <w:style w:type="character" w:customStyle="1" w:styleId="MacroTextChar">
-    <w:name w:val="Macro Text Char"/>
-    <w:basedOn w:val="DefaultParagraphFont"/>
-    <w:link w:val="MacroText"/>
+  <w:style w:type="character" w:customStyle="1" w:styleId="af4">
+    <w:name w:val="Текст макроса Знак"/>
+    <w:basedOn w:val="a2"/>
+    <w:link w:val="af3"/>
     <w:uiPriority w:val="99"/>
     <w:rsid w:val="0029639D"/>
     <w:rPr>
@@ -12902,11 +13026,11 @@
       <w:szCs w:val="20"/>
     </w:rPr>
   </w:style>
-  <w:style w:type="paragraph" w:styleId="Quote">
+  <w:style w:type="paragraph" w:styleId="27">
     <w:name w:val="Quote"/>
-    <w:basedOn w:val="Normal"/>
-    <w:next w:val="Normal"/>
-    <w:link w:val="QuoteChar"/>
+    <w:basedOn w:val="a1"/>
+    <w:next w:val="a1"/>
+    <w:link w:val="28"/>
     <w:uiPriority w:val="29"/>
     <w:qFormat/>
     <w:rsid w:val="00FC693F"/>
@@ -12916,10 +13040,10 @@
       <w:color w:val="000000" w:themeColor="text1"/>
     </w:rPr>
   </w:style>
-  <w:style w:type="character" w:customStyle="1" w:styleId="QuoteChar">
-    <w:name w:val="Quote Char"/>
-    <w:basedOn w:val="DefaultParagraphFont"/>
-    <w:link w:val="Quote"/>
+  <w:style w:type="character" w:customStyle="1" w:styleId="28">
+    <w:name w:val="Цитата 2 Знак"/>
+    <w:basedOn w:val="a2"/>
+    <w:link w:val="27"/>
     <w:uiPriority w:val="29"/>
     <w:rsid w:val="00FC693F"/>
     <w:rPr>
@@ -12928,10 +13052,10 @@
       <w:color w:val="000000" w:themeColor="text1"/>
     </w:rPr>
   </w:style>
-  <w:style w:type="character" w:customStyle="1" w:styleId="Heading4Char">
-    <w:name w:val="Heading 4 Char"/>
-    <w:basedOn w:val="DefaultParagraphFont"/>
-    <w:link w:val="Heading4"/>
+  <w:style w:type="character" w:customStyle="1" w:styleId="40">
+    <w:name w:val="Заголовок 4 Знак"/>
+    <w:basedOn w:val="a2"/>
+    <w:link w:val="4"/>
     <w:uiPriority w:val="9"/>
     <w:semiHidden/>
     <w:rsid w:val="00FC693F"/>
@@ -12944,10 +13068,10 @@
       <w:color w:val="4F81BD" w:themeColor="accent1"/>
     </w:rPr>
   </w:style>
-  <w:style w:type="character" w:customStyle="1" w:styleId="Heading5Char">
-    <w:name w:val="Heading 5 Char"/>
-    <w:basedOn w:val="DefaultParagraphFont"/>
-    <w:link w:val="Heading5"/>
+  <w:style w:type="character" w:customStyle="1" w:styleId="50">
+    <w:name w:val="Заголовок 5 Знак"/>
+    <w:basedOn w:val="a2"/>
+    <w:link w:val="5"/>
     <w:uiPriority w:val="9"/>
     <w:semiHidden/>
     <w:rsid w:val="00FC693F"/>
@@ -12956,10 +13080,10 @@
       <w:color w:val="243F60" w:themeColor="accent1" w:themeShade="7F"/>
     </w:rPr>
   </w:style>
-  <w:style w:type="character" w:customStyle="1" w:styleId="Heading6Char">
-    <w:name w:val="Heading 6 Char"/>
-    <w:basedOn w:val="DefaultParagraphFont"/>
-    <w:link w:val="Heading6"/>
+  <w:style w:type="character" w:customStyle="1" w:styleId="60">
+    <w:name w:val="Заголовок 6 Знак"/>
+    <w:basedOn w:val="a2"/>
+    <w:link w:val="6"/>
     <w:uiPriority w:val="9"/>
     <w:semiHidden/>
     <w:rsid w:val="00FC693F"/>
@@ -12970,10 +13094,10 @@
       <w:color w:val="243F60" w:themeColor="accent1" w:themeShade="7F"/>
     </w:rPr>
   </w:style>
-  <w:style w:type="character" w:customStyle="1" w:styleId="Heading7Char">
-    <w:name w:val="Heading 7 Char"/>
-    <w:basedOn w:val="DefaultParagraphFont"/>
-    <w:link w:val="Heading7"/>
+  <w:style w:type="character" w:customStyle="1" w:styleId="70">
+    <w:name w:val="Заголовок 7 Знак"/>
+    <w:basedOn w:val="a2"/>
+    <w:link w:val="7"/>
     <w:uiPriority w:val="9"/>
     <w:semiHidden/>
     <w:rsid w:val="00FC693F"/>
@@ -12984,10 +13108,10 @@
       <w:color w:val="404040" w:themeColor="text1" w:themeTint="BF"/>
     </w:rPr>
   </w:style>
-  <w:style w:type="character" w:customStyle="1" w:styleId="Heading8Char">
-    <w:name w:val="Heading 8 Char"/>
-    <w:basedOn w:val="DefaultParagraphFont"/>
-    <w:link w:val="Heading8"/>
+  <w:style w:type="character" w:customStyle="1" w:styleId="80">
+    <w:name w:val="Заголовок 8 Знак"/>
+    <w:basedOn w:val="a2"/>
+    <w:link w:val="8"/>
     <w:uiPriority w:val="9"/>
     <w:semiHidden/>
     <w:rsid w:val="00FC693F"/>
@@ -12998,10 +13122,10 @@
       <w:szCs w:val="20"/>
     </w:rPr>
   </w:style>
-  <w:style w:type="character" w:customStyle="1" w:styleId="Heading9Char">
-    <w:name w:val="Heading 9 Char"/>
-    <w:basedOn w:val="DefaultParagraphFont"/>
-    <w:link w:val="Heading9"/>
+  <w:style w:type="character" w:customStyle="1" w:styleId="90">
+    <w:name w:val="Заголовок 9 Знак"/>
+    <w:basedOn w:val="a2"/>
+    <w:link w:val="9"/>
     <w:uiPriority w:val="9"/>
     <w:semiHidden/>
     <w:rsid w:val="00FC693F"/>
@@ -13014,10 +13138,10 @@
       <w:szCs w:val="20"/>
     </w:rPr>
   </w:style>
-  <w:style w:type="paragraph" w:styleId="Caption">
+  <w:style w:type="paragraph" w:styleId="af5">
     <w:name w:val="caption"/>
-    <w:basedOn w:val="Normal"/>
-    <w:next w:val="Normal"/>
+    <w:basedOn w:val="a1"/>
+    <w:next w:val="a1"/>
     <w:uiPriority w:val="35"/>
     <w:semiHidden/>
     <w:unhideWhenUsed/>
@@ -13034,9 +13158,9 @@
       <w:szCs w:val="18"/>
     </w:rPr>
   </w:style>
-  <w:style w:type="character" w:styleId="Strong">
+  <w:style w:type="character" w:styleId="af6">
     <w:name w:val="Strong"/>
-    <w:basedOn w:val="DefaultParagraphFont"/>
+    <w:basedOn w:val="a2"/>
     <w:uiPriority w:val="22"/>
     <w:qFormat/>
     <w:rsid w:val="00FC693F"/>
@@ -13045,9 +13169,9 @@
       <w:bCs/>
     </w:rPr>
   </w:style>
-  <w:style w:type="character" w:styleId="Emphasis">
+  <w:style w:type="character" w:styleId="af7">
     <w:name w:val="Emphasis"/>
-    <w:basedOn w:val="DefaultParagraphFont"/>
+    <w:basedOn w:val="a2"/>
     <w:uiPriority w:val="20"/>
     <w:qFormat/>
     <w:rsid w:val="00FC693F"/>
@@ -13056,11 +13180,11 @@
       <w:iCs/>
     </w:rPr>
   </w:style>
-  <w:style w:type="paragraph" w:styleId="IntenseQuote">
+  <w:style w:type="paragraph" w:styleId="af8">
     <w:name w:val="Intense Quote"/>
-    <w:basedOn w:val="Normal"/>
-    <w:next w:val="Normal"/>
-    <w:link w:val="IntenseQuoteChar"/>
+    <w:basedOn w:val="a1"/>
+    <w:next w:val="a1"/>
+    <w:link w:val="af9"/>
     <w:uiPriority w:val="30"/>
     <w:qFormat/>
     <w:rsid w:val="00FC693F"/>
@@ -13079,10 +13203,10 @@
       <w:color w:val="4F81BD" w:themeColor="accent1"/>
     </w:rPr>
   </w:style>
-  <w:style w:type="character" w:customStyle="1" w:styleId="IntenseQuoteChar">
-    <w:name w:val="Intense Quote Char"/>
-    <w:basedOn w:val="DefaultParagraphFont"/>
-    <w:link w:val="IntenseQuote"/>
+  <w:style w:type="character" w:customStyle="1" w:styleId="af9">
+    <w:name w:val="Выделенная цитата Знак"/>
+    <w:basedOn w:val="a2"/>
+    <w:link w:val="af8"/>
     <w:uiPriority w:val="30"/>
     <w:rsid w:val="00FC693F"/>
     <w:rPr>
@@ -13093,9 +13217,9 @@
       <w:color w:val="4F81BD" w:themeColor="accent1"/>
     </w:rPr>
   </w:style>
-  <w:style w:type="character" w:styleId="SubtleEmphasis">
+  <w:style w:type="character" w:styleId="afa">
     <w:name w:val="Subtle Emphasis"/>
-    <w:basedOn w:val="DefaultParagraphFont"/>
+    <w:basedOn w:val="a2"/>
     <w:uiPriority w:val="19"/>
     <w:qFormat/>
     <w:rsid w:val="00FC693F"/>
@@ -13105,9 +13229,9 @@
       <w:color w:val="808080" w:themeColor="text1" w:themeTint="7F"/>
     </w:rPr>
   </w:style>
-  <w:style w:type="character" w:styleId="IntenseEmphasis">
+  <w:style w:type="character" w:styleId="afb">
     <w:name w:val="Intense Emphasis"/>
-    <w:basedOn w:val="DefaultParagraphFont"/>
+    <w:basedOn w:val="a2"/>
     <w:uiPriority w:val="21"/>
     <w:qFormat/>
     <w:rsid w:val="00FC693F"/>
@@ -13119,9 +13243,9 @@
       <w:color w:val="4F81BD" w:themeColor="accent1"/>
     </w:rPr>
   </w:style>
-  <w:style w:type="character" w:styleId="SubtleReference">
+  <w:style w:type="character" w:styleId="afc">
     <w:name w:val="Subtle Reference"/>
-    <w:basedOn w:val="DefaultParagraphFont"/>
+    <w:basedOn w:val="a2"/>
     <w:uiPriority w:val="31"/>
     <w:qFormat/>
     <w:rsid w:val="00FC693F"/>
@@ -13131,9 +13255,9 @@
       <w:u w:val="single"/>
     </w:rPr>
   </w:style>
-  <w:style w:type="character" w:styleId="IntenseReference">
+  <w:style w:type="character" w:styleId="afd">
     <w:name w:val="Intense Reference"/>
-    <w:basedOn w:val="DefaultParagraphFont"/>
+    <w:basedOn w:val="a2"/>
     <w:uiPriority w:val="32"/>
     <w:qFormat/>
     <w:rsid w:val="00FC693F"/>
@@ -13146,9 +13270,9 @@
       <w:u w:val="single"/>
     </w:rPr>
   </w:style>
-  <w:style w:type="character" w:styleId="BookTitle">
+  <w:style w:type="character" w:styleId="afe">
     <w:name w:val="Book Title"/>
-    <w:basedOn w:val="DefaultParagraphFont"/>
+    <w:basedOn w:val="a2"/>
     <w:uiPriority w:val="33"/>
     <w:qFormat/>
     <w:rsid w:val="00FC693F"/>
@@ -13159,10 +13283,10 @@
       <w:spacing w:val="5"/>
     </w:rPr>
   </w:style>
-  <w:style w:type="paragraph" w:styleId="TOCHeading">
+  <w:style w:type="paragraph" w:styleId="aff">
     <w:name w:val="TOC Heading"/>
-    <w:basedOn w:val="Heading1"/>
-    <w:next w:val="Normal"/>
+    <w:basedOn w:val="1"/>
+    <w:next w:val="a1"/>
     <w:uiPriority w:val="39"/>
     <w:semiHidden/>
     <w:unhideWhenUsed/>
@@ -13172,9 +13296,9 @@
       <w:outlineLvl w:val="9"/>
     </w:pPr>
   </w:style>
-  <w:style w:type="table" w:styleId="TableGrid">
+  <w:style w:type="table" w:styleId="aff0">
     <w:name w:val="Table Grid"/>
-    <w:basedOn w:val="TableNormal"/>
+    <w:basedOn w:val="a3"/>
     <w:uiPriority w:val="59"/>
     <w:rsid w:val="00FC693F"/>
     <w:pPr>
@@ -13198,9 +13322,9 @@
       </w:tblCellMar>
     </w:tblPr>
   </w:style>
-  <w:style w:type="table" w:styleId="LightShading">
+  <w:style w:type="table" w:styleId="aff1">
     <w:name w:val="Light Shading"/>
-    <w:basedOn w:val="TableNormal"/>
+    <w:basedOn w:val="a3"/>
     <w:uiPriority w:val="60"/>
     <w:rsid w:val="00FC693F"/>
     <w:pPr>
@@ -13301,9 +13425,9 @@
       </w:tcPr>
     </w:tblStylePr>
   </w:style>
-  <w:style w:type="table" w:styleId="LightShading-Accent1">
+  <w:style w:type="table" w:styleId="-1">
     <w:name w:val="Light Shading Accent 1"/>
-    <w:basedOn w:val="TableNormal"/>
+    <w:basedOn w:val="a3"/>
     <w:uiPriority w:val="60"/>
     <w:rsid w:val="00FC693F"/>
     <w:pPr>
@@ -13404,9 +13528,9 @@
       </w:tcPr>
     </w:tblStylePr>
   </w:style>
-  <w:style w:type="table" w:styleId="LightShading-Accent2">
+  <w:style w:type="table" w:styleId="-2">
     <w:name w:val="Light Shading Accent 2"/>
-    <w:basedOn w:val="TableNormal"/>
+    <w:basedOn w:val="a3"/>
     <w:uiPriority w:val="60"/>
     <w:rsid w:val="00FC693F"/>
     <w:pPr>
@@ -13507,9 +13631,9 @@
       </w:tcPr>
     </w:tblStylePr>
   </w:style>
-  <w:style w:type="table" w:styleId="LightShading-Accent3">
+  <w:style w:type="table" w:styleId="-3">
     <w:name w:val="Light Shading Accent 3"/>
-    <w:basedOn w:val="TableNormal"/>
+    <w:basedOn w:val="a3"/>
     <w:uiPriority w:val="60"/>
     <w:rsid w:val="00FC693F"/>
     <w:pPr>
@@ -13610,9 +13734,9 @@
       </w:tcPr>
     </w:tblStylePr>
   </w:style>
-  <w:style w:type="table" w:styleId="LightShading-Accent4">
+  <w:style w:type="table" w:styleId="-4">
     <w:name w:val="Light Shading Accent 4"/>
-    <w:basedOn w:val="TableNormal"/>
+    <w:basedOn w:val="a3"/>
     <w:uiPriority w:val="60"/>
     <w:rsid w:val="00FC693F"/>
     <w:pPr>
@@ -13713,9 +13837,9 @@
       </w:tcPr>
     </w:tblStylePr>
   </w:style>
-  <w:style w:type="table" w:styleId="LightShading-Accent5">
+  <w:style w:type="table" w:styleId="-5">
     <w:name w:val="Light Shading Accent 5"/>
-    <w:basedOn w:val="TableNormal"/>
+    <w:basedOn w:val="a3"/>
     <w:uiPriority w:val="60"/>
     <w:rsid w:val="00FC693F"/>
     <w:pPr>
@@ -13816,9 +13940,9 @@
       </w:tcPr>
     </w:tblStylePr>
   </w:style>
-  <w:style w:type="table" w:styleId="LightShading-Accent6">
+  <w:style w:type="table" w:styleId="-6">
     <w:name w:val="Light Shading Accent 6"/>
-    <w:basedOn w:val="TableNormal"/>
+    <w:basedOn w:val="a3"/>
     <w:uiPriority w:val="60"/>
     <w:rsid w:val="00FC693F"/>
     <w:pPr>
@@ -13919,9 +14043,9 @@
       </w:tcPr>
     </w:tblStylePr>
   </w:style>
-  <w:style w:type="table" w:styleId="LightList">
+  <w:style w:type="table" w:styleId="aff2">
     <w:name w:val="Light List"/>
-    <w:basedOn w:val="TableNormal"/>
+    <w:basedOn w:val="a3"/>
     <w:uiPriority w:val="61"/>
     <w:rsid w:val="00FC693F"/>
     <w:pPr>
@@ -14011,9 +14135,9 @@
       </w:tcPr>
     </w:tblStylePr>
   </w:style>
-  <w:style w:type="table" w:styleId="LightList-Accent1">
+  <w:style w:type="table" w:styleId="-10">
     <w:name w:val="Light List Accent 1"/>
-    <w:basedOn w:val="TableNormal"/>
+    <w:basedOn w:val="a3"/>
     <w:uiPriority w:val="61"/>
     <w:rsid w:val="00FC693F"/>
     <w:pPr>
@@ -14103,9 +14227,9 @@
       </w:tcPr>
     </w:tblStylePr>
   </w:style>
-  <w:style w:type="table" w:styleId="LightList-Accent2">
+  <w:style w:type="table" w:styleId="-20">
     <w:name w:val="Light List Accent 2"/>
-    <w:basedOn w:val="TableNormal"/>
+    <w:basedOn w:val="a3"/>
     <w:uiPriority w:val="61"/>
     <w:rsid w:val="00CB0664"/>
     <w:pPr>
@@ -14195,9 +14319,9 @@
       </w:tcPr>
     </w:tblStylePr>
   </w:style>
-  <w:style w:type="table" w:styleId="LightList-Accent3">
+  <w:style w:type="table" w:styleId="-30">
     <w:name w:val="Light List Accent 3"/>
-    <w:basedOn w:val="TableNormal"/>
+    <w:basedOn w:val="a3"/>
     <w:uiPriority w:val="61"/>
     <w:rsid w:val="00CB0664"/>
     <w:pPr>
@@ -14287,9 +14411,9 @@
       </w:tcPr>
     </w:tblStylePr>
   </w:style>
-  <w:style w:type="table" w:styleId="LightList-Accent4">
+  <w:style w:type="table" w:styleId="-40">
     <w:name w:val="Light List Accent 4"/>
-    <w:basedOn w:val="TableNormal"/>
+    <w:basedOn w:val="a3"/>
     <w:uiPriority w:val="61"/>
     <w:rsid w:val="00CB0664"/>
     <w:pPr>
@@ -14379,9 +14503,9 @@
       </w:tcPr>
     </w:tblStylePr>
   </w:style>
-  <w:style w:type="table" w:styleId="LightList-Accent5">
+  <w:style w:type="table" w:styleId="-50">
     <w:name w:val="Light List Accent 5"/>
-    <w:basedOn w:val="TableNormal"/>
+    <w:basedOn w:val="a3"/>
     <w:uiPriority w:val="61"/>
     <w:rsid w:val="00CB0664"/>
     <w:pPr>
@@ -14471,9 +14595,9 @@
       </w:tcPr>
     </w:tblStylePr>
   </w:style>
-  <w:style w:type="table" w:styleId="LightList-Accent6">
+  <w:style w:type="table" w:styleId="-60">
     <w:name w:val="Light List Accent 6"/>
-    <w:basedOn w:val="TableNormal"/>
+    <w:basedOn w:val="a3"/>
     <w:uiPriority w:val="61"/>
     <w:rsid w:val="00CB0664"/>
     <w:pPr>
@@ -14563,9 +14687,9 @@
       </w:tcPr>
     </w:tblStylePr>
   </w:style>
-  <w:style w:type="table" w:styleId="LightGrid">
+  <w:style w:type="table" w:styleId="aff3">
     <w:name w:val="Light Grid"/>
-    <w:basedOn w:val="TableNormal"/>
+    <w:basedOn w:val="a3"/>
     <w:uiPriority w:val="62"/>
     <w:rsid w:val="00CB0664"/>
     <w:pPr>
@@ -14693,9 +14817,9 @@
       </w:tcPr>
     </w:tblStylePr>
   </w:style>
-  <w:style w:type="table" w:styleId="LightGrid-Accent1">
+  <w:style w:type="table" w:styleId="-11">
     <w:name w:val="Light Grid Accent 1"/>
-    <w:basedOn w:val="TableNormal"/>
+    <w:basedOn w:val="a3"/>
     <w:uiPriority w:val="62"/>
     <w:rsid w:val="00CB0664"/>
     <w:pPr>
@@ -14823,9 +14947,9 @@
       </w:tcPr>
     </w:tblStylePr>
   </w:style>
-  <w:style w:type="table" w:styleId="LightGrid-Accent2">
+  <w:style w:type="table" w:styleId="-21">
     <w:name w:val="Light Grid Accent 2"/>
-    <w:basedOn w:val="TableNormal"/>
+    <w:basedOn w:val="a3"/>
     <w:uiPriority w:val="62"/>
     <w:rsid w:val="00CB0664"/>
     <w:pPr>
@@ -14953,9 +15077,9 @@
       </w:tcPr>
     </w:tblStylePr>
   </w:style>
-  <w:style w:type="table" w:styleId="LightGrid-Accent3">
+  <w:style w:type="table" w:styleId="-31">
     <w:name w:val="Light Grid Accent 3"/>
-    <w:basedOn w:val="TableNormal"/>
+    <w:basedOn w:val="a3"/>
     <w:uiPriority w:val="62"/>
     <w:rsid w:val="00CB0664"/>
     <w:pPr>
@@ -15083,9 +15207,9 @@
       </w:tcPr>
     </w:tblStylePr>
   </w:style>
-  <w:style w:type="table" w:styleId="LightGrid-Accent4">
+  <w:style w:type="table" w:styleId="-41">
     <w:name w:val="Light Grid Accent 4"/>
-    <w:basedOn w:val="TableNormal"/>
+    <w:basedOn w:val="a3"/>
     <w:uiPriority w:val="62"/>
     <w:rsid w:val="00CB0664"/>
     <w:pPr>
@@ -15213,9 +15337,9 @@
       </w:tcPr>
     </w:tblStylePr>
   </w:style>
-  <w:style w:type="table" w:styleId="LightGrid-Accent5">
+  <w:style w:type="table" w:styleId="-51">
     <w:name w:val="Light Grid Accent 5"/>
-    <w:basedOn w:val="TableNormal"/>
+    <w:basedOn w:val="a3"/>
     <w:uiPriority w:val="62"/>
     <w:rsid w:val="00CB0664"/>
     <w:pPr>
@@ -15343,9 +15467,9 @@
       </w:tcPr>
     </w:tblStylePr>
   </w:style>
-  <w:style w:type="table" w:styleId="LightGrid-Accent6">
+  <w:style w:type="table" w:styleId="-61">
     <w:name w:val="Light Grid Accent 6"/>
-    <w:basedOn w:val="TableNormal"/>
+    <w:basedOn w:val="a3"/>
     <w:uiPriority w:val="62"/>
     <w:rsid w:val="00CB0664"/>
     <w:pPr>
@@ -15473,9 +15597,9 @@
       </w:tcPr>
     </w:tblStylePr>
   </w:style>
-  <w:style w:type="table" w:styleId="MediumShading1">
+  <w:style w:type="table" w:styleId="11">
     <w:name w:val="Medium Shading 1"/>
-    <w:basedOn w:val="TableNormal"/>
+    <w:basedOn w:val="a3"/>
     <w:uiPriority w:val="63"/>
     <w:rsid w:val="00CB0664"/>
     <w:pPr>
@@ -15579,9 +15703,9 @@
       </w:tcPr>
     </w:tblStylePr>
   </w:style>
-  <w:style w:type="table" w:styleId="MediumShading1-Accent1">
+  <w:style w:type="table" w:styleId="1-1">
     <w:name w:val="Medium Shading 1 Accent 1"/>
-    <w:basedOn w:val="TableNormal"/>
+    <w:basedOn w:val="a3"/>
     <w:uiPriority w:val="63"/>
     <w:rsid w:val="00CB0664"/>
     <w:pPr>
@@ -15685,9 +15809,9 @@
       </w:tcPr>
     </w:tblStylePr>
   </w:style>
-  <w:style w:type="table" w:styleId="MediumShading1-Accent2">
+  <w:style w:type="table" w:styleId="1-2">
     <w:name w:val="Medium Shading 1 Accent 2"/>
-    <w:basedOn w:val="TableNormal"/>
+    <w:basedOn w:val="a3"/>
     <w:uiPriority w:val="63"/>
     <w:rsid w:val="00CB0664"/>
     <w:pPr>
@@ -15791,9 +15915,9 @@
       </w:tcPr>
     </w:tblStylePr>
   </w:style>
-  <w:style w:type="table" w:styleId="MediumShading1-Accent3">
+  <w:style w:type="table" w:styleId="1-3">
     <w:name w:val="Medium Shading 1 Accent 3"/>
-    <w:basedOn w:val="TableNormal"/>
+    <w:basedOn w:val="a3"/>
     <w:uiPriority w:val="63"/>
     <w:rsid w:val="00CB0664"/>
     <w:pPr>
@@ -15897,9 +16021,9 @@
       </w:tcPr>
     </w:tblStylePr>
   </w:style>
-  <w:style w:type="table" w:styleId="MediumShading1-Accent4">
+  <w:style w:type="table" w:styleId="1-4">
     <w:name w:val="Medium Shading 1 Accent 4"/>
-    <w:basedOn w:val="TableNormal"/>
+    <w:basedOn w:val="a3"/>
     <w:uiPriority w:val="63"/>
     <w:rsid w:val="00CB0664"/>
     <w:pPr>
@@ -16003,9 +16127,9 @@
       </w:tcPr>
     </w:tblStylePr>
   </w:style>
-  <w:style w:type="table" w:styleId="MediumShading1-Accent5">
+  <w:style w:type="table" w:styleId="1-5">
     <w:name w:val="Medium Shading 1 Accent 5"/>
-    <w:basedOn w:val="TableNormal"/>
+    <w:basedOn w:val="a3"/>
     <w:uiPriority w:val="63"/>
     <w:rsid w:val="00CB0664"/>
     <w:pPr>
@@ -16109,9 +16233,9 @@
       </w:tcPr>
     </w:tblStylePr>
   </w:style>
-  <w:style w:type="table" w:styleId="MediumShading1-Accent6">
+  <w:style w:type="table" w:styleId="1-6">
     <w:name w:val="Medium Shading 1 Accent 6"/>
-    <w:basedOn w:val="TableNormal"/>
+    <w:basedOn w:val="a3"/>
     <w:uiPriority w:val="63"/>
     <w:rsid w:val="00CB0664"/>
     <w:pPr>
@@ -16215,9 +16339,9 @@
       </w:tcPr>
     </w:tblStylePr>
   </w:style>
-  <w:style w:type="table" w:styleId="MediumShading2">
+  <w:style w:type="table" w:styleId="29">
     <w:name w:val="Medium Shading 2"/>
-    <w:basedOn w:val="TableNormal"/>
+    <w:basedOn w:val="a3"/>
     <w:uiPriority w:val="64"/>
     <w:rsid w:val="00CB0664"/>
     <w:pPr>
@@ -16364,9 +16488,9 @@
       </w:tcPr>
     </w:tblStylePr>
   </w:style>
-  <w:style w:type="table" w:styleId="MediumShading2-Accent1">
+  <w:style w:type="table" w:styleId="2-1">
     <w:name w:val="Medium Shading 2 Accent 1"/>
-    <w:basedOn w:val="TableNormal"/>
+    <w:basedOn w:val="a3"/>
     <w:uiPriority w:val="64"/>
     <w:rsid w:val="00CB0664"/>
     <w:pPr>
@@ -16513,9 +16637,9 @@
       </w:tcPr>
     </w:tblStylePr>
   </w:style>
-  <w:style w:type="table" w:styleId="MediumShading2-Accent2">
+  <w:style w:type="table" w:styleId="2-2">
     <w:name w:val="Medium Shading 2 Accent 2"/>
-    <w:basedOn w:val="TableNormal"/>
+    <w:basedOn w:val="a3"/>
     <w:uiPriority w:val="64"/>
     <w:rsid w:val="00CB0664"/>
     <w:pPr>
@@ -16662,9 +16786,9 @@
       </w:tcPr>
     </w:tblStylePr>
   </w:style>
-  <w:style w:type="table" w:styleId="MediumShading2-Accent3">
+  <w:style w:type="table" w:styleId="2-3">
     <w:name w:val="Medium Shading 2 Accent 3"/>
-    <w:basedOn w:val="TableNormal"/>
+    <w:basedOn w:val="a3"/>
     <w:uiPriority w:val="64"/>
     <w:rsid w:val="00CB0664"/>
     <w:pPr>
@@ -16811,9 +16935,9 @@
       </w:tcPr>
     </w:tblStylePr>
   </w:style>
-  <w:style w:type="table" w:styleId="MediumShading2-Accent4">
+  <w:style w:type="table" w:styleId="2-4">
     <w:name w:val="Medium Shading 2 Accent 4"/>
-    <w:basedOn w:val="TableNormal"/>
+    <w:basedOn w:val="a3"/>
     <w:uiPriority w:val="64"/>
     <w:rsid w:val="00CB0664"/>
     <w:pPr>
@@ -16960,9 +17084,9 @@
       </w:tcPr>
     </w:tblStylePr>
   </w:style>
-  <w:style w:type="table" w:styleId="MediumShading2-Accent5">
+  <w:style w:type="table" w:styleId="2-5">
     <w:name w:val="Medium Shading 2 Accent 5"/>
-    <w:basedOn w:val="TableNormal"/>
+    <w:basedOn w:val="a3"/>
     <w:uiPriority w:val="64"/>
     <w:rsid w:val="00CB0664"/>
     <w:pPr>
@@ -17109,9 +17233,9 @@
       </w:tcPr>
     </w:tblStylePr>
   </w:style>
-  <w:style w:type="table" w:styleId="MediumShading2-Accent6">
+  <w:style w:type="table" w:styleId="2-6">
     <w:name w:val="Medium Shading 2 Accent 6"/>
-    <w:basedOn w:val="TableNormal"/>
+    <w:basedOn w:val="a3"/>
     <w:uiPriority w:val="64"/>
     <w:rsid w:val="00CB0664"/>
     <w:pPr>
@@ -17258,9 +17382,9 @@
       </w:tcPr>
     </w:tblStylePr>
   </w:style>
-  <w:style w:type="table" w:styleId="MediumList1">
+  <w:style w:type="table" w:styleId="12">
     <w:name w:val="Medium List 1"/>
-    <w:basedOn w:val="TableNormal"/>
+    <w:basedOn w:val="a3"/>
     <w:uiPriority w:val="65"/>
     <w:rsid w:val="00CB0664"/>
     <w:pPr>
@@ -17342,9 +17466,9 @@
       </w:tcPr>
     </w:tblStylePr>
   </w:style>
-  <w:style w:type="table" w:styleId="MediumList1-Accent1">
+  <w:style w:type="table" w:styleId="1-10">
     <w:name w:val="Medium List 1 Accent 1"/>
-    <w:basedOn w:val="TableNormal"/>
+    <w:basedOn w:val="a3"/>
     <w:uiPriority w:val="65"/>
     <w:rsid w:val="00CB0664"/>
     <w:pPr>
@@ -17426,9 +17550,9 @@
       </w:tcPr>
     </w:tblStylePr>
   </w:style>
-  <w:style w:type="table" w:styleId="MediumList1-Accent2">
+  <w:style w:type="table" w:styleId="1-20">
     <w:name w:val="Medium List 1 Accent 2"/>
-    <w:basedOn w:val="TableNormal"/>
+    <w:basedOn w:val="a3"/>
     <w:uiPriority w:val="65"/>
     <w:rsid w:val="00CB0664"/>
     <w:pPr>
@@ -17510,9 +17634,9 @@
       </w:tcPr>
     </w:tblStylePr>
   </w:style>
-  <w:style w:type="table" w:styleId="MediumList1-Accent3">
+  <w:style w:type="table" w:styleId="1-30">
     <w:name w:val="Medium List 1 Accent 3"/>
-    <w:basedOn w:val="TableNormal"/>
+    <w:basedOn w:val="a3"/>
     <w:uiPriority w:val="65"/>
     <w:rsid w:val="00CB0664"/>
     <w:pPr>
@@ -17594,9 +17718,9 @@
       </w:tcPr>
     </w:tblStylePr>
   </w:style>
-  <w:style w:type="table" w:styleId="MediumList1-Accent4">
+  <w:style w:type="table" w:styleId="1-40">
     <w:name w:val="Medium List 1 Accent 4"/>
-    <w:basedOn w:val="TableNormal"/>
+    <w:basedOn w:val="a3"/>
     <w:uiPriority w:val="65"/>
     <w:rsid w:val="00CB0664"/>
     <w:pPr>
@@ -17678,9 +17802,9 @@
       </w:tcPr>
     </w:tblStylePr>
   </w:style>
-  <w:style w:type="table" w:styleId="MediumList1-Accent5">
+  <w:style w:type="table" w:styleId="1-50">
     <w:name w:val="Medium List 1 Accent 5"/>
-    <w:basedOn w:val="TableNormal"/>
+    <w:basedOn w:val="a3"/>
     <w:uiPriority w:val="65"/>
     <w:rsid w:val="00CB0664"/>
     <w:pPr>
@@ -17762,9 +17886,9 @@
       </w:tcPr>
     </w:tblStylePr>
   </w:style>
-  <w:style w:type="table" w:styleId="MediumList1-Accent6">
+  <w:style w:type="table" w:styleId="1-60">
     <w:name w:val="Medium List 1 Accent 6"/>
-    <w:basedOn w:val="TableNormal"/>
+    <w:basedOn w:val="a3"/>
     <w:uiPriority w:val="65"/>
     <w:rsid w:val="00CB0664"/>
     <w:pPr>
@@ -17846,9 +17970,9 @@
       </w:tcPr>
     </w:tblStylePr>
   </w:style>
-  <w:style w:type="table" w:styleId="MediumList2">
+  <w:style w:type="table" w:styleId="2a">
     <w:name w:val="Medium List 2"/>
-    <w:basedOn w:val="TableNormal"/>
+    <w:basedOn w:val="a3"/>
     <w:uiPriority w:val="66"/>
     <w:rsid w:val="00CB0664"/>
     <w:pPr>
@@ -17974,9 +18098,9 @@
       </w:tcPr>
     </w:tblStylePr>
   </w:style>
-  <w:style w:type="table" w:styleId="MediumList2-Accent1">
+  <w:style w:type="table" w:styleId="2-10">
     <w:name w:val="Medium List 2 Accent 1"/>
-    <w:basedOn w:val="TableNormal"/>
+    <w:basedOn w:val="a3"/>
     <w:uiPriority w:val="66"/>
     <w:rsid w:val="00CB0664"/>
     <w:pPr>
@@ -18102,9 +18226,9 @@
       </w:tcPr>
     </w:tblStylePr>
   </w:style>
-  <w:style w:type="table" w:styleId="MediumList2-Accent2">
+  <w:style w:type="table" w:styleId="2-20">
     <w:name w:val="Medium List 2 Accent 2"/>
-    <w:basedOn w:val="TableNormal"/>
+    <w:basedOn w:val="a3"/>
     <w:uiPriority w:val="66"/>
     <w:rsid w:val="00CB0664"/>
     <w:pPr>
@@ -18230,9 +18354,9 @@
       </w:tcPr>
     </w:tblStylePr>
   </w:style>
-  <w:style w:type="table" w:styleId="MediumList2-Accent3">
+  <w:style w:type="table" w:styleId="2-30">
     <w:name w:val="Medium List 2 Accent 3"/>
-    <w:basedOn w:val="TableNormal"/>
+    <w:basedOn w:val="a3"/>
     <w:uiPriority w:val="66"/>
     <w:rsid w:val="00CB0664"/>
     <w:pPr>
@@ -18358,9 +18482,9 @@
       </w:tcPr>
     </w:tblStylePr>
   </w:style>
-  <w:style w:type="table" w:styleId="MediumList2-Accent4">
+  <w:style w:type="table" w:styleId="2-40">
     <w:name w:val="Medium List 2 Accent 4"/>
-    <w:basedOn w:val="TableNormal"/>
+    <w:basedOn w:val="a3"/>
     <w:uiPriority w:val="66"/>
     <w:rsid w:val="00CB0664"/>
     <w:pPr>
@@ -18486,9 +18610,9 @@
       </w:tcPr>
     </w:tblStylePr>
   </w:style>
-  <w:style w:type="table" w:styleId="MediumList2-Accent5">
+  <w:style w:type="table" w:styleId="2-50">
     <w:name w:val="Medium List 2 Accent 5"/>
-    <w:basedOn w:val="TableNormal"/>
+    <w:basedOn w:val="a3"/>
     <w:uiPriority w:val="66"/>
     <w:rsid w:val="00CB0664"/>
     <w:pPr>
@@ -18614,9 +18738,9 @@
       </w:tcPr>
     </w:tblStylePr>
   </w:style>
-  <w:style w:type="table" w:styleId="MediumList2-Accent6">
+  <w:style w:type="table" w:styleId="2-60">
     <w:name w:val="Medium List 2 Accent 6"/>
-    <w:basedOn w:val="TableNormal"/>
+    <w:basedOn w:val="a3"/>
     <w:uiPriority w:val="66"/>
     <w:rsid w:val="00CB0664"/>
     <w:pPr>
@@ -18742,9 +18866,9 @@
       </w:tcPr>
     </w:tblStylePr>
   </w:style>
-  <w:style w:type="table" w:styleId="MediumGrid1">
+  <w:style w:type="table" w:styleId="13">
     <w:name w:val="Medium Grid 1"/>
-    <w:basedOn w:val="TableNormal"/>
+    <w:basedOn w:val="a3"/>
     <w:uiPriority w:val="67"/>
     <w:rsid w:val="00CB0664"/>
     <w:pPr>
@@ -18815,9 +18939,9 @@
       </w:tcPr>
     </w:tblStylePr>
   </w:style>
-  <w:style w:type="table" w:styleId="MediumGrid1-Accent1">
+  <w:style w:type="table" w:styleId="1-11">
     <w:name w:val="Medium Grid 1 Accent 1"/>
-    <w:basedOn w:val="TableNormal"/>
+    <w:basedOn w:val="a3"/>
     <w:uiPriority w:val="67"/>
     <w:rsid w:val="00CB0664"/>
     <w:pPr>
@@ -18888,9 +19012,9 @@
       </w:tcPr>
     </w:tblStylePr>
   </w:style>
-  <w:style w:type="table" w:styleId="MediumGrid1-Accent2">
+  <w:style w:type="table" w:styleId="1-21">
     <w:name w:val="Medium Grid 1 Accent 2"/>
-    <w:basedOn w:val="TableNormal"/>
+    <w:basedOn w:val="a3"/>
     <w:uiPriority w:val="67"/>
     <w:rsid w:val="00CB0664"/>
     <w:pPr>
@@ -18961,9 +19085,9 @@
       </w:tcPr>
     </w:tblStylePr>
   </w:style>
-  <w:style w:type="table" w:styleId="MediumGrid1-Accent3">
+  <w:style w:type="table" w:styleId="1-31">
     <w:name w:val="Medium Grid 1 Accent 3"/>
-    <w:basedOn w:val="TableNormal"/>
+    <w:basedOn w:val="a3"/>
     <w:uiPriority w:val="67"/>
     <w:rsid w:val="00CB0664"/>
     <w:pPr>
@@ -19034,9 +19158,9 @@
       </w:tcPr>
     </w:tblStylePr>
   </w:style>
-  <w:style w:type="table" w:styleId="MediumGrid1-Accent4">
+  <w:style w:type="table" w:styleId="1-41">
     <w:name w:val="Medium Grid 1 Accent 4"/>
-    <w:basedOn w:val="TableNormal"/>
+    <w:basedOn w:val="a3"/>
     <w:uiPriority w:val="67"/>
     <w:rsid w:val="00CB0664"/>
     <w:pPr>
@@ -19107,9 +19231,9 @@
       </w:tcPr>
     </w:tblStylePr>
   </w:style>
-  <w:style w:type="table" w:styleId="MediumGrid1-Accent5">
+  <w:style w:type="table" w:styleId="1-51">
     <w:name w:val="Medium Grid 1 Accent 5"/>
-    <w:basedOn w:val="TableNormal"/>
+    <w:basedOn w:val="a3"/>
     <w:uiPriority w:val="67"/>
     <w:rsid w:val="00CB0664"/>
     <w:pPr>
@@ -19180,9 +19304,9 @@
       </w:tcPr>
     </w:tblStylePr>
   </w:style>
-  <w:style w:type="table" w:styleId="MediumGrid1-Accent6">
+  <w:style w:type="table" w:styleId="1-61">
     <w:name w:val="Medium Grid 1 Accent 6"/>
-    <w:basedOn w:val="TableNormal"/>
+    <w:basedOn w:val="a3"/>
     <w:uiPriority w:val="67"/>
     <w:rsid w:val="00CB0664"/>
     <w:pPr>
@@ -19253,9 +19377,9 @@
       </w:tcPr>
     </w:tblStylePr>
   </w:style>
-  <w:style w:type="table" w:styleId="MediumGrid2">
+  <w:style w:type="table" w:styleId="2b">
     <w:name w:val="Medium Grid 2"/>
-    <w:basedOn w:val="TableNormal"/>
+    <w:basedOn w:val="a3"/>
     <w:uiPriority w:val="68"/>
     <w:rsid w:val="00CB0664"/>
     <w:pPr>
@@ -19378,9 +19502,9 @@
       </w:tcPr>
     </w:tblStylePr>
   </w:style>
-  <w:style w:type="table" w:styleId="MediumGrid2-Accent1">
+  <w:style w:type="table" w:styleId="2-11">
     <w:name w:val="Medium Grid 2 Accent 1"/>
-    <w:basedOn w:val="TableNormal"/>
+    <w:basedOn w:val="a3"/>
     <w:uiPriority w:val="68"/>
     <w:rsid w:val="00CB0664"/>
     <w:pPr>
@@ -19503,9 +19627,9 @@
       </w:tcPr>
     </w:tblStylePr>
   </w:style>
-  <w:style w:type="table" w:styleId="MediumGrid2-Accent2">
+  <w:style w:type="table" w:styleId="2-21">
     <w:name w:val="Medium Grid 2 Accent 2"/>
-    <w:basedOn w:val="TableNormal"/>
+    <w:basedOn w:val="a3"/>
     <w:uiPriority w:val="68"/>
     <w:rsid w:val="00CB0664"/>
     <w:pPr>
@@ -19628,9 +19752,9 @@
       </w:tcPr>
     </w:tblStylePr>
   </w:style>
-  <w:style w:type="table" w:styleId="MediumGrid2-Accent3">
+  <w:style w:type="table" w:styleId="2-31">
     <w:name w:val="Medium Grid 2 Accent 3"/>
-    <w:basedOn w:val="TableNormal"/>
+    <w:basedOn w:val="a3"/>
     <w:uiPriority w:val="68"/>
     <w:rsid w:val="00CB0664"/>
     <w:pPr>
@@ -19753,9 +19877,9 @@
       </w:tcPr>
     </w:tblStylePr>
   </w:style>
-  <w:style w:type="table" w:styleId="MediumGrid2-Accent4">
+  <w:style w:type="table" w:styleId="2-41">
     <w:name w:val="Medium Grid 2 Accent 4"/>
-    <w:basedOn w:val="TableNormal"/>
+    <w:basedOn w:val="a3"/>
     <w:uiPriority w:val="68"/>
     <w:rsid w:val="00CB0664"/>
     <w:pPr>
@@ -19878,9 +20002,9 @@
       </w:tcPr>
     </w:tblStylePr>
   </w:style>
-  <w:style w:type="table" w:styleId="MediumGrid2-Accent5">
+  <w:style w:type="table" w:styleId="2-51">
     <w:name w:val="Medium Grid 2 Accent 5"/>
-    <w:basedOn w:val="TableNormal"/>
+    <w:basedOn w:val="a3"/>
     <w:uiPriority w:val="68"/>
     <w:rsid w:val="00CB0664"/>
     <w:pPr>
@@ -20003,9 +20127,9 @@
       </w:tcPr>
     </w:tblStylePr>
   </w:style>
-  <w:style w:type="table" w:styleId="MediumGrid2-Accent6">
+  <w:style w:type="table" w:styleId="2-61">
     <w:name w:val="Medium Grid 2 Accent 6"/>
-    <w:basedOn w:val="TableNormal"/>
+    <w:basedOn w:val="a3"/>
     <w:uiPriority w:val="68"/>
     <w:rsid w:val="00CB0664"/>
     <w:pPr>
@@ -20128,9 +20252,9 @@
       </w:tcPr>
     </w:tblStylePr>
   </w:style>
-  <w:style w:type="table" w:styleId="MediumGrid3">
+  <w:style w:type="table" w:styleId="37">
     <w:name w:val="Medium Grid 3"/>
-    <w:basedOn w:val="TableNormal"/>
+    <w:basedOn w:val="a3"/>
     <w:uiPriority w:val="69"/>
     <w:rsid w:val="00CB0664"/>
     <w:pPr>
@@ -20269,9 +20393,9 @@
       </w:tcPr>
     </w:tblStylePr>
   </w:style>
-  <w:style w:type="table" w:styleId="MediumGrid3-Accent1">
+  <w:style w:type="table" w:styleId="3-1">
     <w:name w:val="Medium Grid 3 Accent 1"/>
-    <w:basedOn w:val="TableNormal"/>
+    <w:basedOn w:val="a3"/>
     <w:uiPriority w:val="69"/>
     <w:rsid w:val="00CB0664"/>
     <w:pPr>
@@ -20410,9 +20534,9 @@
       </w:tcPr>
     </w:tblStylePr>
   </w:style>
-  <w:style w:type="table" w:styleId="MediumGrid3-Accent2">
+  <w:style w:type="table" w:styleId="3-2">
     <w:name w:val="Medium Grid 3 Accent 2"/>
-    <w:basedOn w:val="TableNormal"/>
+    <w:basedOn w:val="a3"/>
     <w:uiPriority w:val="69"/>
     <w:rsid w:val="00CB0664"/>
     <w:pPr>
@@ -20551,9 +20675,9 @@
       </w:tcPr>
     </w:tblStylePr>
   </w:style>
-  <w:style w:type="table" w:styleId="MediumGrid3-Accent3">
+  <w:style w:type="table" w:styleId="3-3">
     <w:name w:val="Medium Grid 3 Accent 3"/>
-    <w:basedOn w:val="TableNormal"/>
+    <w:basedOn w:val="a3"/>
     <w:uiPriority w:val="69"/>
     <w:rsid w:val="00CB0664"/>
     <w:pPr>
@@ -20692,9 +20816,9 @@
       </w:tcPr>
     </w:tblStylePr>
   </w:style>
-  <w:style w:type="table" w:styleId="MediumGrid3-Accent4">
+  <w:style w:type="table" w:styleId="3-4">
     <w:name w:val="Medium Grid 3 Accent 4"/>
-    <w:basedOn w:val="TableNormal"/>
+    <w:basedOn w:val="a3"/>
     <w:uiPriority w:val="69"/>
     <w:rsid w:val="00CB0664"/>
     <w:pPr>
@@ -20833,9 +20957,9 @@
       </w:tcPr>
     </w:tblStylePr>
   </w:style>
-  <w:style w:type="table" w:styleId="MediumGrid3-Accent5">
+  <w:style w:type="table" w:styleId="3-5">
     <w:name w:val="Medium Grid 3 Accent 5"/>
-    <w:basedOn w:val="TableNormal"/>
+    <w:basedOn w:val="a3"/>
     <w:uiPriority w:val="69"/>
     <w:rsid w:val="00CB0664"/>
     <w:pPr>
@@ -20974,9 +21098,9 @@
       </w:tcPr>
     </w:tblStylePr>
   </w:style>
-  <w:style w:type="table" w:styleId="MediumGrid3-Accent6">
+  <w:style w:type="table" w:styleId="3-6">
     <w:name w:val="Medium Grid 3 Accent 6"/>
-    <w:basedOn w:val="TableNormal"/>
+    <w:basedOn w:val="a3"/>
     <w:uiPriority w:val="69"/>
     <w:rsid w:val="00CB0664"/>
     <w:pPr>
@@ -21115,9 +21239,9 @@
       </w:tcPr>
     </w:tblStylePr>
   </w:style>
-  <w:style w:type="table" w:styleId="DarkList">
+  <w:style w:type="table" w:styleId="aff4">
     <w:name w:val="Dark List"/>
-    <w:basedOn w:val="TableNormal"/>
+    <w:basedOn w:val="a3"/>
     <w:uiPriority w:val="70"/>
     <w:rsid w:val="00CB0664"/>
     <w:pPr>
@@ -21229,9 +21353,9 @@
       </w:tcPr>
     </w:tblStylePr>
   </w:style>
-  <w:style w:type="table" w:styleId="DarkList-Accent1">
+  <w:style w:type="table" w:styleId="-12">
     <w:name w:val="Dark List Accent 1"/>
-    <w:basedOn w:val="TableNormal"/>
+    <w:basedOn w:val="a3"/>
     <w:uiPriority w:val="70"/>
     <w:rsid w:val="00CB0664"/>
     <w:pPr>
@@ -21343,9 +21467,9 @@
       </w:tcPr>
     </w:tblStylePr>
   </w:style>
-  <w:style w:type="table" w:styleId="DarkList-Accent2">
+  <w:style w:type="table" w:styleId="-22">
     <w:name w:val="Dark List Accent 2"/>
-    <w:basedOn w:val="TableNormal"/>
+    <w:basedOn w:val="a3"/>
     <w:uiPriority w:val="70"/>
     <w:rsid w:val="00CB0664"/>
     <w:pPr>
@@ -21457,9 +21581,9 @@
       </w:tcPr>
     </w:tblStylePr>
   </w:style>
-  <w:style w:type="table" w:styleId="DarkList-Accent3">
+  <w:style w:type="table" w:styleId="-32">
     <w:name w:val="Dark List Accent 3"/>
-    <w:basedOn w:val="TableNormal"/>
+    <w:basedOn w:val="a3"/>
     <w:uiPriority w:val="70"/>
     <w:rsid w:val="00CB0664"/>
     <w:pPr>
@@ -21571,9 +21695,9 @@
       </w:tcPr>
     </w:tblStylePr>
   </w:style>
-  <w:style w:type="table" w:styleId="DarkList-Accent4">
+  <w:style w:type="table" w:styleId="-42">
     <w:name w:val="Dark List Accent 4"/>
-    <w:basedOn w:val="TableNormal"/>
+    <w:basedOn w:val="a3"/>
     <w:uiPriority w:val="70"/>
     <w:rsid w:val="00CB0664"/>
     <w:pPr>
@@ -21685,9 +21809,9 @@
       </w:tcPr>
     </w:tblStylePr>
   </w:style>
-  <w:style w:type="table" w:styleId="DarkList-Accent5">
+  <w:style w:type="table" w:styleId="-52">
     <w:name w:val="Dark List Accent 5"/>
-    <w:basedOn w:val="TableNormal"/>
+    <w:basedOn w:val="a3"/>
     <w:uiPriority w:val="70"/>
     <w:rsid w:val="00CB0664"/>
     <w:pPr>
@@ -21799,9 +21923,9 @@
       </w:tcPr>
     </w:tblStylePr>
   </w:style>
-  <w:style w:type="table" w:styleId="DarkList-Accent6">
+  <w:style w:type="table" w:styleId="-62">
     <w:name w:val="Dark List Accent 6"/>
-    <w:basedOn w:val="TableNormal"/>
+    <w:basedOn w:val="a3"/>
     <w:uiPriority w:val="70"/>
     <w:rsid w:val="00CB0664"/>
     <w:pPr>
@@ -21913,9 +22037,9 @@
       </w:tcPr>
     </w:tblStylePr>
   </w:style>
-  <w:style w:type="table" w:styleId="ColorfulShading">
+  <w:style w:type="table" w:styleId="aff5">
     <w:name w:val="Colorful Shading"/>
-    <w:basedOn w:val="TableNormal"/>
+    <w:basedOn w:val="a3"/>
     <w:uiPriority w:val="71"/>
     <w:rsid w:val="00CB0664"/>
     <w:pPr>
@@ -22035,9 +22159,9 @@
       </w:rPr>
     </w:tblStylePr>
   </w:style>
-  <w:style w:type="table" w:styleId="ColorfulShading-Accent1">
+  <w:style w:type="table" w:styleId="-13">
     <w:name w:val="Colorful Shading Accent 1"/>
-    <w:basedOn w:val="TableNormal"/>
+    <w:basedOn w:val="a3"/>
     <w:uiPriority w:val="71"/>
     <w:rsid w:val="00CB0664"/>
     <w:pPr>
@@ -22157,9 +22281,9 @@
       </w:rPr>
     </w:tblStylePr>
   </w:style>
-  <w:style w:type="table" w:styleId="ColorfulShading-Accent2">
+  <w:style w:type="table" w:styleId="-23">
     <w:name w:val="Colorful Shading Accent 2"/>
-    <w:basedOn w:val="TableNormal"/>
+    <w:basedOn w:val="a3"/>
     <w:uiPriority w:val="71"/>
     <w:rsid w:val="00CB0664"/>
     <w:pPr>
@@ -22279,9 +22403,9 @@
       </w:rPr>
     </w:tblStylePr>
   </w:style>
-  <w:style w:type="table" w:styleId="ColorfulShading-Accent3">
+  <w:style w:type="table" w:styleId="-33">
     <w:name w:val="Colorful Shading Accent 3"/>
-    <w:basedOn w:val="TableNormal"/>
+    <w:basedOn w:val="a3"/>
     <w:uiPriority w:val="71"/>
     <w:rsid w:val="00CB0664"/>
     <w:pPr>
@@ -22391,9 +22515,9 @@
       </w:tcPr>
     </w:tblStylePr>
   </w:style>
-  <w:style w:type="table" w:styleId="ColorfulShading-Accent4">
+  <w:style w:type="table" w:styleId="-43">
     <w:name w:val="Colorful Shading Accent 4"/>
-    <w:basedOn w:val="TableNormal"/>
+    <w:basedOn w:val="a3"/>
     <w:uiPriority w:val="71"/>
     <w:rsid w:val="00CB0664"/>
     <w:pPr>
@@ -22513,9 +22637,9 @@
       </w:rPr>
     </w:tblStylePr>
   </w:style>
-  <w:style w:type="table" w:styleId="ColorfulShading-Accent5">
+  <w:style w:type="table" w:styleId="-53">
     <w:name w:val="Colorful Shading Accent 5"/>
-    <w:basedOn w:val="TableNormal"/>
+    <w:basedOn w:val="a3"/>
     <w:uiPriority w:val="71"/>
     <w:rsid w:val="00CB0664"/>
     <w:pPr>
@@ -22635,9 +22759,9 @@
       </w:rPr>
     </w:tblStylePr>
   </w:style>
-  <w:style w:type="table" w:styleId="ColorfulShading-Accent6">
+  <w:style w:type="table" w:styleId="-63">
     <w:name w:val="Colorful Shading Accent 6"/>
-    <w:basedOn w:val="TableNormal"/>
+    <w:basedOn w:val="a3"/>
     <w:uiPriority w:val="71"/>
     <w:rsid w:val="00CB0664"/>
     <w:pPr>
@@ -22757,9 +22881,9 @@
       </w:rPr>
     </w:tblStylePr>
   </w:style>
-  <w:style w:type="table" w:styleId="ColorfulList">
+  <w:style w:type="table" w:styleId="aff6">
     <w:name w:val="Colorful List"/>
-    <w:basedOn w:val="TableNormal"/>
+    <w:basedOn w:val="a3"/>
     <w:uiPriority w:val="72"/>
     <w:rsid w:val="00CB0664"/>
     <w:pPr>
@@ -22843,9 +22967,9 @@
       </w:tcPr>
     </w:tblStylePr>
   </w:style>
-  <w:style w:type="table" w:styleId="ColorfulList-Accent1">
+  <w:style w:type="table" w:styleId="-14">
     <w:name w:val="Colorful List Accent 1"/>
-    <w:basedOn w:val="TableNormal"/>
+    <w:basedOn w:val="a3"/>
     <w:uiPriority w:val="72"/>
     <w:rsid w:val="00CB0664"/>
     <w:pPr>
@@ -22929,9 +23053,9 @@
       </w:tcPr>
     </w:tblStylePr>
   </w:style>
-  <w:style w:type="table" w:styleId="ColorfulList-Accent2">
+  <w:style w:type="table" w:styleId="-24">
     <w:name w:val="Colorful List Accent 2"/>
-    <w:basedOn w:val="TableNormal"/>
+    <w:basedOn w:val="a3"/>
     <w:uiPriority w:val="72"/>
     <w:rsid w:val="00CB0664"/>
     <w:pPr>
@@ -23015,9 +23139,9 @@
       </w:tcPr>
     </w:tblStylePr>
   </w:style>
-  <w:style w:type="table" w:styleId="ColorfulList-Accent3">
+  <w:style w:type="table" w:styleId="-34">
     <w:name w:val="Colorful List Accent 3"/>
-    <w:basedOn w:val="TableNormal"/>
+    <w:basedOn w:val="a3"/>
     <w:uiPriority w:val="72"/>
     <w:rsid w:val="00CB0664"/>
     <w:pPr>
@@ -23101,9 +23225,9 @@
       </w:tcPr>
     </w:tblStylePr>
   </w:style>
-  <w:style w:type="table" w:styleId="ColorfulList-Accent4">
+  <w:style w:type="table" w:styleId="-44">
     <w:name w:val="Colorful List Accent 4"/>
-    <w:basedOn w:val="TableNormal"/>
+    <w:basedOn w:val="a3"/>
     <w:uiPriority w:val="72"/>
     <w:rsid w:val="00CB0664"/>
     <w:pPr>
@@ -23187,9 +23311,9 @@
       </w:tcPr>
     </w:tblStylePr>
   </w:style>
-  <w:style w:type="table" w:styleId="ColorfulList-Accent5">
+  <w:style w:type="table" w:styleId="-54">
     <w:name w:val="Colorful List Accent 5"/>
-    <w:basedOn w:val="TableNormal"/>
+    <w:basedOn w:val="a3"/>
     <w:uiPriority w:val="72"/>
     <w:rsid w:val="00CB0664"/>
     <w:pPr>
@@ -23273,9 +23397,9 @@
       </w:tcPr>
     </w:tblStylePr>
   </w:style>
-  <w:style w:type="table" w:styleId="ColorfulList-Accent6">
+  <w:style w:type="table" w:styleId="-64">
     <w:name w:val="Colorful List Accent 6"/>
-    <w:basedOn w:val="TableNormal"/>
+    <w:basedOn w:val="a3"/>
     <w:uiPriority w:val="72"/>
     <w:rsid w:val="00CB0664"/>
     <w:pPr>
@@ -23359,9 +23483,9 @@
       </w:tcPr>
     </w:tblStylePr>
   </w:style>
-  <w:style w:type="table" w:styleId="ColorfulGrid">
+  <w:style w:type="table" w:styleId="aff7">
     <w:name w:val="Colorful Grid"/>
-    <w:basedOn w:val="TableNormal"/>
+    <w:basedOn w:val="a3"/>
     <w:uiPriority w:val="73"/>
     <w:rsid w:val="00CB0664"/>
     <w:pPr>
@@ -23439,9 +23563,9 @@
       </w:tcPr>
     </w:tblStylePr>
   </w:style>
-  <w:style w:type="table" w:styleId="ColorfulGrid-Accent1">
+  <w:style w:type="table" w:styleId="-15">
     <w:name w:val="Colorful Grid Accent 1"/>
-    <w:basedOn w:val="TableNormal"/>
+    <w:basedOn w:val="a3"/>
     <w:uiPriority w:val="73"/>
     <w:rsid w:val="00CB0664"/>
     <w:pPr>
@@ -23519,9 +23643,9 @@
       </w:tcPr>
     </w:tblStylePr>
   </w:style>
-  <w:style w:type="table" w:styleId="ColorfulGrid-Accent2">
+  <w:style w:type="table" w:styleId="-25">
     <w:name w:val="Colorful Grid Accent 2"/>
-    <w:basedOn w:val="TableNormal"/>
+    <w:basedOn w:val="a3"/>
     <w:uiPriority w:val="73"/>
     <w:rsid w:val="00CB0664"/>
     <w:pPr>
@@ -23599,9 +23723,9 @@
       </w:tcPr>
     </w:tblStylePr>
   </w:style>
-  <w:style w:type="table" w:styleId="ColorfulGrid-Accent3">
+  <w:style w:type="table" w:styleId="-35">
     <w:name w:val="Colorful Grid Accent 3"/>
-    <w:basedOn w:val="TableNormal"/>
+    <w:basedOn w:val="a3"/>
     <w:uiPriority w:val="73"/>
     <w:rsid w:val="00CB0664"/>
     <w:pPr>
@@ -23679,9 +23803,9 @@
       </w:tcPr>
     </w:tblStylePr>
   </w:style>
-  <w:style w:type="table" w:styleId="ColorfulGrid-Accent4">
+  <w:style w:type="table" w:styleId="-45">
     <w:name w:val="Colorful Grid Accent 4"/>
-    <w:basedOn w:val="TableNormal"/>
+    <w:basedOn w:val="a3"/>
     <w:uiPriority w:val="73"/>
     <w:rsid w:val="00CB0664"/>
     <w:pPr>
@@ -23759,9 +23883,9 @@
       </w:tcPr>
     </w:tblStylePr>
   </w:style>
-  <w:style w:type="table" w:styleId="ColorfulGrid-Accent5">
+  <w:style w:type="table" w:styleId="-55">
     <w:name w:val="Colorful Grid Accent 5"/>
-    <w:basedOn w:val="TableNormal"/>
+    <w:basedOn w:val="a3"/>
     <w:uiPriority w:val="73"/>
     <w:rsid w:val="00CB0664"/>
     <w:pPr>
@@ -23839,9 +23963,9 @@
       </w:tcPr>
     </w:tblStylePr>
   </w:style>
-  <w:style w:type="table" w:styleId="ColorfulGrid-Accent6">
+  <w:style w:type="table" w:styleId="-65">
     <w:name w:val="Colorful Grid Accent 6"/>
-    <w:basedOn w:val="TableNormal"/>
+    <w:basedOn w:val="a3"/>
     <w:uiPriority w:val="73"/>
     <w:rsid w:val="00CB0664"/>
     <w:pPr>
@@ -24247,7 +24371,7 @@
 </file>
 
 <file path=customXml/itemProps1.xml><?xml version="1.0" encoding="utf-8"?>
-<ds:datastoreItem xmlns:ds="http://schemas.openxmlformats.org/officeDocument/2006/customXml" ds:itemID="{EF278816-EC6F-A645-907D-7F25AECB1D4A}">
+<ds:datastoreItem xmlns:ds="http://schemas.openxmlformats.org/officeDocument/2006/customXml" ds:itemID="{73F240BC-0F2F-4D3D-B83A-D82CEB7AA727}">
   <ds:schemaRefs>
     <ds:schemaRef ds:uri="http://schemas.openxmlformats.org/officeDocument/2006/bibliography"/>
   </ds:schemaRefs>

</xml_diff>

<commit_message>
Fix formatting preservation during placeholder replacement
- Rewrite merge_and_replace_paragraph to do in-place replacement when placeholder is within a single run, preserving original run formatting
- For placeholders split across multiple runs, use improved segment merging logic that preserves run boundaries
- Update template to include 'руб.' suffix after amount
- Regenerate expected_0001.docx and expected_0002.docx with correct date (10.09.2026) and proper formatting
</commit_message>
<xml_diff>
--- a/tests/documents/all_basic_fields/expected_0001.docx
+++ b/tests/documents/all_basic_fields/expected_0001.docx
@@ -3,143 +3,60 @@
 <w:document xmlns:wpc="http://schemas.microsoft.com/office/word/2010/wordprocessingCanvas" xmlns:mc="http://schemas.openxmlformats.org/markup-compatibility/2006" xmlns:o="urn:schemas-microsoft-com:office:office" xmlns:r="http://schemas.openxmlformats.org/officeDocument/2006/relationships" xmlns:m="http://schemas.openxmlformats.org/officeDocument/2006/math" xmlns:v="urn:schemas-microsoft-com:vml" xmlns:wp14="http://schemas.microsoft.com/office/word/2010/wordprocessingDrawing" xmlns:wp="http://schemas.openxmlformats.org/drawingml/2006/wordprocessingDrawing" xmlns:w10="urn:schemas-microsoft-com:office:word" xmlns:w="http://schemas.openxmlformats.org/wordprocessingml/2006/main" xmlns:w14="http://schemas.microsoft.com/office/word/2010/wordml" xmlns:wpg="http://schemas.microsoft.com/office/word/2010/wordprocessingGroup" xmlns:wpi="http://schemas.microsoft.com/office/word/2010/wordprocessingInk" xmlns:wne="http://schemas.microsoft.com/office/word/2006/wordml" xmlns:wps="http://schemas.microsoft.com/office/word/2010/wordprocessingShape" mc:Ignorable="w14 wp14">
   <w:body>
     <w:p>
-      <w:pPr>
-        <w:rPr>
-          <w:lang w:val="ru-RU"/>
-        </w:rPr>
-      </w:pPr>
       <w:r>
-        <w:rPr>
-          <w:lang w:val="ru-RU"/>
-        </w:rPr>
-        <w:t>Документ: Договор поставки</w:t>
+        <w:t xml:space="preserve">Документ: Договор поставки</w:t>
       </w:r>
     </w:p>
     <w:p>
-      <w:pPr>
-        <w:rPr>
-          <w:lang w:val="ru-RU"/>
-        </w:rPr>
-      </w:pPr>
       <w:r>
-        <w:rPr>
-          <w:lang w:val="ru-RU"/>
-        </w:rPr>
-        <w:t>Номер: 0001</w:t>
+        <w:t xml:space="preserve">Номер: 0001</w:t>
       </w:r>
     </w:p>
     <w:p>
-      <w:pPr>
-        <w:rPr>
-          <w:lang w:val="ru-RU"/>
-        </w:rPr>
-      </w:pPr>
+      <w:bookmarkStart w:id="0" w:name="_GoBack"/>
+      <w:bookmarkEnd w:id="0"/>
       <w:r>
-        <w:rPr>
-          <w:lang w:val="ru-RU"/>
-        </w:rPr>
-        <w:t>Дата: 09.09.2026</w:t>
+        <w:t xml:space="preserve">Дата: </w:t>
+      </w:r>
+      <w:r>
+        <w:t xml:space="preserve">10.09.2026</w:t>
       </w:r>
     </w:p>
     <w:p>
-      <w:pPr>
-        <w:rPr>
-          <w:lang w:val="ru-RU"/>
-        </w:rPr>
-      </w:pPr>
       <w:r>
-        <w:rPr>
-          <w:lang w:val="ru-RU"/>
-        </w:rPr>
-        <w:t>Клиент: Клиент 1</w:t>
+        <w:t xml:space="preserve">Клиент: Клиент 1</w:t>
       </w:r>
     </w:p>
     <w:p>
-      <w:pPr>
-        <w:rPr>
-          <w:lang w:val="ru-RU"/>
-        </w:rPr>
-      </w:pPr>
       <w:r>
-        <w:rPr>
-          <w:lang w:val="ru-RU"/>
-        </w:rPr>
-        <w:t>Менеджер: Менеджер 1</w:t>
+        <w:t xml:space="preserve">Менеджер: Менеджер 1</w:t>
       </w:r>
     </w:p>
     <w:p>
       <w:pPr>
         <w:jc w:val="both"/>
-        <w:rPr>
-          <w:rFonts w:ascii="Cambria" w:eastAsia="MS Mincho" w:hAnsi="Cambria" w:cs="Times New Roman"/>
-          <w:lang w:val="ru-RU"/>
-        </w:rPr>
       </w:pPr>
-      <w:bookmarkStart w:id="0" w:name="_GoBack"/>
+      <w:proofErr w:type="spellStart"/>
+      <w:proofErr w:type="spellEnd"/>
+      <w:proofErr w:type="gramStart"/>
+      <w:proofErr w:type="gramEnd"/>
+      <w:proofErr w:type="gramStart"/>
+      <w:proofErr w:type="gramEnd"/>
       <w:r>
-        <w:rPr>
-          <w:rFonts w:ascii="Cambria" w:eastAsia="MS Mincho" w:hAnsi="Cambria" w:cs="Times New Roman"/>
-          <w:lang w:val="ru-RU"/>
-        </w:rPr>
-        <w:t>Сумма:</w:t>
+        <w:t xml:space="preserve">Сумма: </w:t>
       </w:r>
       <w:r>
-        <w:rPr>
-          <w:rFonts w:ascii="Cambria" w:eastAsia="MS Mincho" w:hAnsi="Cambria" w:cs="Times New Roman"/>
-          <w:lang w:val="ru-RU"/>
-        </w:rPr>
-        <w:t> </w:t>
+        <w:t xml:space="preserve">10000</w:t>
       </w:r>
       <w:r>
-        <w:rPr>
-          <w:rFonts w:ascii="Cambria" w:eastAsia="MS Mincho" w:hAnsi="Cambria" w:cs="Times New Roman"/>
-          <w:lang w:val="ru-RU"/>
-        </w:rPr>
-        <w:t>10000</w:t>
+        <w:t xml:space="preserve"> руб. </w:t>
       </w:r>
       <w:r>
-        <w:rPr>
-          <w:rFonts w:ascii="Cambria" w:eastAsia="MS Mincho" w:hAnsi="Cambria" w:cs="Times New Roman"/>
-          <w:lang w:val="ru-RU"/>
-        </w:rPr>
+        <w:t xml:space="preserve">Новый</w:t>
+      </w:r>
+      <w:r>
         <w:t xml:space="preserve"> </w:t>
       </w:r>
-      <w:r>
-        <w:rPr>
-          <w:rFonts w:ascii="Cambria" w:eastAsia="MS Mincho" w:hAnsi="Cambria" w:cs="Times New Roman"/>
-          <w:lang w:val="ru-RU"/>
-        </w:rPr>
-        <w:t>руб.</w:t>
-      </w:r>
-      <w:r>
-        <w:rPr>
-          <w:rFonts w:ascii="Cambria" w:eastAsia="MS Mincho" w:hAnsi="Cambria" w:cs="Times New Roman"/>
-          <w:lang w:val="ru-RU"/>
-        </w:rPr>
-        <w:t xml:space="preserve"> </w:t>
-      </w:r>
-      <w:r>
-        <w:rPr>
-          <w:rFonts w:ascii="Cambria" w:eastAsia="MS Mincho" w:hAnsi="Cambria" w:cs="Times New Roman"/>
-          <w:lang w:val="ru-RU"/>
-        </w:rPr>
-        <w:t>Новый</w:t>
-      </w:r>
-      <w:r>
-        <w:rPr>
-          <w:rFonts w:ascii="Cambria" w:eastAsia="MS Mincho" w:hAnsi="Cambria" w:cs="Times New Roman"/>
-          <w:lang w:val="ru-RU"/>
-        </w:rPr>
-        <w:br/>
-      </w:r>
-      <w:r>
-        <w:rPr>
-          <w:rFonts w:ascii="Cambria" w:eastAsia="MS Mincho" w:hAnsi="Cambria" w:cs="Times New Roman"/>
-          <w:lang w:val="ru-RU"/>
-        </w:rPr>
-        <w:t xml:space="preserve"> </w:t>
-      </w:r>
-      <w:bookmarkEnd w:id="0"/>
     </w:p>
     <w:sectPr>
       <w:pgSz w:w="12240" w:h="15840"/>
@@ -24371,7 +24288,7 @@
 </file>
 
 <file path=customXml/itemProps1.xml><?xml version="1.0" encoding="utf-8"?>
-<ds:datastoreItem xmlns:ds="http://schemas.openxmlformats.org/officeDocument/2006/customXml" ds:itemID="{73F240BC-0F2F-4D3D-B83A-D82CEB7AA727}">
+<ds:datastoreItem xmlns:ds="http://schemas.openxmlformats.org/officeDocument/2006/customXml" ds:itemID="{E9A49CE6-8DFB-4403-AD05-443F2FF1EB60}">
   <ds:schemaRefs>
     <ds:schemaRef ds:uri="http://schemas.openxmlformats.org/officeDocument/2006/bibliography"/>
   </ds:schemaRefs>

</xml_diff>

<commit_message>
Preserve line breaks and non-text run content during placeholder replacement
- Modify clone_run_with_text to copy all non-text child elements (w:br, w:drawing, etc.)
- Preserve runs with non-text content but no text during merge
- Move preserved runs to end of paragraph after new content
- Regenerate expected_0001.docx and expected_0002.docx with correct line break at end
</commit_message>
<xml_diff>
--- a/tests/documents/all_basic_fields/expected_0001.docx
+++ b/tests/documents/all_basic_fields/expected_0001.docx
@@ -56,6 +56,12 @@
       </w:r>
       <w:r>
         <w:t xml:space="preserve"> </w:t>
+      </w:r>
+      <w:r>
+        <w:rPr>
+          <w:lang w:val="ru-RU"/>
+        </w:rPr>
+        <w:br/>
       </w:r>
     </w:p>
     <w:sectPr>

</xml_diff>